<commit_message>
docs: PRD v3.0 decisions + CLAUDE-PRODUCTION template
- PRD Section 21: added DECISION-05 (WhatsApp patient-only, in-app push for staff)
- PRD Section 21: removed GAP-07 (orphan captions fixed)
- PRD Section 21: SMS/email escalation deferred to Phase 1.5
- SLA definitions updated to use in-app push only
- Saturday review scope reduced to GAP-01 + GAP-04
- New: docs/CLAUDE-PRODUCTION.md — template for new production repo
  with locked decisions, open gaps, architecture, AI handling rules

Co-Authored-By: Claude Opus 4.6 (1M context) <noreply@anthropic.com>
</commit_message>
<xml_diff>
--- a/docs/Medrelief_ERP_PRD_v3.0-Phase-1.docx
+++ b/docs/Medrelief_ERP_PRD_v3.0-Phase-1.docx
@@ -741,35 +741,7 @@
           <w:sz w:val="24"/>
           <w:szCs w:val="24"/>
         </w:rPr>
-        <w:t xml:space="preserve"> Use two sources only: (1) environment variables for deployment/static secrets (DB/Redis credentials, JWT secret, storage and provider keys), and (2) DB config tables for runtime business configuration (discount limits, rounding rules, allowed payment modes per branch, report retention, duplicate merge rules). Resolution order: branch config </w:t>
-      </w:r>
-      <w:r>
-        <w:rPr>
-          <w:sz w:val="24"/>
-          <w:szCs w:val="24"/>
-        </w:rPr>
-        <w:t>→</w:t>
-      </w:r>
-      <w:r>
-        <w:rPr>
-          <w:sz w:val="24"/>
-          <w:szCs w:val="24"/>
-        </w:rPr>
-        <w:t xml:space="preserve"> tenant config </w:t>
-      </w:r>
-      <w:r>
-        <w:rPr>
-          <w:sz w:val="24"/>
-          <w:szCs w:val="24"/>
-        </w:rPr>
-        <w:t>→</w:t>
-      </w:r>
-      <w:r>
-        <w:rPr>
-          <w:sz w:val="24"/>
-          <w:szCs w:val="24"/>
-        </w:rPr>
-        <w:t xml:space="preserve"> code default. Cache resolved config briefly (e.g., 5 minutes) and invalidate on update.</w:t>
+        <w:t xml:space="preserve"> Use two sources only: (1) environment variables for deployment/static secrets (DB/Redis credentials, JWT secret, storage and provider keys), and (2) DB config tables for runtime business configuration (discount limits, rounding rules, allowed payment modes per branch, report retention, duplicate merge rules). Resolution order: branch config → tenant config → code default. Cache resolved config briefly (e.g., 5 minutes) and invalidate on update.</w:t>
       </w:r>
     </w:p>
     <w:p>
@@ -1606,12 +1578,6 @@
           <w:szCs w:val="24"/>
         </w:rPr>
         <w:t xml:space="preserve"> File names use kebab-case; classes use PascalCase; variables/functions use camelCase; DB tables use snake_case with module prefix; columns use snake_case; API routes use kebab-case; </w:t>
-      </w:r>
-      <w:r>
-        <w:rPr>
-          <w:sz w:val="24"/>
-          <w:szCs w:val="24"/>
-        </w:rPr>
         <w:lastRenderedPageBreak/>
         <w:t>enums use PascalCase type with UPPER values; constants use UPPER_SNAKE_CASE.</w:t>
       </w:r>
@@ -3160,19 +3126,7 @@
         <w:rPr>
           <w:b/>
         </w:rPr>
-        <w:t>13</w:t>
-      </w:r>
-      <w:r>
-        <w:rPr>
-          <w:b/>
-        </w:rPr>
-        <w:t>–</w:t>
-      </w:r>
-      <w:r>
-        <w:rPr>
-          <w:b/>
-        </w:rPr>
-        <w:t>15 inch touch-enabled devices and tablets</w:t>
+        <w:t>13–15 inch touch-enabled devices and tablets</w:t>
       </w:r>
       <w:r>
         <w:t>.</w:t>
@@ -3248,19 +3202,7 @@
         <w:rPr>
           <w:b/>
         </w:rPr>
-        <w:t>Create and confirm a simple bill (existing patient, 1</w:t>
-      </w:r>
-      <w:r>
-        <w:rPr>
-          <w:b/>
-        </w:rPr>
-        <w:t>–</w:t>
-      </w:r>
-      <w:r>
-        <w:rPr>
-          <w:b/>
-        </w:rPr>
-        <w:t>3 tests, cash)</w:t>
+        <w:t>Create and confirm a simple bill (existing patient, 1–3 tests, cash)</w:t>
       </w:r>
       <w:r>
         <w:t>:</w:t>
@@ -6185,11 +6127,6 @@
                 <w:rFonts w:cs="Times New Roman"/>
               </w:rPr>
               <w:t xml:space="preserve"> </w:t>
-            </w:r>
-            <w:r>
-              <w:rPr>
-                <w:rFonts w:cs="Times New Roman"/>
-              </w:rPr>
               <w:lastRenderedPageBreak/>
               <w:t xml:space="preserve">(nullable), </w:t>
             </w:r>
@@ -9594,44 +9531,14 @@
           <w:rFonts w:ascii="menlo" w:eastAsia="menlo" w:hAnsi="menlo" w:cs="menlo"/>
         </w:rPr>
         <w:t>DRAFT → PENDING_PAYMENT → PAID</w:t>
-      </w:r>
-      <w:r>
-        <w:rPr>
-          <w:rStyle w:val="VerbatimChar"/>
-          <w:rFonts w:ascii="menlo" w:eastAsia="menlo" w:hAnsi="menlo" w:cs="menlo"/>
-        </w:rPr>
         <w:br/>
         <w:t xml:space="preserve">                        → PARTIALLY_PAID → PAID</w:t>
-      </w:r>
-      <w:r>
-        <w:rPr>
-          <w:rStyle w:val="VerbatimChar"/>
-          <w:rFonts w:ascii="menlo" w:eastAsia="menlo" w:hAnsi="menlo" w:cs="menlo"/>
-        </w:rPr>
         <w:br/>
         <w:t xml:space="preserve">          ↓                ↓</w:t>
-      </w:r>
-      <w:r>
-        <w:rPr>
-          <w:rStyle w:val="VerbatimChar"/>
-          <w:rFonts w:ascii="menlo" w:eastAsia="menlo" w:hAnsi="menlo" w:cs="menlo"/>
-        </w:rPr>
         <w:br/>
         <w:t xml:space="preserve">       CANCELLED        CANCELLED (with audit)</w:t>
-      </w:r>
-      <w:r>
-        <w:rPr>
-          <w:rStyle w:val="VerbatimChar"/>
-          <w:rFonts w:ascii="menlo" w:eastAsia="menlo" w:hAnsi="menlo" w:cs="menlo"/>
-        </w:rPr>
         <w:br/>
         <w:t xml:space="preserve">                        → REFUNDED (via Credit Note)</w:t>
-      </w:r>
-      <w:r>
-        <w:rPr>
-          <w:rStyle w:val="VerbatimChar"/>
-          <w:rFonts w:ascii="menlo" w:eastAsia="menlo" w:hAnsi="menlo" w:cs="menlo"/>
-        </w:rPr>
         <w:br/>
       </w:r>
     </w:p>
@@ -9891,50 +9798,14 @@
           <w:rFonts w:ascii="menlo" w:eastAsia="menlo" w:hAnsi="menlo" w:cs="menlo"/>
         </w:rPr>
         <w:t>Sample: PENDING_COLLECTION → COLLECTED → RECEIVED_AT_LAB → IN_PROCESS → COMPLETED</w:t>
-      </w:r>
-      <w:r>
-        <w:rPr>
-          <w:rStyle w:val="VerbatimChar"/>
-          <w:rFonts w:ascii="menlo" w:eastAsia="menlo" w:hAnsi="menlo" w:cs="menlo"/>
-        </w:rPr>
         <w:br/>
         <w:t xml:space="preserve">                                                                        → REJECTED</w:t>
-      </w:r>
-      <w:r>
-        <w:rPr>
-          <w:rStyle w:val="VerbatimChar"/>
-          <w:rFonts w:ascii="menlo" w:eastAsia="menlo" w:hAnsi="menlo" w:cs="menlo"/>
-        </w:rPr>
         <w:br/>
-      </w:r>
-      <w:r>
-        <w:rPr>
-          <w:rStyle w:val="VerbatimChar"/>
-          <w:rFonts w:ascii="menlo" w:eastAsia="menlo" w:hAnsi="menlo" w:cs="menlo"/>
-        </w:rPr>
         <w:br/>
         <w:t>Test Order: ORDERED → IN_PROCESS → COMPLETED → APPROVED</w:t>
-      </w:r>
-      <w:r>
-        <w:rPr>
-          <w:rStyle w:val="VerbatimChar"/>
-          <w:rFonts w:ascii="menlo" w:eastAsia="menlo" w:hAnsi="menlo" w:cs="menlo"/>
-        </w:rPr>
         <w:br/>
-      </w:r>
-      <w:r>
-        <w:rPr>
-          <w:rStyle w:val="VerbatimChar"/>
-          <w:rFonts w:ascii="menlo" w:eastAsia="menlo" w:hAnsi="menlo" w:cs="menlo"/>
-        </w:rPr>
         <w:br/>
         <w:t>Report: GENERATED → SIGNED_OFF → AMENDED (new version, old kept)</w:t>
-      </w:r>
-      <w:r>
-        <w:rPr>
-          <w:rStyle w:val="VerbatimChar"/>
-          <w:rFonts w:ascii="menlo" w:eastAsia="menlo" w:hAnsi="menlo" w:cs="menlo"/>
-        </w:rPr>
         <w:br/>
       </w:r>
     </w:p>
@@ -10829,13 +10700,7 @@
         <w:t>Rate plan resolution (deterministic):</w:t>
       </w:r>
       <w:r>
-        <w:t xml:space="preserve"> Use strict priority: (1) explicit bill-level override plan (Finance Manager/System Admin only), (2) referrer-linked active plan, (3) organization/corporate active plan, (4) payer-type mapped plan, (5) branch default plan, (6) tenant default MRP plan. Plan must be ACTIVE and effective for billDateTime (effective_from </w:t>
-      </w:r>
-      <w:r>
-        <w:t>≤</w:t>
-      </w:r>
-      <w:r>
-        <w:t xml:space="preserve"> billDateTime &lt; effective_to; effective_to may be null). If multiple plans match at the same priority: choose highest explicit priority, then latest effective_from, then lowest internal id (tie-breaker). If a test is missing in the resolved plan, fall back down the chain for that test only; if still missing, fall back to tenant MRP for that test. If any tests remain unresolved: reject bill creation with a clear error listing unresolved tests (no silent pricing fallback).</w:t>
+        <w:t xml:space="preserve"> Use strict priority: (1) explicit bill-level override plan (Finance Manager/System Admin only), (2) referrer-linked active plan, (3) organization/corporate active plan, (4) payer-type mapped plan, (5) branch default plan, (6) tenant default MRP plan. Plan must be ACTIVE and effective for billDateTime (effective_from ≤ billDateTime &lt; effective_to; effective_to may be null). If multiple plans match at the same priority: choose highest explicit priority, then latest effective_from, then lowest internal id (tie-breaker). If a test is missing in the resolved plan, fall back down the chain for that test only; if still missing, fall back to tenant MRP for that test. If any tests remain unresolved: reject bill creation with a clear error listing unresolved tests (no silent pricing fallback).</w:t>
       </w:r>
     </w:p>
     <w:p>
@@ -11000,8 +10865,6 @@
       </w:r>
       <w:r>
         <w:t>.</w:t>
-      </w:r>
-      <w:r>
         <w:br/>
       </w:r>
       <w:r>
@@ -12335,8 +12198,6 @@
       </w:r>
       <w:r>
         <w:t xml:space="preserve"> &lt; 2 minutes for a simple walk-in case.</w:t>
-      </w:r>
-      <w:r>
         <w:br/>
       </w:r>
       <w:r>
@@ -13679,35 +13540,7 @@
           <w:sz w:val="24"/>
           <w:szCs w:val="24"/>
         </w:rPr>
-        <w:t xml:space="preserve">Partial payments: allow multiple payment rows per bill; bill payment_status transitions UNPAID </w:t>
-      </w:r>
-      <w:r>
-        <w:rPr>
-          <w:sz w:val="24"/>
-          <w:szCs w:val="24"/>
-        </w:rPr>
-        <w:t>→</w:t>
-      </w:r>
-      <w:r>
-        <w:rPr>
-          <w:sz w:val="24"/>
-          <w:szCs w:val="24"/>
-        </w:rPr>
-        <w:t xml:space="preserve"> PARTIALLY_PAID </w:t>
-      </w:r>
-      <w:r>
-        <w:rPr>
-          <w:sz w:val="24"/>
-          <w:szCs w:val="24"/>
-        </w:rPr>
-        <w:t>→</w:t>
-      </w:r>
-      <w:r>
-        <w:rPr>
-          <w:sz w:val="24"/>
-          <w:szCs w:val="24"/>
-        </w:rPr>
-        <w:t xml:space="preserve"> PAID; emit BillConfirmed only on transition to fully paid unless an approved credit rule allows accession earlier.</w:t>
+        <w:t>Partial payments: allow multiple payment rows per bill; bill payment_status transitions UNPAID → PARTIALLY_PAID → PAID; emit BillConfirmed only on transition to fully paid unless an approved credit rule allows accession earlier.</w:t>
       </w:r>
     </w:p>
     <w:p>
@@ -14773,21 +14606,7 @@
           <w:sz w:val="24"/>
           <w:szCs w:val="24"/>
         </w:rPr>
-        <w:t xml:space="preserve">Sample rejection </w:t>
-      </w:r>
-      <w:r>
-        <w:rPr>
-          <w:sz w:val="24"/>
-          <w:szCs w:val="24"/>
-        </w:rPr>
-        <w:t>→</w:t>
-      </w:r>
-      <w:r>
-        <w:rPr>
-          <w:sz w:val="24"/>
-          <w:szCs w:val="24"/>
-        </w:rPr>
-        <w:t xml:space="preserve"> recollection: rejection reason mandatory (e.g., HEMOLYZED, INSUFFICIENT_QTY, LEAKED, MISLABELED). On rejection, create a recollection task and mark impacted tests RECOLLECTION_REQUIRED; MVP default is same accession with a new sample sequence.</w:t>
+        <w:t>Sample rejection → recollection: rejection reason mandatory (e.g., HEMOLYZED, INSUFFICIENT_QTY, LEAKED, MISLABELED). On rejection, create a recollection task and mark impacted tests RECOLLECTION_REQUIRED; MVP default is same accession with a new sample sequence.</w:t>
       </w:r>
     </w:p>
     <w:p>
@@ -15516,13 +15335,7 @@
         <w:t>Report storage:</w:t>
       </w:r>
       <w:r>
-        <w:t xml:space="preserve"> Store generated PDFs in local disk for dev and S3-compatible object storage for staging/prod (never as DB blobs). Use private storage; access via signed URL or backend proxy after auth + RBAC + tenant/branch checks. Suggested naming: tenants/{tenantId}/branches/{branchId}/reports/{yyyy}/{mm}/{accessionNumber}/{reportVersion}.pdf. Signed links expire (configurable, e.g., 24</w:t>
-      </w:r>
-      <w:r>
-        <w:t>–</w:t>
-      </w:r>
-      <w:r>
-        <w:t>72 hours). Retain physical report files per tenant policy (MVP default: 2 years). Amended reports keep prior versions; never overwrite old files.</w:t>
+        <w:t xml:space="preserve"> Store generated PDFs in local disk for dev and S3-compatible object storage for staging/prod (never as DB blobs). Use private storage; access via signed URL or backend proxy after auth + RBAC + tenant/branch checks. Suggested naming: tenants/{tenantId}/branches/{branchId}/reports/{yyyy}/{mm}/{accessionNumber}/{reportVersion}.pdf. Signed links expire (configurable, e.g., 24–72 hours). Retain physical report files per tenant policy (MVP default: 2 years). Amended reports keep prior versions; never overwrite old files.</w:t>
       </w:r>
     </w:p>
     <w:p>
@@ -17760,43 +17573,7 @@
         <w:rPr>
           <w:b/>
         </w:rPr>
-        <w:t xml:space="preserve">DB Schema </w:t>
-      </w:r>
-      <w:r>
-        <w:rPr>
-          <w:b/>
-        </w:rPr>
-        <w:t>→</w:t>
-      </w:r>
-      <w:r>
-        <w:rPr>
-          <w:b/>
-        </w:rPr>
-        <w:t xml:space="preserve"> Billing Engine </w:t>
-      </w:r>
-      <w:r>
-        <w:rPr>
-          <w:b/>
-        </w:rPr>
-        <w:t>→</w:t>
-      </w:r>
-      <w:r>
-        <w:rPr>
-          <w:b/>
-        </w:rPr>
-        <w:t xml:space="preserve"> LIMS </w:t>
-      </w:r>
-      <w:r>
-        <w:rPr>
-          <w:b/>
-        </w:rPr>
-        <w:t>→</w:t>
-      </w:r>
-      <w:r>
-        <w:rPr>
-          <w:b/>
-        </w:rPr>
-        <w:t xml:space="preserve"> Report Dispatch</w:t>
+        <w:t>DB Schema → Billing Engine → LIMS → Report Dispatch</w:t>
       </w:r>
       <w:r>
         <w:t xml:space="preserve"> is the primary critical path.</w:t>
@@ -17905,243 +17682,93 @@
           <w:rFonts w:ascii="menlo" w:eastAsia="menlo" w:hAnsi="menlo" w:cs="menlo"/>
         </w:rPr>
         <w:t>{</w:t>
-      </w:r>
+        <w:br/>
+        <w:t xml:space="preserve">  "full_name": "Rahul Kumar",</w:t>
+        <w:br/>
+        <w:t xml:space="preserve">  "gender": "MALE",</w:t>
+        <w:br/>
+        <w:t xml:space="preserve">  "dob": "1990-05-15",</w:t>
+        <w:br/>
+        <w:t xml:space="preserve">  "age_years": 34,</w:t>
+        <w:br/>
+        <w:t xml:space="preserve">  "mobile": "9876543210",</w:t>
+        <w:br/>
+        <w:t xml:space="preserve">  "email": "rahul@example.com",</w:t>
+        <w:br/>
+        <w:t xml:space="preserve">  "address": "Madhubani, Bihar",</w:t>
+        <w:br/>
+        <w:t xml:space="preserve">  "allow_merge_with_existing": true</w:t>
+        <w:br/>
+        <w:lastRenderedPageBreak/>
+        <w:t>}</w:t>
+        <w:br/>
+      </w:r>
+    </w:p>
+    <w:p>
+      <w:pPr>
+        <w:spacing w:after="210"/>
+      </w:pPr>
+      <w:r>
+        <w:rPr>
+          <w:b/>
+        </w:rPr>
+        <w:t>Response (201 Created):</w:t>
+      </w:r>
+    </w:p>
+    <w:p>
+      <w:pPr>
+        <w:shd w:val="clear" w:color="auto" w:fill="F8F8FA"/>
+      </w:pPr>
       <w:r>
         <w:rPr>
           <w:rStyle w:val="VerbatimChar"/>
           <w:rFonts w:ascii="menlo" w:eastAsia="menlo" w:hAnsi="menlo" w:cs="menlo"/>
         </w:rPr>
+        <w:t>{</w:t>
+        <w:br/>
+        <w:t xml:space="preserve">  "id": "pat_12345",</w:t>
+        <w:br/>
+        <w:t xml:space="preserve">  "patient_code": "MR-PAT-00001",</w:t>
         <w:br/>
         <w:t xml:space="preserve">  "full_name": "Rahul Kumar",</w:t>
-      </w:r>
+        <w:br/>
+        <w:t xml:space="preserve">  "mobile": "9876543210",</w:t>
+        <w:br/>
+        <w:t xml:space="preserve">  "status": "ACTIVE"</w:t>
+        <w:br/>
+        <w:t>}</w:t>
+        <w:br/>
+      </w:r>
+    </w:p>
+    <w:p>
+      <w:pPr>
+        <w:spacing w:after="210"/>
+      </w:pPr>
+      <w:r>
+        <w:rPr>
+          <w:b/>
+        </w:rPr>
+        <w:t>Error (409 Conflict – duplicate mobile):</w:t>
+      </w:r>
+    </w:p>
+    <w:p>
+      <w:pPr>
+        <w:shd w:val="clear" w:color="auto" w:fill="F8F8FA"/>
+      </w:pPr>
       <w:r>
         <w:rPr>
           <w:rStyle w:val="VerbatimChar"/>
           <w:rFonts w:ascii="menlo" w:eastAsia="menlo" w:hAnsi="menlo" w:cs="menlo"/>
         </w:rPr>
+        <w:t>{</w:t>
         <w:br/>
-        <w:t xml:space="preserve">  "gender": "MALE",</w:t>
-      </w:r>
-      <w:r>
-        <w:rPr>
-          <w:rStyle w:val="VerbatimChar"/>
-          <w:rFonts w:ascii="menlo" w:eastAsia="menlo" w:hAnsi="menlo" w:cs="menlo"/>
-        </w:rPr>
+        <w:t xml:space="preserve">  "error_code": "PATIENT_DUPLICATE_MOBILE",</w:t>
         <w:br/>
-        <w:t xml:space="preserve">  "dob": "1990-05-15",</w:t>
-      </w:r>
-      <w:r>
-        <w:rPr>
-          <w:rStyle w:val="VerbatimChar"/>
-          <w:rFonts w:ascii="menlo" w:eastAsia="menlo" w:hAnsi="menlo" w:cs="menlo"/>
-        </w:rPr>
+        <w:t xml:space="preserve">  "message": "A patient with this mobile already exists.",</w:t>
         <w:br/>
-        <w:t xml:space="preserve">  "age_years": 34,</w:t>
-      </w:r>
-      <w:r>
-        <w:rPr>
-          <w:rStyle w:val="VerbatimChar"/>
-          <w:rFonts w:ascii="menlo" w:eastAsia="menlo" w:hAnsi="menlo" w:cs="menlo"/>
-        </w:rPr>
-        <w:br/>
-        <w:t xml:space="preserve">  "mobile": "9876543210",</w:t>
-      </w:r>
-      <w:r>
-        <w:rPr>
-          <w:rStyle w:val="VerbatimChar"/>
-          <w:rFonts w:ascii="menlo" w:eastAsia="menlo" w:hAnsi="menlo" w:cs="menlo"/>
-        </w:rPr>
-        <w:br/>
-        <w:t xml:space="preserve">  "email": "rahul@example.com",</w:t>
-      </w:r>
-      <w:r>
-        <w:rPr>
-          <w:rStyle w:val="VerbatimChar"/>
-          <w:rFonts w:ascii="menlo" w:eastAsia="menlo" w:hAnsi="menlo" w:cs="menlo"/>
-        </w:rPr>
-        <w:br/>
-        <w:t xml:space="preserve">  "address": "Madhubani, Bihar",</w:t>
-      </w:r>
-      <w:r>
-        <w:rPr>
-          <w:rStyle w:val="VerbatimChar"/>
-          <w:rFonts w:ascii="menlo" w:eastAsia="menlo" w:hAnsi="menlo" w:cs="menlo"/>
-        </w:rPr>
-        <w:br/>
-        <w:t xml:space="preserve">  "allow_merge_with_existing": true</w:t>
-      </w:r>
-      <w:r>
-        <w:rPr>
-          <w:rStyle w:val="VerbatimChar"/>
-          <w:rFonts w:ascii="menlo" w:eastAsia="menlo" w:hAnsi="menlo" w:cs="menlo"/>
-        </w:rPr>
-        <w:br/>
-      </w:r>
-      <w:r>
-        <w:rPr>
-          <w:rStyle w:val="VerbatimChar"/>
-          <w:rFonts w:ascii="menlo" w:eastAsia="menlo" w:hAnsi="menlo" w:cs="menlo"/>
-        </w:rPr>
-        <w:lastRenderedPageBreak/>
-        <w:t>}</w:t>
-      </w:r>
-      <w:r>
-        <w:rPr>
-          <w:rStyle w:val="VerbatimChar"/>
-          <w:rFonts w:ascii="menlo" w:eastAsia="menlo" w:hAnsi="menlo" w:cs="menlo"/>
-        </w:rPr>
-        <w:br/>
-      </w:r>
-    </w:p>
-    <w:p>
-      <w:pPr>
-        <w:spacing w:after="210"/>
-      </w:pPr>
-      <w:r>
-        <w:rPr>
-          <w:b/>
-        </w:rPr>
-        <w:t>Response (201 Created):</w:t>
-      </w:r>
-    </w:p>
-    <w:p>
-      <w:pPr>
-        <w:shd w:val="clear" w:color="auto" w:fill="F8F8FA"/>
-      </w:pPr>
-      <w:r>
-        <w:rPr>
-          <w:rStyle w:val="VerbatimChar"/>
-          <w:rFonts w:ascii="menlo" w:eastAsia="menlo" w:hAnsi="menlo" w:cs="menlo"/>
-        </w:rPr>
-        <w:t>{</w:t>
-      </w:r>
-      <w:r>
-        <w:rPr>
-          <w:rStyle w:val="VerbatimChar"/>
-          <w:rFonts w:ascii="menlo" w:eastAsia="menlo" w:hAnsi="menlo" w:cs="menlo"/>
-        </w:rPr>
-        <w:br/>
-        <w:t xml:space="preserve">  "id": "pat_12345",</w:t>
-      </w:r>
-      <w:r>
-        <w:rPr>
-          <w:rStyle w:val="VerbatimChar"/>
-          <w:rFonts w:ascii="menlo" w:eastAsia="menlo" w:hAnsi="menlo" w:cs="menlo"/>
-        </w:rPr>
-        <w:br/>
-        <w:t xml:space="preserve">  "patient_code": "MR-PAT-00001",</w:t>
-      </w:r>
-      <w:r>
-        <w:rPr>
-          <w:rStyle w:val="VerbatimChar"/>
-          <w:rFonts w:ascii="menlo" w:eastAsia="menlo" w:hAnsi="menlo" w:cs="menlo"/>
-        </w:rPr>
-        <w:br/>
-        <w:t xml:space="preserve">  "full_name": "Rahul Kumar",</w:t>
-      </w:r>
-      <w:r>
-        <w:rPr>
-          <w:rStyle w:val="VerbatimChar"/>
-          <w:rFonts w:ascii="menlo" w:eastAsia="menlo" w:hAnsi="menlo" w:cs="menlo"/>
-        </w:rPr>
-        <w:br/>
-        <w:t xml:space="preserve">  "mobile": "9876543210",</w:t>
-      </w:r>
-      <w:r>
-        <w:rPr>
-          <w:rStyle w:val="VerbatimChar"/>
-          <w:rFonts w:ascii="menlo" w:eastAsia="menlo" w:hAnsi="menlo" w:cs="menlo"/>
-        </w:rPr>
-        <w:br/>
-        <w:t xml:space="preserve">  "status": "ACTIVE"</w:t>
-      </w:r>
-      <w:r>
-        <w:rPr>
-          <w:rStyle w:val="VerbatimChar"/>
-          <w:rFonts w:ascii="menlo" w:eastAsia="menlo" w:hAnsi="menlo" w:cs="menlo"/>
-        </w:rPr>
+        <w:t xml:space="preserve">  "existing_patient_id": "pat_67890"</w:t>
         <w:br/>
         <w:t>}</w:t>
-      </w:r>
-      <w:r>
-        <w:rPr>
-          <w:rStyle w:val="VerbatimChar"/>
-          <w:rFonts w:ascii="menlo" w:eastAsia="menlo" w:hAnsi="menlo" w:cs="menlo"/>
-        </w:rPr>
-        <w:br/>
-      </w:r>
-    </w:p>
-    <w:p>
-      <w:pPr>
-        <w:spacing w:after="210"/>
-      </w:pPr>
-      <w:r>
-        <w:rPr>
-          <w:b/>
-        </w:rPr>
-        <w:t xml:space="preserve">Error (409 Conflict </w:t>
-      </w:r>
-      <w:r>
-        <w:rPr>
-          <w:b/>
-        </w:rPr>
-        <w:t>–</w:t>
-      </w:r>
-      <w:r>
-        <w:rPr>
-          <w:b/>
-        </w:rPr>
-        <w:t xml:space="preserve"> duplicate mobile):</w:t>
-      </w:r>
-    </w:p>
-    <w:p>
-      <w:pPr>
-        <w:shd w:val="clear" w:color="auto" w:fill="F8F8FA"/>
-      </w:pPr>
-      <w:r>
-        <w:rPr>
-          <w:rStyle w:val="VerbatimChar"/>
-          <w:rFonts w:ascii="menlo" w:eastAsia="menlo" w:hAnsi="menlo" w:cs="menlo"/>
-        </w:rPr>
-        <w:t>{</w:t>
-      </w:r>
-      <w:r>
-        <w:rPr>
-          <w:rStyle w:val="VerbatimChar"/>
-          <w:rFonts w:ascii="menlo" w:eastAsia="menlo" w:hAnsi="menlo" w:cs="menlo"/>
-        </w:rPr>
-        <w:br/>
-        <w:t xml:space="preserve">  "error_code": "PATIENT_DUPLICATE_MOBILE",</w:t>
-      </w:r>
-      <w:r>
-        <w:rPr>
-          <w:rStyle w:val="VerbatimChar"/>
-          <w:rFonts w:ascii="menlo" w:eastAsia="menlo" w:hAnsi="menlo" w:cs="menlo"/>
-        </w:rPr>
-        <w:br/>
-        <w:t xml:space="preserve">  "message": "A patient with this mobile already exists.",</w:t>
-      </w:r>
-      <w:r>
-        <w:rPr>
-          <w:rStyle w:val="VerbatimChar"/>
-          <w:rFonts w:ascii="menlo" w:eastAsia="menlo" w:hAnsi="menlo" w:cs="menlo"/>
-        </w:rPr>
-        <w:br/>
-        <w:t xml:space="preserve">  "existing_patient_id": "pat_67890"</w:t>
-      </w:r>
-      <w:r>
-        <w:rPr>
-          <w:rStyle w:val="VerbatimChar"/>
-          <w:rFonts w:ascii="menlo" w:eastAsia="menlo" w:hAnsi="menlo" w:cs="menlo"/>
-        </w:rPr>
-        <w:br/>
-        <w:t>}</w:t>
-      </w:r>
-      <w:r>
-        <w:rPr>
-          <w:rStyle w:val="VerbatimChar"/>
-          <w:rFonts w:ascii="menlo" w:eastAsia="menlo" w:hAnsi="menlo" w:cs="menlo"/>
-        </w:rPr>
         <w:br/>
       </w:r>
     </w:p>
@@ -18202,273 +17829,87 @@
           <w:rFonts w:ascii="menlo" w:eastAsia="menlo" w:hAnsi="menlo" w:cs="menlo"/>
         </w:rPr>
         <w:t>{</w:t>
-      </w:r>
+        <w:br/>
+        <w:t xml:space="preserve">  "branch_id": "br_mdh_01",</w:t>
+        <w:br/>
+        <w:t xml:space="preserve">  "patient_id": "pat_12345",</w:t>
+        <w:br/>
+        <w:t xml:space="preserve">  "visit_type": "WALK_IN",</w:t>
+        <w:br/>
+        <w:t xml:space="preserve">  "payer_type": "SELF",</w:t>
+        <w:br/>
+        <w:t xml:space="preserve">  "referrer_id": "doc_001",</w:t>
+        <w:br/>
+        <w:t xml:space="preserve">  "tests": [</w:t>
+        <w:br/>
+        <w:t xml:space="preserve">    { "test_id": "test_cbc", "quantity": 1 },</w:t>
+        <w:br/>
+        <w:t xml:space="preserve">    { "test_id": "test_fbs", "quantity": 1 }</w:t>
+        <w:br/>
+        <w:t xml:space="preserve">  ],</w:t>
+        <w:br/>
+        <w:t xml:space="preserve">  "manual_discount_percent": 5,</w:t>
+        <w:br/>
+        <w:t xml:space="preserve">  "discount_reason_code": "SENIOR_CITIZEN",</w:t>
+        <w:br/>
+        <w:t xml:space="preserve">  "payment": {</w:t>
+        <w:br/>
+        <w:t xml:space="preserve">    "mode": "UPI",</w:t>
+        <w:br/>
+        <w:t xml:space="preserve">    "amount": 750.00,</w:t>
+        <w:br/>
+        <w:t xml:space="preserve">    "initiated_by": "user_001"</w:t>
+        <w:br/>
+        <w:t xml:space="preserve">  }</w:t>
+        <w:br/>
+        <w:t>}</w:t>
+        <w:br/>
+      </w:r>
+    </w:p>
+    <w:p>
+      <w:pPr>
+        <w:spacing w:after="210"/>
+      </w:pPr>
+      <w:r>
+        <w:rPr>
+          <w:b/>
+        </w:rPr>
+        <w:t>Response (201 Created):</w:t>
+      </w:r>
+    </w:p>
+    <w:p>
+      <w:pPr>
+        <w:shd w:val="clear" w:color="auto" w:fill="F8F8FA"/>
+      </w:pPr>
       <w:r>
         <w:rPr>
           <w:rStyle w:val="VerbatimChar"/>
           <w:rFonts w:ascii="menlo" w:eastAsia="menlo" w:hAnsi="menlo" w:cs="menlo"/>
         </w:rPr>
+        <w:t>{</w:t>
         <w:br/>
-        <w:t xml:space="preserve">  "branch_id": "br_mdh_01",</w:t>
-      </w:r>
-      <w:r>
-        <w:rPr>
-          <w:rStyle w:val="VerbatimChar"/>
-          <w:rFonts w:ascii="menlo" w:eastAsia="menlo" w:hAnsi="menlo" w:cs="menlo"/>
-        </w:rPr>
+        <w:t xml:space="preserve">  "bill_id": "bill_1001",</w:t>
         <w:br/>
-        <w:t xml:space="preserve">  "patient_id": "pat_12345",</w:t>
-      </w:r>
-      <w:r>
-        <w:rPr>
-          <w:rStyle w:val="VerbatimChar"/>
-          <w:rFonts w:ascii="menlo" w:eastAsia="menlo" w:hAnsi="menlo" w:cs="menlo"/>
-        </w:rPr>
+        <w:lastRenderedPageBreak/>
+        <w:t xml:space="preserve">  "bill_number": "MDH-20260401-0001",</w:t>
         <w:br/>
-        <w:t xml:space="preserve">  "visit_type": "WALK_IN",</w:t>
-      </w:r>
-      <w:r>
-        <w:rPr>
-          <w:rStyle w:val="VerbatimChar"/>
-          <w:rFonts w:ascii="menlo" w:eastAsia="menlo" w:hAnsi="menlo" w:cs="menlo"/>
-        </w:rPr>
+        <w:t xml:space="preserve">  "gross_amount": 800.00,</w:t>
         <w:br/>
-        <w:t xml:space="preserve">  "payer_type": "SELF",</w:t>
-      </w:r>
-      <w:r>
-        <w:rPr>
-          <w:rStyle w:val="VerbatimChar"/>
-          <w:rFonts w:ascii="menlo" w:eastAsia="menlo" w:hAnsi="menlo" w:cs="menlo"/>
-        </w:rPr>
+        <w:t xml:space="preserve">  "discount_amount": 40.00,</w:t>
         <w:br/>
-        <w:t xml:space="preserve">  "referrer_id": "doc_001",</w:t>
-      </w:r>
-      <w:r>
-        <w:rPr>
-          <w:rStyle w:val="VerbatimChar"/>
-          <w:rFonts w:ascii="menlo" w:eastAsia="menlo" w:hAnsi="menlo" w:cs="menlo"/>
-        </w:rPr>
+        <w:t xml:space="preserve">  "net_amount": 760.00,</w:t>
         <w:br/>
-        <w:t xml:space="preserve">  "tests": [</w:t>
-      </w:r>
-      <w:r>
-        <w:rPr>
-          <w:rStyle w:val="VerbatimChar"/>
-          <w:rFonts w:ascii="menlo" w:eastAsia="menlo" w:hAnsi="menlo" w:cs="menlo"/>
-        </w:rPr>
+        <w:t xml:space="preserve">  "rounding_adjustment": -10.00,</w:t>
         <w:br/>
-        <w:t xml:space="preserve">    { "test_id": "test_cbc", "quantity": 1 },</w:t>
-      </w:r>
-      <w:r>
-        <w:rPr>
-          <w:rStyle w:val="VerbatimChar"/>
-          <w:rFonts w:ascii="menlo" w:eastAsia="menlo" w:hAnsi="menlo" w:cs="menlo"/>
-        </w:rPr>
+        <w:t xml:space="preserve">  "final_amount": 750.00,</w:t>
         <w:br/>
-        <w:t xml:space="preserve">    { "test_id": "test_fbs", "quantity": 1 }</w:t>
-      </w:r>
-      <w:r>
-        <w:rPr>
-          <w:rStyle w:val="VerbatimChar"/>
-          <w:rFonts w:ascii="menlo" w:eastAsia="menlo" w:hAnsi="menlo" w:cs="menlo"/>
-        </w:rPr>
+        <w:t xml:space="preserve">  "bill_status": "PAID",</w:t>
         <w:br/>
-        <w:t xml:space="preserve">  ],</w:t>
-      </w:r>
-      <w:r>
-        <w:rPr>
-          <w:rStyle w:val="VerbatimChar"/>
-          <w:rFonts w:ascii="menlo" w:eastAsia="menlo" w:hAnsi="menlo" w:cs="menlo"/>
-        </w:rPr>
+        <w:t xml:space="preserve">  "payment_status": "SUCCESS",</w:t>
         <w:br/>
-        <w:t xml:space="preserve">  "manual_discount_percent": 5,</w:t>
-      </w:r>
-      <w:r>
-        <w:rPr>
-          <w:rStyle w:val="VerbatimChar"/>
-          <w:rFonts w:ascii="menlo" w:eastAsia="menlo" w:hAnsi="menlo" w:cs="menlo"/>
-        </w:rPr>
-        <w:br/>
-        <w:t xml:space="preserve">  "discount_reason_code": "SENIOR_CITIZEN",</w:t>
-      </w:r>
-      <w:r>
-        <w:rPr>
-          <w:rStyle w:val="VerbatimChar"/>
-          <w:rFonts w:ascii="menlo" w:eastAsia="menlo" w:hAnsi="menlo" w:cs="menlo"/>
-        </w:rPr>
-        <w:br/>
-        <w:t xml:space="preserve">  "payment": {</w:t>
-      </w:r>
-      <w:r>
-        <w:rPr>
-          <w:rStyle w:val="VerbatimChar"/>
-          <w:rFonts w:ascii="menlo" w:eastAsia="menlo" w:hAnsi="menlo" w:cs="menlo"/>
-        </w:rPr>
-        <w:br/>
-        <w:t xml:space="preserve">    "mode": "UPI",</w:t>
-      </w:r>
-      <w:r>
-        <w:rPr>
-          <w:rStyle w:val="VerbatimChar"/>
-          <w:rFonts w:ascii="menlo" w:eastAsia="menlo" w:hAnsi="menlo" w:cs="menlo"/>
-        </w:rPr>
-        <w:br/>
-        <w:t xml:space="preserve">    "amount": 750.00,</w:t>
-      </w:r>
-      <w:r>
-        <w:rPr>
-          <w:rStyle w:val="VerbatimChar"/>
-          <w:rFonts w:ascii="menlo" w:eastAsia="menlo" w:hAnsi="menlo" w:cs="menlo"/>
-        </w:rPr>
-        <w:br/>
-        <w:t xml:space="preserve">    "initiated_by": "user_001"</w:t>
-      </w:r>
-      <w:r>
-        <w:rPr>
-          <w:rStyle w:val="VerbatimChar"/>
-          <w:rFonts w:ascii="menlo" w:eastAsia="menlo" w:hAnsi="menlo" w:cs="menlo"/>
-        </w:rPr>
-        <w:br/>
-        <w:t xml:space="preserve">  }</w:t>
-      </w:r>
-      <w:r>
-        <w:rPr>
-          <w:rStyle w:val="VerbatimChar"/>
-          <w:rFonts w:ascii="menlo" w:eastAsia="menlo" w:hAnsi="menlo" w:cs="menlo"/>
-        </w:rPr>
+        <w:t xml:space="preserve">  "accession_number": "ACC-MDH-20260401-0001"</w:t>
         <w:br/>
         <w:t>}</w:t>
-      </w:r>
-      <w:r>
-        <w:rPr>
-          <w:rStyle w:val="VerbatimChar"/>
-          <w:rFonts w:ascii="menlo" w:eastAsia="menlo" w:hAnsi="menlo" w:cs="menlo"/>
-        </w:rPr>
-        <w:br/>
-      </w:r>
-    </w:p>
-    <w:p>
-      <w:pPr>
-        <w:spacing w:after="210"/>
-      </w:pPr>
-      <w:r>
-        <w:rPr>
-          <w:b/>
-        </w:rPr>
-        <w:t>Response (201 Created):</w:t>
-      </w:r>
-    </w:p>
-    <w:p>
-      <w:pPr>
-        <w:shd w:val="clear" w:color="auto" w:fill="F8F8FA"/>
-      </w:pPr>
-      <w:r>
-        <w:rPr>
-          <w:rStyle w:val="VerbatimChar"/>
-          <w:rFonts w:ascii="menlo" w:eastAsia="menlo" w:hAnsi="menlo" w:cs="menlo"/>
-        </w:rPr>
-        <w:t>{</w:t>
-      </w:r>
-      <w:r>
-        <w:rPr>
-          <w:rStyle w:val="VerbatimChar"/>
-          <w:rFonts w:ascii="menlo" w:eastAsia="menlo" w:hAnsi="menlo" w:cs="menlo"/>
-        </w:rPr>
-        <w:br/>
-        <w:t xml:space="preserve">  "bill_id": "bill_1001",</w:t>
-      </w:r>
-      <w:r>
-        <w:rPr>
-          <w:rStyle w:val="VerbatimChar"/>
-          <w:rFonts w:ascii="menlo" w:eastAsia="menlo" w:hAnsi="menlo" w:cs="menlo"/>
-        </w:rPr>
-        <w:br/>
-      </w:r>
-      <w:r>
-        <w:rPr>
-          <w:rStyle w:val="VerbatimChar"/>
-          <w:rFonts w:ascii="menlo" w:eastAsia="menlo" w:hAnsi="menlo" w:cs="menlo"/>
-        </w:rPr>
-        <w:lastRenderedPageBreak/>
-        <w:t xml:space="preserve">  "bill_number": "MDH-20260401-0001",</w:t>
-      </w:r>
-      <w:r>
-        <w:rPr>
-          <w:rStyle w:val="VerbatimChar"/>
-          <w:rFonts w:ascii="menlo" w:eastAsia="menlo" w:hAnsi="menlo" w:cs="menlo"/>
-        </w:rPr>
-        <w:br/>
-        <w:t xml:space="preserve">  "gross_amount": 800.00,</w:t>
-      </w:r>
-      <w:r>
-        <w:rPr>
-          <w:rStyle w:val="VerbatimChar"/>
-          <w:rFonts w:ascii="menlo" w:eastAsia="menlo" w:hAnsi="menlo" w:cs="menlo"/>
-        </w:rPr>
-        <w:br/>
-        <w:t xml:space="preserve">  "discount_amount": 40.00,</w:t>
-      </w:r>
-      <w:r>
-        <w:rPr>
-          <w:rStyle w:val="VerbatimChar"/>
-          <w:rFonts w:ascii="menlo" w:eastAsia="menlo" w:hAnsi="menlo" w:cs="menlo"/>
-        </w:rPr>
-        <w:br/>
-        <w:t xml:space="preserve">  "net_amount": 760.00,</w:t>
-      </w:r>
-      <w:r>
-        <w:rPr>
-          <w:rStyle w:val="VerbatimChar"/>
-          <w:rFonts w:ascii="menlo" w:eastAsia="menlo" w:hAnsi="menlo" w:cs="menlo"/>
-        </w:rPr>
-        <w:br/>
-        <w:t xml:space="preserve">  "rounding_adjustment": -10.00,</w:t>
-      </w:r>
-      <w:r>
-        <w:rPr>
-          <w:rStyle w:val="VerbatimChar"/>
-          <w:rFonts w:ascii="menlo" w:eastAsia="menlo" w:hAnsi="menlo" w:cs="menlo"/>
-        </w:rPr>
-        <w:br/>
-        <w:t xml:space="preserve">  "final_amount": 750.00,</w:t>
-      </w:r>
-      <w:r>
-        <w:rPr>
-          <w:rStyle w:val="VerbatimChar"/>
-          <w:rFonts w:ascii="menlo" w:eastAsia="menlo" w:hAnsi="menlo" w:cs="menlo"/>
-        </w:rPr>
-        <w:br/>
-        <w:t xml:space="preserve">  "bill_status": "PAID",</w:t>
-      </w:r>
-      <w:r>
-        <w:rPr>
-          <w:rStyle w:val="VerbatimChar"/>
-          <w:rFonts w:ascii="menlo" w:eastAsia="menlo" w:hAnsi="menlo" w:cs="menlo"/>
-        </w:rPr>
-        <w:br/>
-        <w:t xml:space="preserve">  "payment_status": "SUCCESS",</w:t>
-      </w:r>
-      <w:r>
-        <w:rPr>
-          <w:rStyle w:val="VerbatimChar"/>
-          <w:rFonts w:ascii="menlo" w:eastAsia="menlo" w:hAnsi="menlo" w:cs="menlo"/>
-        </w:rPr>
-        <w:br/>
-        <w:t xml:space="preserve">  "accession_number": "ACC-MDH-20260401-0001"</w:t>
-      </w:r>
-      <w:r>
-        <w:rPr>
-          <w:rStyle w:val="VerbatimChar"/>
-          <w:rFonts w:ascii="menlo" w:eastAsia="menlo" w:hAnsi="menlo" w:cs="menlo"/>
-        </w:rPr>
-        <w:br/>
-        <w:t>}</w:t>
-      </w:r>
-      <w:r>
-        <w:rPr>
-          <w:rStyle w:val="VerbatimChar"/>
-          <w:rFonts w:ascii="menlo" w:eastAsia="menlo" w:hAnsi="menlo" w:cs="menlo"/>
-        </w:rPr>
         <w:br/>
       </w:r>
     </w:p>
@@ -18529,98 +17970,44 @@
           <w:rFonts w:ascii="menlo" w:eastAsia="menlo" w:hAnsi="menlo" w:cs="menlo"/>
         </w:rPr>
         <w:t>{</w:t>
-      </w:r>
+        <w:br/>
+        <w:t xml:space="preserve">  "approved_by": "user_path_01",</w:t>
+        <w:br/>
+        <w:t xml:space="preserve">  "comments": "Normal CBC. No significant abnormality."</w:t>
+        <w:br/>
+        <w:t>}</w:t>
+        <w:br/>
+      </w:r>
+    </w:p>
+    <w:p>
+      <w:pPr>
+        <w:spacing w:after="210"/>
+      </w:pPr>
+      <w:r>
+        <w:rPr>
+          <w:b/>
+        </w:rPr>
+        <w:t>Response (200 OK):</w:t>
+      </w:r>
+    </w:p>
+    <w:p>
+      <w:pPr>
+        <w:shd w:val="clear" w:color="auto" w:fill="F8F8FA"/>
+      </w:pPr>
       <w:r>
         <w:rPr>
           <w:rStyle w:val="VerbatimChar"/>
           <w:rFonts w:ascii="menlo" w:eastAsia="menlo" w:hAnsi="menlo" w:cs="menlo"/>
         </w:rPr>
+        <w:t>{</w:t>
         <w:br/>
-        <w:t xml:space="preserve">  "approved_by": "user_path_01",</w:t>
-      </w:r>
-      <w:r>
-        <w:rPr>
-          <w:rStyle w:val="VerbatimChar"/>
-          <w:rFonts w:ascii="menlo" w:eastAsia="menlo" w:hAnsi="menlo" w:cs="menlo"/>
-        </w:rPr>
+        <w:t xml:space="preserve">  "test_order_id": "to_56789",</w:t>
         <w:br/>
-        <w:t xml:space="preserve">  "comments": "Normal CBC. No significant abnormality."</w:t>
-      </w:r>
-      <w:r>
-        <w:rPr>
-          <w:rStyle w:val="VerbatimChar"/>
-          <w:rFonts w:ascii="menlo" w:eastAsia="menlo" w:hAnsi="menlo" w:cs="menlo"/>
-        </w:rPr>
+        <w:t xml:space="preserve">  "status": "APPROVED",</w:t>
+        <w:br/>
+        <w:t xml:space="preserve">  "approved_at": "2026-04-01T18:32:00+05:30"</w:t>
         <w:br/>
         <w:t>}</w:t>
-      </w:r>
-      <w:r>
-        <w:rPr>
-          <w:rStyle w:val="VerbatimChar"/>
-          <w:rFonts w:ascii="menlo" w:eastAsia="menlo" w:hAnsi="menlo" w:cs="menlo"/>
-        </w:rPr>
-        <w:br/>
-      </w:r>
-    </w:p>
-    <w:p>
-      <w:pPr>
-        <w:spacing w:after="210"/>
-      </w:pPr>
-      <w:r>
-        <w:rPr>
-          <w:b/>
-        </w:rPr>
-        <w:t>Response (200 OK):</w:t>
-      </w:r>
-    </w:p>
-    <w:p>
-      <w:pPr>
-        <w:shd w:val="clear" w:color="auto" w:fill="F8F8FA"/>
-      </w:pPr>
-      <w:r>
-        <w:rPr>
-          <w:rStyle w:val="VerbatimChar"/>
-          <w:rFonts w:ascii="menlo" w:eastAsia="menlo" w:hAnsi="menlo" w:cs="menlo"/>
-        </w:rPr>
-        <w:t>{</w:t>
-      </w:r>
-      <w:r>
-        <w:rPr>
-          <w:rStyle w:val="VerbatimChar"/>
-          <w:rFonts w:ascii="menlo" w:eastAsia="menlo" w:hAnsi="menlo" w:cs="menlo"/>
-        </w:rPr>
-        <w:br/>
-        <w:t xml:space="preserve">  "test_order_id": "to_56789",</w:t>
-      </w:r>
-      <w:r>
-        <w:rPr>
-          <w:rStyle w:val="VerbatimChar"/>
-          <w:rFonts w:ascii="menlo" w:eastAsia="menlo" w:hAnsi="menlo" w:cs="menlo"/>
-        </w:rPr>
-        <w:br/>
-        <w:t xml:space="preserve">  "status": "APPROVED",</w:t>
-      </w:r>
-      <w:r>
-        <w:rPr>
-          <w:rStyle w:val="VerbatimChar"/>
-          <w:rFonts w:ascii="menlo" w:eastAsia="menlo" w:hAnsi="menlo" w:cs="menlo"/>
-        </w:rPr>
-        <w:br/>
-        <w:t xml:space="preserve">  "approved_at": "2026-04-01T18:32:00+05:30"</w:t>
-      </w:r>
-      <w:r>
-        <w:rPr>
-          <w:rStyle w:val="VerbatimChar"/>
-          <w:rFonts w:ascii="menlo" w:eastAsia="menlo" w:hAnsi="menlo" w:cs="menlo"/>
-        </w:rPr>
-        <w:br/>
-        <w:t>}</w:t>
-      </w:r>
-      <w:r>
-        <w:rPr>
-          <w:rStyle w:val="VerbatimChar"/>
-          <w:rFonts w:ascii="menlo" w:eastAsia="menlo" w:hAnsi="menlo" w:cs="menlo"/>
-        </w:rPr>
         <w:br/>
       </w:r>
     </w:p>
@@ -18672,76 +18059,22 @@
           <w:rFonts w:ascii="menlo" w:eastAsia="menlo" w:hAnsi="menlo" w:cs="menlo"/>
         </w:rPr>
         <w:t>{</w:t>
-      </w:r>
-      <w:r>
-        <w:rPr>
-          <w:rStyle w:val="VerbatimChar"/>
-          <w:rFonts w:ascii="menlo" w:eastAsia="menlo" w:hAnsi="menlo" w:cs="menlo"/>
-        </w:rPr>
         <w:br/>
         <w:t xml:space="preserve">  "error_code": "BILL_INVALID_STATE",</w:t>
-      </w:r>
-      <w:r>
-        <w:rPr>
-          <w:rStyle w:val="VerbatimChar"/>
-          <w:rFonts w:ascii="menlo" w:eastAsia="menlo" w:hAnsi="menlo" w:cs="menlo"/>
-        </w:rPr>
         <w:br/>
         <w:t xml:space="preserve">  "message": "Bill cannot be edited after payment is confirmed.",</w:t>
-      </w:r>
-      <w:r>
-        <w:rPr>
-          <w:rStyle w:val="VerbatimChar"/>
-          <w:rFonts w:ascii="menlo" w:eastAsia="menlo" w:hAnsi="menlo" w:cs="menlo"/>
-        </w:rPr>
         <w:br/>
         <w:t xml:space="preserve">  "details": {</w:t>
-      </w:r>
-      <w:r>
-        <w:rPr>
-          <w:rStyle w:val="VerbatimChar"/>
-          <w:rFonts w:ascii="menlo" w:eastAsia="menlo" w:hAnsi="menlo" w:cs="menlo"/>
-        </w:rPr>
         <w:br/>
         <w:t xml:space="preserve">    "bill_id": "bill_1001",</w:t>
-      </w:r>
-      <w:r>
-        <w:rPr>
-          <w:rStyle w:val="VerbatimChar"/>
-          <w:rFonts w:ascii="menlo" w:eastAsia="menlo" w:hAnsi="menlo" w:cs="menlo"/>
-        </w:rPr>
         <w:br/>
         <w:t xml:space="preserve">    "current_status": "PAID"</w:t>
-      </w:r>
-      <w:r>
-        <w:rPr>
-          <w:rStyle w:val="VerbatimChar"/>
-          <w:rFonts w:ascii="menlo" w:eastAsia="menlo" w:hAnsi="menlo" w:cs="menlo"/>
-        </w:rPr>
         <w:br/>
         <w:t xml:space="preserve">  },</w:t>
-      </w:r>
-      <w:r>
-        <w:rPr>
-          <w:rStyle w:val="VerbatimChar"/>
-          <w:rFonts w:ascii="menlo" w:eastAsia="menlo" w:hAnsi="menlo" w:cs="menlo"/>
-        </w:rPr>
         <w:br/>
         <w:t xml:space="preserve">  "correlation_id": "1f3d8c24-..."</w:t>
-      </w:r>
-      <w:r>
-        <w:rPr>
-          <w:rStyle w:val="VerbatimChar"/>
-          <w:rFonts w:ascii="menlo" w:eastAsia="menlo" w:hAnsi="menlo" w:cs="menlo"/>
-        </w:rPr>
         <w:br/>
         <w:t>}</w:t>
-      </w:r>
-      <w:r>
-        <w:rPr>
-          <w:rStyle w:val="VerbatimChar"/>
-          <w:rFonts w:ascii="menlo" w:eastAsia="menlo" w:hAnsi="menlo" w:cs="menlo"/>
-        </w:rPr>
         <w:br/>
       </w:r>
     </w:p>
@@ -19202,25 +18535,7 @@
           <w:sz w:val="33"/>
           <w:szCs w:val="33"/>
         </w:rPr>
-        <w:t xml:space="preserve">11.3 Concurrent Edits </w:t>
-      </w:r>
-      <w:r>
-        <w:rPr>
-          <w:b/>
-          <w:bCs/>
-          <w:sz w:val="33"/>
-          <w:szCs w:val="33"/>
-        </w:rPr>
-        <w:t>–</w:t>
-      </w:r>
-      <w:r>
-        <w:rPr>
-          <w:b/>
-          <w:bCs/>
-          <w:sz w:val="33"/>
-          <w:szCs w:val="33"/>
-        </w:rPr>
-        <w:t xml:space="preserve"> Same Bill</w:t>
+        <w:t>11.3 Concurrent Edits – Same Bill</w:t>
       </w:r>
     </w:p>
     <w:p>
@@ -19244,19 +18559,7 @@
         <w:t>Application-level edit-session lock:</w:t>
       </w:r>
       <w:r>
-        <w:t xml:space="preserve"> For high-conflict screens (bill edit), add: locked_by_user_id, lock_acquired_at, lock_expires_at (TTL ~ 5 minutes, renewable). UI behavior: first editor gets the lock; other users see a read-only view with </w:t>
-      </w:r>
-      <w:r>
-        <w:t>“</w:t>
-      </w:r>
-      <w:r>
-        <w:t xml:space="preserve">currently edited by </w:t>
-      </w:r>
-      <w:r>
-        <w:t>…”</w:t>
-      </w:r>
-      <w:r>
-        <w:t>.</w:t>
+        <w:t xml:space="preserve"> For high-conflict screens (bill edit), add: locked_by_user_id, lock_acquired_at, lock_expires_at (TTL ~ 5 minutes, renewable). UI behavior: first editor gets the lock; other users see a read-only view with “currently edited by …”.</w:t>
       </w:r>
     </w:p>
     <w:p>
@@ -21184,65 +20487,17 @@
         <w:rPr>
           <w:sz w:val="22"/>
         </w:rPr>
-        <w:t xml:space="preserve">Medrelief is an AI-first diagnostic lab system. Not a traditional LIMS with AI features added. The receptionist scans a prescription; AI reads it. The receptionist speaks; AI fills the form. The lab tech dictates results; AI enters them. Reports auto-generate. WhatsApp delivers them. Every manual entry point is replaced by AI assistance. The UI is kiosk-style (touch-first, mobile-first, vending-machine simplicity). A Siri/Alexa-style AI voice assistant helps every role </w:t>
-      </w:r>
-      <w:r>
-        <w:rPr>
-          <w:sz w:val="22"/>
-        </w:rPr>
-        <w:t>—</w:t>
-      </w:r>
-      <w:r>
-        <w:rPr>
-          <w:sz w:val="22"/>
-        </w:rPr>
-        <w:t xml:space="preserve"> receptionist, lab tech, pathologist,</w:t>
-      </w:r>
-      <w:r>
-        <w:rPr>
-          <w:sz w:val="22"/>
-        </w:rPr>
-        <w:t xml:space="preserve"> center head </w:t>
-      </w:r>
-      <w:r>
-        <w:rPr>
-          <w:sz w:val="22"/>
-        </w:rPr>
-        <w:t>—</w:t>
-      </w:r>
-      <w:r>
-        <w:rPr>
-          <w:sz w:val="22"/>
-        </w:rPr>
-        <w:t xml:space="preserve"> complete their tasks by speaking naturally instead of typing. The prototype (v0.6.0) demonstrates this product. The production build implements the same product from scratch with multi-center support, authorization controls, and the additional features documented below.</w:t>
-      </w:r>
-    </w:p>
-    <w:p>
-      <w:r>
-        <w:t>Added: April 2026. Sections 15</w:t>
-      </w:r>
-      <w:r>
-        <w:t>–</w:t>
-      </w:r>
-      <w:r>
-        <w:t>20 below extend the original PRD (sections 1</w:t>
-      </w:r>
-      <w:r>
-        <w:t>–</w:t>
-      </w:r>
-      <w:r>
-        <w:t>14) with production additions, new features, and the authorization model. The original sections are unchanged.</w:t>
-      </w:r>
-    </w:p>
-    <w:p>
-      <w:r>
-        <w:t xml:space="preserve">The core innovation: AI replaces manual data entry at every stage </w:t>
-      </w:r>
-      <w:r>
-        <w:t>—</w:t>
-      </w:r>
-      <w:r>
-        <w:t xml:space="preserve"> prescription OCR at registration, conversational voice assistant for form filling, auto-flagging in the lab, AI-generated reports. The receptionist never types patient details; they scan and confirm.</w:t>
+        <w:t>Medrelief is an AI-first diagnostic lab system. Not a traditional LIMS with AI features added. The receptionist scans a prescription; AI reads it. The receptionist speaks; AI fills the form. The lab tech dictates results; AI enters them. Reports auto-generate. WhatsApp delivers them. Every manual entry point is replaced by AI assistance. The UI is kiosk-style (touch-first, mobile-first, vending-machine simplicity). A Siri/Alexa-style AI voice assistant helps every role — receptionist, lab tech, pathologist, center head — complete their tasks by speaking naturally instead of typing. The prototype (v0.6.0) demonstrates this product. The production build implements the same product from scratch with multi-center support, authorization controls, and the additional features documented below.</w:t>
+      </w:r>
+    </w:p>
+    <w:p>
+      <w:r>
+        <w:t>Added: April 2026. Sections 15–20 below extend the original PRD (sections 1–14) with production additions, new features, and the authorization model. The original sections are unchanged.</w:t>
+      </w:r>
+    </w:p>
+    <w:p>
+      <w:r>
+        <w:t>The core innovation: AI replaces manual data entry at every stage — prescription OCR at registration, conversational voice assistant for form filling, auto-flagging in the lab, AI-generated reports. The receptionist never types patient details; they scan and confirm.</w:t>
       </w:r>
     </w:p>
     <w:p>
@@ -21270,67 +20525,7 @@
     </w:p>
     <w:p>
       <w:r>
-        <w:t xml:space="preserve">Medrelief is not a traditional LIMS. It is an AI-first lab management system where the core flow is: scan prescription </w:t>
-      </w:r>
-      <w:r>
-        <w:t>→</w:t>
-      </w:r>
-      <w:r>
-        <w:t xml:space="preserve"> AI extracts details </w:t>
-      </w:r>
-      <w:r>
-        <w:t>→</w:t>
-      </w:r>
-      <w:r>
-        <w:t xml:space="preserve"> confirm </w:t>
-      </w:r>
-      <w:r>
-        <w:t>→</w:t>
-      </w:r>
-      <w:r>
-        <w:t xml:space="preserve"> pay </w:t>
-      </w:r>
-      <w:r>
-        <w:t>→</w:t>
-      </w:r>
-      <w:r>
-        <w:t xml:space="preserve"> auto-accession </w:t>
-      </w:r>
-      <w:r>
-        <w:t>→</w:t>
-      </w:r>
-      <w:r>
-        <w:t xml:space="preserve"> lab processes </w:t>
-      </w:r>
-      <w:r>
-        <w:t>→</w:t>
-      </w:r>
-      <w:r>
-        <w:t xml:space="preserve"> AI-assisted result entry </w:t>
-      </w:r>
-      <w:r>
-        <w:t>→</w:t>
-      </w:r>
-      <w:r>
-        <w:t xml:space="preserve"> sign-off </w:t>
-      </w:r>
-      <w:r>
-        <w:t>→</w:t>
-      </w:r>
-      <w:r>
-        <w:t xml:space="preserve"> auto-generated report </w:t>
-      </w:r>
-      <w:r>
-        <w:t>→</w:t>
-      </w:r>
-      <w:r>
-        <w:t xml:space="preserve"> WhatsApp delivery. The v0.6.0 prototype below IS the product </w:t>
-      </w:r>
-      <w:r>
-        <w:t>—</w:t>
-      </w:r>
-      <w:r>
-        <w:t xml:space="preserve"> the production system implements the same experience from scratch in a new codebase with production-grade infrastructure.</w:t>
+        <w:t>Medrelief is not a traditional LIMS. It is an AI-first lab management system where the core flow is: scan prescription → AI extracts details → confirm → pay → auto-accession → lab processes → AI-assisted result entry → sign-off → auto-generated report → WhatsApp delivery. The v0.6.0 prototype below IS the product — the production system implements the same experience from scratch in a new codebase with production-grade infrastructure.</w:t>
       </w:r>
     </w:p>
     <w:p>
@@ -21365,13 +20560,7 @@
         </w:numPr>
       </w:pPr>
       <w:r>
-        <w:t>Frontend: React 19 + Vite + Tailwind 4 PWA on GitHub Pages (mobile-first kiosk, 390</w:t>
-      </w:r>
-      <w:r>
-        <w:t>×</w:t>
-      </w:r>
-      <w:r>
-        <w:t>844 viewport).</w:t>
+        <w:t>Frontend: React 19 + Vite + Tailwind 4 PWA on GitHub Pages (mobile-first kiosk, 390×844 viewport).</w:t>
       </w:r>
     </w:p>
     <w:p>
@@ -21382,13 +20571,7 @@
         </w:numPr>
       </w:pPr>
       <w:r>
-        <w:t>AI: Claude Vision for prescription OCR (</w:t>
-      </w:r>
-      <w:r>
-        <w:t>₹</w:t>
-      </w:r>
-      <w:r>
-        <w:t>0.08/scan) + Claude Haiku business assistant.</w:t>
+        <w:t>AI: Claude Vision for prescription OCR (₹0.08/scan) + Claude Haiku business assistant.</w:t>
       </w:r>
     </w:p>
     <w:p>
@@ -21451,43 +20634,7 @@
         </w:numPr>
       </w:pPr>
       <w:r>
-        <w:t xml:space="preserve">Registration </w:t>
-      </w:r>
-      <w:r>
-        <w:t>→</w:t>
-      </w:r>
-      <w:r>
-        <w:t xml:space="preserve"> prescription OCR </w:t>
-      </w:r>
-      <w:r>
-        <w:t>→</w:t>
-      </w:r>
-      <w:r>
-        <w:t xml:space="preserve"> patient verify </w:t>
-      </w:r>
-      <w:r>
-        <w:t>→</w:t>
-      </w:r>
-      <w:r>
-        <w:t xml:space="preserve"> test selection </w:t>
-      </w:r>
-      <w:r>
-        <w:t>→</w:t>
-      </w:r>
-      <w:r>
-        <w:t xml:space="preserve"> rate plan pricing </w:t>
-      </w:r>
-      <w:r>
-        <w:t>→</w:t>
-      </w:r>
-      <w:r>
-        <w:t xml:space="preserve"> payment (Razorpay) </w:t>
-      </w:r>
-      <w:r>
-        <w:t>→</w:t>
-      </w:r>
-      <w:r>
-        <w:t xml:space="preserve"> accession auto-creation.</w:t>
+        <w:t>Registration → prescription OCR → patient verify → test selection → rate plan pricing → payment (Razorpay) → accession auto-creation.</w:t>
       </w:r>
     </w:p>
     <w:p>
@@ -21498,37 +20645,7 @@
         </w:numPr>
       </w:pPr>
       <w:r>
-        <w:t xml:space="preserve">Lab worklist </w:t>
-      </w:r>
-      <w:r>
-        <w:t>→</w:t>
-      </w:r>
-      <w:r>
-        <w:t xml:space="preserve"> sample collection </w:t>
-      </w:r>
-      <w:r>
-        <w:t>→</w:t>
-      </w:r>
-      <w:r>
-        <w:t xml:space="preserve"> receive </w:t>
-      </w:r>
-      <w:r>
-        <w:t>→</w:t>
-      </w:r>
-      <w:r>
-        <w:t xml:space="preserve"> start processing </w:t>
-      </w:r>
-      <w:r>
-        <w:t>→</w:t>
-      </w:r>
-      <w:r>
-        <w:t xml:space="preserve"> result entry (with voice input) </w:t>
-      </w:r>
-      <w:r>
-        <w:t>→</w:t>
-      </w:r>
-      <w:r>
-        <w:t xml:space="preserve"> auto-flagging (NORMAL/HIGH/LOW/CRITICAL).</w:t>
+        <w:t>Lab worklist → sample collection → receive → start processing → result entry (with voice input) → auto-flagging (NORMAL/HIGH/LOW/CRITICAL).</w:t>
       </w:r>
     </w:p>
     <w:p>
@@ -21539,19 +20656,7 @@
         </w:numPr>
       </w:pPr>
       <w:r>
-        <w:t xml:space="preserve">Pathologist sign-off </w:t>
-      </w:r>
-      <w:r>
-        <w:t>→</w:t>
-      </w:r>
-      <w:r>
-        <w:t xml:space="preserve"> report auto-generation </w:t>
-      </w:r>
-      <w:r>
-        <w:t>→</w:t>
-      </w:r>
-      <w:r>
-        <w:t xml:space="preserve"> delivery (WhatsApp + Email stubs).</w:t>
+        <w:t>Pathologist sign-off → report auto-generation → delivery (WhatsApp + Email stubs).</w:t>
       </w:r>
     </w:p>
     <w:p>
@@ -21587,7 +20692,7 @@
         </w:rPr>
         <w:lastRenderedPageBreak/>
         <w:drawing>
-          <wp:inline distT="0" distB="0" distL="0" distR="0" wp14:anchorId="3EA02A8B" wp14:editId="218CD9A2">
+          <wp:inline distT="0" distB="0" distL="0" distR="0" wp14:anchorId="0F533C2B" wp14:editId="07380016">
             <wp:extent cx="2743200" cy="5936566"/>
             <wp:effectExtent l="0" t="0" r="0" b="0"/>
             <wp:docPr id="71815" name="Stage 1: Login (Receptionist)"/>
@@ -21643,7 +20748,7 @@
         </w:rPr>
         <w:lastRenderedPageBreak/>
         <w:drawing>
-          <wp:inline distT="0" distB="0" distL="0" distR="0" wp14:anchorId="3385EC1A" wp14:editId="33BF6987">
+          <wp:inline distT="0" distB="0" distL="0" distR="0" wp14:anchorId="0A6803E4" wp14:editId="536A08A2">
             <wp:extent cx="2743200" cy="5936566"/>
             <wp:effectExtent l="0" t="0" r="0" b="0"/>
             <wp:docPr id="42819" name="Stage 2: Kiosk Home"/>
@@ -21699,7 +20804,7 @@
         </w:rPr>
         <w:lastRenderedPageBreak/>
         <w:drawing>
-          <wp:inline distT="0" distB="0" distL="0" distR="0" wp14:anchorId="51402FD7" wp14:editId="2678361B">
+          <wp:inline distT="0" distB="0" distL="0" distR="0" wp14:anchorId="25DA21A5" wp14:editId="3C4974E8">
             <wp:extent cx="2743200" cy="5936566"/>
             <wp:effectExtent l="0" t="0" r="0" b="0"/>
             <wp:docPr id="86800" name="Stage 3: Capture Prescription (AI OCR)"/>
@@ -21755,7 +20860,7 @@
         </w:rPr>
         <w:lastRenderedPageBreak/>
         <w:drawing>
-          <wp:inline distT="0" distB="0" distL="0" distR="0" wp14:anchorId="6CC06BF8" wp14:editId="2CFAF1D8">
+          <wp:inline distT="0" distB="0" distL="0" distR="0" wp14:anchorId="6916CA6F" wp14:editId="2A610294">
             <wp:extent cx="2743200" cy="5936566"/>
             <wp:effectExtent l="0" t="0" r="0" b="0"/>
             <wp:docPr id="3836" name="Stage 4: Verify Patient Details"/>
@@ -21811,7 +20916,7 @@
         </w:rPr>
         <w:lastRenderedPageBreak/>
         <w:drawing>
-          <wp:inline distT="0" distB="0" distL="0" distR="0" wp14:anchorId="321CC2E9" wp14:editId="146E3D83">
+          <wp:inline distT="0" distB="0" distL="0" distR="0" wp14:anchorId="66ACC413" wp14:editId="0CEB04B7">
             <wp:extent cx="2743200" cy="5936566"/>
             <wp:effectExtent l="0" t="0" r="0" b="0"/>
             <wp:docPr id="14050" name="Stage 5: Select Tests (Rate Plan)"/>
@@ -21867,7 +20972,7 @@
         </w:rPr>
         <w:lastRenderedPageBreak/>
         <w:drawing>
-          <wp:inline distT="0" distB="0" distL="0" distR="0" wp14:anchorId="643A8E66" wp14:editId="3575C7A8">
+          <wp:inline distT="0" distB="0" distL="0" distR="0" wp14:anchorId="2F20A4F7" wp14:editId="12657252">
             <wp:extent cx="2743200" cy="5936566"/>
             <wp:effectExtent l="0" t="0" r="0" b="0"/>
             <wp:docPr id="90036" name="Stage 6: Payment Mode Selection"/>
@@ -21923,7 +21028,7 @@
         </w:rPr>
         <w:lastRenderedPageBreak/>
         <w:drawing>
-          <wp:inline distT="0" distB="0" distL="0" distR="0" wp14:anchorId="02794164" wp14:editId="00CE4624">
+          <wp:inline distT="0" distB="0" distL="0" distR="0" wp14:anchorId="58DF7E6B" wp14:editId="1101A56B">
             <wp:extent cx="2743200" cy="5936566"/>
             <wp:effectExtent l="0" t="0" r="0" b="0"/>
             <wp:docPr id="31100" name="Stage 7: Razorpay Checkout"/>
@@ -21979,7 +21084,7 @@
         </w:rPr>
         <w:lastRenderedPageBreak/>
         <w:drawing>
-          <wp:inline distT="0" distB="0" distL="0" distR="0" wp14:anchorId="04657806" wp14:editId="43BA3758">
+          <wp:inline distT="0" distB="0" distL="0" distR="0" wp14:anchorId="0733A57C" wp14:editId="63602E95">
             <wp:extent cx="2743200" cy="5936566"/>
             <wp:effectExtent l="0" t="0" r="0" b="0"/>
             <wp:docPr id="95485" name="Stage 8: Paid Bill + Receipt + Labels"/>
@@ -22035,7 +21140,7 @@
         </w:rPr>
         <w:lastRenderedPageBreak/>
         <w:drawing>
-          <wp:inline distT="0" distB="0" distL="0" distR="0" wp14:anchorId="59EA0862" wp14:editId="02508CB8">
+          <wp:inline distT="0" distB="0" distL="0" distR="0" wp14:anchorId="7BE7EE3B" wp14:editId="0BAB410D">
             <wp:extent cx="2743200" cy="5936566"/>
             <wp:effectExtent l="0" t="0" r="0" b="0"/>
             <wp:docPr id="72562" name="Stage 9: Login (Lab Technician)"/>
@@ -22091,7 +21196,7 @@
         </w:rPr>
         <w:lastRenderedPageBreak/>
         <w:drawing>
-          <wp:inline distT="0" distB="0" distL="0" distR="0" wp14:anchorId="67331EA5" wp14:editId="2F2B9BCD">
+          <wp:inline distT="0" distB="0" distL="0" distR="0" wp14:anchorId="43EB4DB0" wp14:editId="35103B18">
             <wp:extent cx="2743200" cy="5936566"/>
             <wp:effectExtent l="0" t="0" r="0" b="0"/>
             <wp:docPr id="18746" name="Stage 10: Lab Worklist"/>
@@ -22147,7 +21252,7 @@
         </w:rPr>
         <w:lastRenderedPageBreak/>
         <w:drawing>
-          <wp:inline distT="0" distB="0" distL="0" distR="0" wp14:anchorId="3704DB9E" wp14:editId="506A1590">
+          <wp:inline distT="0" distB="0" distL="0" distR="0" wp14:anchorId="4AB7DF9C" wp14:editId="0B0A3FFD">
             <wp:extent cx="2743200" cy="5936566"/>
             <wp:effectExtent l="0" t="0" r="0" b="0"/>
             <wp:docPr id="48053" name="Stage 11: Sample Collected"/>
@@ -22203,7 +21308,7 @@
         </w:rPr>
         <w:lastRenderedPageBreak/>
         <w:drawing>
-          <wp:inline distT="0" distB="0" distL="0" distR="0" wp14:anchorId="10CA1500" wp14:editId="339452C1">
+          <wp:inline distT="0" distB="0" distL="0" distR="0" wp14:anchorId="234577FF" wp14:editId="3B19361F">
             <wp:extent cx="2743200" cy="5936566"/>
             <wp:effectExtent l="0" t="0" r="0" b="0"/>
             <wp:docPr id="38997" name="Stage 12: Enter Result"/>
@@ -22259,7 +21364,7 @@
         </w:rPr>
         <w:lastRenderedPageBreak/>
         <w:drawing>
-          <wp:inline distT="0" distB="0" distL="0" distR="0" wp14:anchorId="5C3780F7" wp14:editId="585B6F2D">
+          <wp:inline distT="0" distB="0" distL="0" distR="0" wp14:anchorId="513E1DD9" wp14:editId="570BFED3">
             <wp:extent cx="2743200" cy="5936566"/>
             <wp:effectExtent l="0" t="0" r="0" b="0"/>
             <wp:docPr id="98503" name="Stage 13: Login (Pathologist)"/>
@@ -22315,7 +21420,7 @@
         </w:rPr>
         <w:lastRenderedPageBreak/>
         <w:drawing>
-          <wp:inline distT="0" distB="0" distL="0" distR="0" wp14:anchorId="46C4FD52" wp14:editId="0E3702D1">
+          <wp:inline distT="0" distB="0" distL="0" distR="0" wp14:anchorId="023BBB33" wp14:editId="48893F23">
             <wp:extent cx="2743200" cy="5936566"/>
             <wp:effectExtent l="0" t="0" r="0" b="0"/>
             <wp:docPr id="68730" name="Stage 14: Sign-Off Queue (HIGH flag)"/>
@@ -22371,7 +21476,7 @@
         </w:rPr>
         <w:lastRenderedPageBreak/>
         <w:drawing>
-          <wp:inline distT="0" distB="0" distL="0" distR="0" wp14:anchorId="6F73BF19" wp14:editId="4677249B">
+          <wp:inline distT="0" distB="0" distL="0" distR="0" wp14:anchorId="5447F09E" wp14:editId="66E6B224">
             <wp:extent cx="2743200" cy="5936566"/>
             <wp:effectExtent l="0" t="0" r="0" b="0"/>
             <wp:docPr id="70604" name="Stage 15: Sign-Off Cleared"/>
@@ -22427,7 +21532,7 @@
         </w:rPr>
         <w:lastRenderedPageBreak/>
         <w:drawing>
-          <wp:inline distT="0" distB="0" distL="0" distR="0" wp14:anchorId="63C43855" wp14:editId="79B1EF8A">
+          <wp:inline distT="0" distB="0" distL="0" distR="0" wp14:anchorId="3B4CF9A0" wp14:editId="13115435">
             <wp:extent cx="2743200" cy="5936566"/>
             <wp:effectExtent l="0" t="0" r="0" b="0"/>
             <wp:docPr id="1280" name="Stage 16: Report Viewer + Delivery"/>
@@ -22476,13 +21581,7 @@
     </w:p>
     <w:p>
       <w:r>
-        <w:t xml:space="preserve">The production system builds the same product from scratch in a new codebase. The prototype defines WHAT to build; the production architecture defines HOW. Same AI-first UX, same scan-to-report flow, same mobile-first kiosk </w:t>
-      </w:r>
-      <w:r>
-        <w:t>—</w:t>
-      </w:r>
-      <w:r>
-        <w:t xml:space="preserve"> but with these production-grade additions:</w:t>
+        <w:t>The production system builds the same product from scratch in a new codebase. The prototype defines WHAT to build; the production architecture defines HOW. Same AI-first UX, same scan-to-report flow, same mobile-first kiosk — but with these production-grade additions:</w:t>
       </w:r>
     </w:p>
     <w:p>
@@ -22493,31 +21592,7 @@
         </w:numPr>
       </w:pPr>
       <w:r>
-        <w:t xml:space="preserve">Multi-center org hierarchy (Tenant </w:t>
-      </w:r>
-      <w:r>
-        <w:t>→</w:t>
-      </w:r>
-      <w:r>
-        <w:t xml:space="preserve"> Region </w:t>
-      </w:r>
-      <w:r>
-        <w:t>→</w:t>
-      </w:r>
-      <w:r>
-        <w:t xml:space="preserve"> Center </w:t>
-      </w:r>
-      <w:r>
-        <w:t>→</w:t>
-      </w:r>
-      <w:r>
-        <w:t xml:space="preserve"> Sub-center) vs prototype</w:t>
-      </w:r>
-      <w:r>
-        <w:t>’</w:t>
-      </w:r>
-      <w:r>
-        <w:t>s single-branch model.</w:t>
+        <w:t>Multi-center org hierarchy (Tenant → Region → Center → Sub-center) vs prototype’s single-branch model.</w:t>
       </w:r>
     </w:p>
     <w:p>
@@ -22528,13 +21603,7 @@
         </w:numPr>
       </w:pPr>
       <w:r>
-        <w:t>Full authorization model (4-tier RBAC + approval chains) vs prototype</w:t>
-      </w:r>
-      <w:r>
-        <w:t>’</w:t>
-      </w:r>
-      <w:r>
-        <w:t>s flat demo credentials.</w:t>
+        <w:t>Full authorization model (4-tier RBAC + approval chains) vs prototype’s flat demo credentials.</w:t>
       </w:r>
     </w:p>
     <w:p>
@@ -22546,13 +21615,7 @@
       </w:pPr>
       <w:r>
         <w:lastRenderedPageBreak/>
-        <w:t>Transaction-level tracking with main status + sub-status vs prototype</w:t>
-      </w:r>
-      <w:r>
-        <w:t>’</w:t>
-      </w:r>
-      <w:r>
-        <w:t>s simpler bill/sample/test states.</w:t>
+        <w:t>Transaction-level tracking with main status + sub-status vs prototype’s simpler bill/sample/test states.</w:t>
       </w:r>
     </w:p>
     <w:p>
@@ -22563,13 +21626,7 @@
         </w:numPr>
       </w:pPr>
       <w:r>
-        <w:t>Real WhatsApp Business API integration vs prototype</w:t>
-      </w:r>
-      <w:r>
-        <w:t>’</w:t>
-      </w:r>
-      <w:r>
-        <w:t>s stub delivery logs.</w:t>
+        <w:t>Real WhatsApp Business API integration vs prototype’s stub delivery logs.</w:t>
       </w:r>
     </w:p>
     <w:p>
@@ -22580,13 +21637,7 @@
         </w:numPr>
       </w:pPr>
       <w:r>
-        <w:t>Conversational AI voice assistant vs prototype</w:t>
-      </w:r>
-      <w:r>
-        <w:t>’</w:t>
-      </w:r>
-      <w:r>
-        <w:t>s per-field voice input buttons.</w:t>
+        <w:t>Conversational AI voice assistant vs prototype’s per-field voice input buttons.</w:t>
       </w:r>
     </w:p>
     <w:p>
@@ -22597,13 +21648,7 @@
         </w:numPr>
       </w:pPr>
       <w:r>
-        <w:t>In-app report viewer with action bar vs prototype</w:t>
-      </w:r>
-      <w:r>
-        <w:t>’</w:t>
-      </w:r>
-      <w:r>
-        <w:t>s direct PDF download.</w:t>
+        <w:t>In-app report viewer with action bar vs prototype’s direct PDF download.</w:t>
       </w:r>
     </w:p>
     <w:p>
@@ -22644,13 +21689,7 @@
     </w:p>
     <w:p>
       <w:r>
-        <w:t xml:space="preserve">Even when an agreed bill amount exists, allow an authorized role to apply a discount </w:t>
-      </w:r>
-      <w:r>
-        <w:t>—</w:t>
-      </w:r>
-      <w:r>
-        <w:t xml:space="preserve"> but only before report delivery. After delivery, discounts are locked at the API and UI layer.</w:t>
+        <w:t>Even when an agreed bill amount exists, allow an authorized role to apply a discount — but only before report delivery. After delivery, discounts are locked at the API and UI layer.</w:t>
       </w:r>
     </w:p>
     <w:p>
@@ -22704,13 +21743,7 @@
     </w:p>
     <w:p>
       <w:r>
-        <w:t xml:space="preserve">Support a discount-at-pickup path for hardship scenarios (example: </w:t>
-      </w:r>
-      <w:r>
-        <w:t>₹</w:t>
-      </w:r>
-      <w:r>
-        <w:t>450 still pending at report collection). Routed via the same approval workflow as any other override. The system must distinguish this from a standard discount.</w:t>
+        <w:t>Support a discount-at-pickup path for hardship scenarios (example: ₹450 still pending at report collection). Routed via the same approval workflow as any other override. The system must distinguish this from a standard discount.</w:t>
       </w:r>
     </w:p>
     <w:p>
@@ -22736,13 +21769,7 @@
     </w:p>
     <w:p>
       <w:r>
-        <w:t xml:space="preserve">Gate all permission checks, workflow locks, and automations on this rule </w:t>
-      </w:r>
-      <w:r>
-        <w:t>—</w:t>
-      </w:r>
-      <w:r>
-        <w:t xml:space="preserve"> not on payment completion alone. This is the single source of truth for when a bill transitions from amendable to locked.</w:t>
+        <w:t>Gate all permission checks, workflow locks, and automations on this rule — not on payment completion alone. This is the single source of truth for when a bill transitions from amendable to locked.</w:t>
       </w:r>
     </w:p>
     <w:p>
@@ -22778,13 +21805,7 @@
     </w:p>
     <w:p>
       <w:r>
-        <w:t xml:space="preserve">Assign a document_id (or transaction_id) per invoice. Treat each invoice as one transaction </w:t>
-      </w:r>
-      <w:r>
-        <w:t>—</w:t>
-      </w:r>
-      <w:r>
-        <w:t xml:space="preserve"> the canonical unit for end-to-end tracking, audits, and reporting.</w:t>
+        <w:t>Assign a document_id (or transaction_id) per invoice. Treat each invoice as one transaction — the canonical unit for end-to-end tracking, audits, and reporting.</w:t>
       </w:r>
     </w:p>
     <w:p>
@@ -22943,19 +21964,7 @@
     </w:p>
     <w:p>
       <w:r>
-        <w:t xml:space="preserve">Every captured document (prescription, bill, report) exposes its complete status flow </w:t>
-      </w:r>
-      <w:r>
-        <w:t>—</w:t>
-      </w:r>
-      <w:r>
-        <w:t xml:space="preserve"> payment state, sample state, report state, delivery state </w:t>
-      </w:r>
-      <w:r>
-        <w:t>—</w:t>
-      </w:r>
-      <w:r>
-        <w:t xml:space="preserve"> in one consolidated timeline per transaction.</w:t>
+        <w:t>Every captured document (prescription, bill, report) exposes its complete status flow — payment state, sample state, report state, delivery state — in one consolidated timeline per transaction.</w:t>
       </w:r>
     </w:p>
     <w:p>
@@ -23087,13 +22096,7 @@
     </w:p>
     <w:p>
       <w:r>
-        <w:t xml:space="preserve">WhatsApp is a delivery channel for patient-facing communication only </w:t>
-      </w:r>
-      <w:r>
-        <w:t>—</w:t>
-      </w:r>
-      <w:r>
-        <w:t xml:space="preserve"> not internal staff comms.</w:t>
+        <w:t>WhatsApp is a delivery channel for patient-facing communication only — not internal staff comms.</w:t>
       </w:r>
     </w:p>
     <w:p>
@@ -23149,13 +22152,7 @@
     </w:p>
     <w:p>
       <w:r>
-        <w:t xml:space="preserve">When a receptionist clicks Report, the default action opens a system-rendered report view </w:t>
-      </w:r>
-      <w:r>
-        <w:t>—</w:t>
-      </w:r>
-      <w:r>
-        <w:t xml:space="preserve"> not a PDF download. From that view:</w:t>
+        <w:t>When a receptionist clicks Report, the default action opens a system-rendered report view — not a PDF download. From that view:</w:t>
       </w:r>
     </w:p>
     <w:p>
@@ -23239,16 +22236,7 @@
     </w:p>
     <w:p>
       <w:r>
-        <w:t xml:space="preserve">Example: </w:t>
-      </w:r>
-      <w:r>
-        <w:t>“</w:t>
-      </w:r>
-      <w:r>
-        <w:t>Patient name is Ramesh Kumar, age 42, male, mobile 9876543210, referred by Dr. Mithlesh, CBC and lipid profile.</w:t>
-      </w:r>
-      <w:r>
-        <w:t>”</w:t>
+        <w:t>Example: “Patient name is Ramesh Kumar, age 42, male, mobile 9876543210, referred by Dr. Mithlesh, CBC and lipid profile.”</w:t>
       </w:r>
     </w:p>
     <w:p>
@@ -23265,13 +22253,7 @@
         <w:t xml:space="preserve">Receptionist: </w:t>
       </w:r>
       <w:r>
-        <w:t>“</w:t>
-      </w:r>
-      <w:r>
-        <w:t>Patient Ramesh Kumar, male, 42, mobile 9876543210, Dr. Mithlesh referred, CBC and lipid profile.</w:t>
-      </w:r>
-      <w:r>
-        <w:t>”</w:t>
+        <w:t>“Patient Ramesh Kumar, male, 42, mobile 9876543210, Dr. Mithlesh referred, CBC and lipid profile.”</w:t>
       </w:r>
     </w:p>
     <w:p>
@@ -23288,13 +22270,7 @@
         <w:t xml:space="preserve">Lab tech: </w:t>
       </w:r>
       <w:r>
-        <w:t>“</w:t>
-      </w:r>
-      <w:r>
-        <w:t>Pooja Jha CBC result 13.5, hemoglobin normal.</w:t>
-      </w:r>
-      <w:r>
-        <w:t>”</w:t>
+        <w:t>“Pooja Jha CBC result 13.5, hemoglobin normal.”</w:t>
       </w:r>
     </w:p>
     <w:p>
@@ -23311,13 +22287,7 @@
         <w:t xml:space="preserve">Pathologist: </w:t>
       </w:r>
       <w:r>
-        <w:t>“</w:t>
-      </w:r>
-      <w:r>
-        <w:t>Approve Pooja Jha CBC, comment looks normal.</w:t>
-      </w:r>
-      <w:r>
-        <w:t>”</w:t>
+        <w:t>“Approve Pooja Jha CBC, comment looks normal.”</w:t>
       </w:r>
     </w:p>
     <w:p>
@@ -23334,19 +22304,7 @@
         <w:t xml:space="preserve">Center head: </w:t>
       </w:r>
       <w:r>
-        <w:t>“</w:t>
-      </w:r>
-      <w:r>
-        <w:t>Show me today</w:t>
-      </w:r>
-      <w:r>
-        <w:t>’</w:t>
-      </w:r>
-      <w:r>
-        <w:t>s revenue and pending cases.</w:t>
-      </w:r>
-      <w:r>
-        <w:t>”</w:t>
+        <w:t>“Show me today’s revenue and pending cases.”</w:t>
       </w:r>
     </w:p>
     <w:p>
@@ -23357,25 +22315,7 @@
         </w:numPr>
       </w:pPr>
       <w:r>
-        <w:t xml:space="preserve">Speech-to-text </w:t>
-      </w:r>
-      <w:r>
-        <w:t>→</w:t>
-      </w:r>
-      <w:r>
-        <w:t xml:space="preserve"> LLM extracts structured fields </w:t>
-      </w:r>
-      <w:r>
-        <w:t>→</w:t>
-      </w:r>
-      <w:r>
-        <w:t xml:space="preserve"> populates form </w:t>
-      </w:r>
-      <w:r>
-        <w:t>→</w:t>
-      </w:r>
-      <w:r>
-        <w:t xml:space="preserve"> user confirms.</w:t>
+        <w:t>Speech-to-text → LLM extracts structured fields → populates form → user confirms.</w:t>
       </w:r>
     </w:p>
     <w:p>
@@ -23431,13 +22371,7 @@
     </w:p>
     <w:p>
       <w:r>
-        <w:t>Source: TimeFlow app (ntapp01-d432c.web.app) authorization flow analysis. Patterns cloned and extended for Medrelief</w:t>
-      </w:r>
-      <w:r>
-        <w:t>’</w:t>
-      </w:r>
-      <w:r>
-        <w:t>s multi-center diagnostic lab domain.</w:t>
+        <w:t>Source: TimeFlow app (ntapp01-d432c.web.app) authorization flow analysis. Patterns cloned and extended for Medrelief’s multi-center diagnostic lab domain.</w:t>
       </w:r>
     </w:p>
     <w:p>
@@ -23458,19 +22392,7 @@
         <w:rPr>
           <w:b/>
         </w:rPr>
-        <w:t xml:space="preserve">L0 </w:t>
-      </w:r>
-      <w:r>
-        <w:rPr>
-          <w:b/>
-        </w:rPr>
-        <w:t>—</w:t>
-      </w:r>
-      <w:r>
-        <w:rPr>
-          <w:b/>
-        </w:rPr>
-        <w:t xml:space="preserve"> Super Admin (Org-wide)</w:t>
+        <w:t>L0 — Super Admin (Org-wide)</w:t>
       </w:r>
     </w:p>
     <w:p>
@@ -23483,19 +22405,7 @@
         <w:rPr>
           <w:b/>
         </w:rPr>
-        <w:t xml:space="preserve">L1 </w:t>
-      </w:r>
-      <w:r>
-        <w:rPr>
-          <w:b/>
-        </w:rPr>
-        <w:t>—</w:t>
-      </w:r>
-      <w:r>
-        <w:rPr>
-          <w:b/>
-        </w:rPr>
-        <w:t xml:space="preserve"> Center Head (Assigned center(s))</w:t>
+        <w:t>L1 — Center Head (Assigned center(s))</w:t>
       </w:r>
     </w:p>
     <w:p>
@@ -23508,50 +22418,20 @@
         <w:rPr>
           <w:b/>
         </w:rPr>
-        <w:t xml:space="preserve">L2 </w:t>
-      </w:r>
-      <w:r>
-        <w:rPr>
-          <w:b/>
-        </w:rPr>
-        <w:t>—</w:t>
-      </w:r>
-      <w:r>
-        <w:rPr>
-          <w:b/>
-        </w:rPr>
-        <w:t xml:space="preserve"> Department Lead (Department within center)</w:t>
-      </w:r>
-    </w:p>
-    <w:p>
-      <w:r>
-        <w:t xml:space="preserve">Senior lab tech or senior receptionist. Review capability, shift oversight, escalation receiver. Optional tier </w:t>
-      </w:r>
-      <w:r>
-        <w:t>—</w:t>
-      </w:r>
-      <w:r>
-        <w:t xml:space="preserve"> skip if center is small.</w:t>
-      </w:r>
-    </w:p>
-    <w:p>
-      <w:r>
-        <w:rPr>
-          <w:b/>
-        </w:rPr>
-        <w:t xml:space="preserve">L3 </w:t>
-      </w:r>
-      <w:r>
-        <w:rPr>
-          <w:b/>
-        </w:rPr>
-        <w:t>—</w:t>
-      </w:r>
-      <w:r>
-        <w:rPr>
-          <w:b/>
-        </w:rPr>
-        <w:t xml:space="preserve"> Staff (Role-specific within center)</w:t>
+        <w:t>L2 — Department Lead (Department within center)</w:t>
+      </w:r>
+    </w:p>
+    <w:p>
+      <w:r>
+        <w:t>Senior lab tech or senior receptionist. Review capability, shift oversight, escalation receiver. Optional tier — skip if center is small.</w:t>
+      </w:r>
+    </w:p>
+    <w:p>
+      <w:r>
+        <w:rPr>
+          <w:b/>
+        </w:rPr>
+        <w:t>L3 — Staff (Role-specific within center)</w:t>
       </w:r>
     </w:p>
     <w:p>
@@ -23591,13 +22471,7 @@
         </w:numPr>
       </w:pPr>
       <w:r>
-        <w:t xml:space="preserve">Session-scoped switch </w:t>
-      </w:r>
-      <w:r>
-        <w:t>—</w:t>
-      </w:r>
-      <w:r>
-        <w:t xml:space="preserve"> no re-login required.</w:t>
+        <w:t>Session-scoped switch — no re-login required.</w:t>
       </w:r>
     </w:p>
     <w:p>
@@ -23644,7 +22518,7 @@
         </w:rPr>
         <w:lastRenderedPageBreak/>
         <w:drawing>
-          <wp:inline distT="0" distB="0" distL="0" distR="0" wp14:anchorId="3A3F7918" wp14:editId="30156037">
+          <wp:inline distT="0" distB="0" distL="0" distR="0" wp14:anchorId="1AD82A02" wp14:editId="71D03D67">
             <wp:extent cx="3200400" cy="6925993"/>
             <wp:effectExtent l="0" t="0" r="0" b="0"/>
             <wp:docPr id="7705" name="Login: Role Selection (Admin/Manager/Employee)"/>
@@ -23681,12 +22555,58 @@
     <w:p>
       <w:pPr>
         <w:jc w:val="center"/>
-      </w:pPr>
-      <w:r>
         <w:rPr>
           <w:b/>
           <w:sz w:val="20"/>
         </w:rPr>
+      </w:pPr>
+    </w:p>
+    <w:p>
+      <w:pPr>
+        <w:jc w:val="center"/>
+        <w:rPr>
+          <w:b/>
+          <w:sz w:val="20"/>
+        </w:rPr>
+      </w:pPr>
+    </w:p>
+    <w:p>
+      <w:pPr>
+        <w:jc w:val="center"/>
+        <w:rPr>
+          <w:b/>
+          <w:sz w:val="20"/>
+        </w:rPr>
+      </w:pPr>
+    </w:p>
+    <w:p>
+      <w:pPr>
+        <w:jc w:val="center"/>
+        <w:rPr>
+          <w:b/>
+          <w:sz w:val="20"/>
+        </w:rPr>
+      </w:pPr>
+    </w:p>
+    <w:p>
+      <w:pPr>
+        <w:jc w:val="center"/>
+        <w:rPr>
+          <w:b/>
+          <w:sz w:val="20"/>
+        </w:rPr>
+      </w:pPr>
+    </w:p>
+    <w:p>
+      <w:pPr>
+        <w:jc w:val="center"/>
+      </w:pPr>
+      <w:r>
+        <w:rPr>
+          <w:b/>
+          <w:sz w:val="20"/>
+        </w:rPr>
+        <w:lastRenderedPageBreak/>
         <w:t>Admin Profile: Role Switch Panel</w:t>
       </w:r>
     </w:p>
@@ -23698,9 +22618,8 @@
         <w:rPr>
           <w:noProof/>
         </w:rPr>
-        <w:lastRenderedPageBreak/>
         <w:drawing>
-          <wp:inline distT="0" distB="0" distL="0" distR="0" wp14:anchorId="3F18F74C" wp14:editId="3BD3E5DE">
+          <wp:inline distT="0" distB="0" distL="0" distR="0" wp14:anchorId="5CD09ED7" wp14:editId="4A6A72D9">
             <wp:extent cx="3200400" cy="6925993"/>
             <wp:effectExtent l="0" t="0" r="0" b="0"/>
             <wp:docPr id="22730" name="Admin Profile: Role Switch Panel"/>
@@ -23737,12 +22656,49 @@
     <w:p>
       <w:pPr>
         <w:jc w:val="center"/>
-      </w:pPr>
-      <w:r>
         <w:rPr>
           <w:b/>
           <w:sz w:val="20"/>
         </w:rPr>
+      </w:pPr>
+    </w:p>
+    <w:p>
+      <w:pPr>
+        <w:jc w:val="center"/>
+        <w:rPr>
+          <w:b/>
+          <w:sz w:val="20"/>
+        </w:rPr>
+      </w:pPr>
+    </w:p>
+    <w:p>
+      <w:pPr>
+        <w:jc w:val="center"/>
+        <w:rPr>
+          <w:b/>
+          <w:sz w:val="20"/>
+        </w:rPr>
+      </w:pPr>
+    </w:p>
+    <w:p>
+      <w:pPr>
+        <w:jc w:val="center"/>
+        <w:rPr>
+          <w:b/>
+          <w:sz w:val="20"/>
+        </w:rPr>
+      </w:pPr>
+    </w:p>
+    <w:p>
+      <w:pPr>
+        <w:jc w:val="center"/>
+      </w:pPr>
+      <w:r>
+        <w:rPr>
+          <w:b/>
+          <w:sz w:val="20"/>
+        </w:rPr>
+        <w:lastRenderedPageBreak/>
         <w:t>Admin Panel: Master Data Console</w:t>
       </w:r>
     </w:p>
@@ -23754,9 +22710,8 @@
         <w:rPr>
           <w:noProof/>
         </w:rPr>
-        <w:lastRenderedPageBreak/>
         <w:drawing>
-          <wp:inline distT="0" distB="0" distL="0" distR="0" wp14:anchorId="4B264586" wp14:editId="1645F149">
+          <wp:inline distT="0" distB="0" distL="0" distR="0" wp14:anchorId="70C4D961" wp14:editId="4AD44351">
             <wp:extent cx="3200400" cy="6925993"/>
             <wp:effectExtent l="0" t="0" r="0" b="0"/>
             <wp:docPr id="43261" name="Admin Panel: Master Data Console"/>
@@ -23793,12 +22748,49 @@
     <w:p>
       <w:pPr>
         <w:jc w:val="center"/>
-      </w:pPr>
-      <w:r>
         <w:rPr>
           <w:b/>
           <w:sz w:val="20"/>
         </w:rPr>
+      </w:pPr>
+    </w:p>
+    <w:p>
+      <w:pPr>
+        <w:jc w:val="center"/>
+        <w:rPr>
+          <w:b/>
+          <w:sz w:val="20"/>
+        </w:rPr>
+      </w:pPr>
+    </w:p>
+    <w:p>
+      <w:pPr>
+        <w:jc w:val="center"/>
+        <w:rPr>
+          <w:b/>
+          <w:sz w:val="20"/>
+        </w:rPr>
+      </w:pPr>
+    </w:p>
+    <w:p>
+      <w:pPr>
+        <w:jc w:val="center"/>
+        <w:rPr>
+          <w:b/>
+          <w:sz w:val="20"/>
+        </w:rPr>
+      </w:pPr>
+    </w:p>
+    <w:p>
+      <w:pPr>
+        <w:jc w:val="center"/>
+      </w:pPr>
+      <w:r>
+        <w:rPr>
+          <w:b/>
+          <w:sz w:val="20"/>
+        </w:rPr>
+        <w:lastRenderedPageBreak/>
         <w:t>Admin: Users List (Active 13 / Blocked 8)</w:t>
       </w:r>
     </w:p>
@@ -23810,9 +22802,8 @@
         <w:rPr>
           <w:noProof/>
         </w:rPr>
-        <w:lastRenderedPageBreak/>
         <w:drawing>
-          <wp:inline distT="0" distB="0" distL="0" distR="0" wp14:anchorId="14463B90" wp14:editId="6567C612">
+          <wp:inline distT="0" distB="0" distL="0" distR="0" wp14:anchorId="4C27559D" wp14:editId="1C0C440D">
             <wp:extent cx="3200400" cy="6925993"/>
             <wp:effectExtent l="0" t="0" r="0" b="0"/>
             <wp:docPr id="57180" name="Admin: Users List (Active 13 / Blocked 8)"/>
@@ -23849,12 +22840,49 @@
     <w:p>
       <w:pPr>
         <w:jc w:val="center"/>
-      </w:pPr>
-      <w:r>
         <w:rPr>
           <w:b/>
           <w:sz w:val="20"/>
         </w:rPr>
+      </w:pPr>
+    </w:p>
+    <w:p>
+      <w:pPr>
+        <w:jc w:val="center"/>
+        <w:rPr>
+          <w:b/>
+          <w:sz w:val="20"/>
+        </w:rPr>
+      </w:pPr>
+    </w:p>
+    <w:p>
+      <w:pPr>
+        <w:jc w:val="center"/>
+        <w:rPr>
+          <w:b/>
+          <w:sz w:val="20"/>
+        </w:rPr>
+      </w:pPr>
+    </w:p>
+    <w:p>
+      <w:pPr>
+        <w:jc w:val="center"/>
+        <w:rPr>
+          <w:b/>
+          <w:sz w:val="20"/>
+        </w:rPr>
+      </w:pPr>
+    </w:p>
+    <w:p>
+      <w:pPr>
+        <w:jc w:val="center"/>
+      </w:pPr>
+      <w:r>
+        <w:rPr>
+          <w:b/>
+          <w:sz w:val="20"/>
+        </w:rPr>
+        <w:lastRenderedPageBreak/>
         <w:t>Admin: User Detail (Role Toggle + Assigned Manager)</w:t>
       </w:r>
     </w:p>
@@ -23866,9 +22894,8 @@
         <w:rPr>
           <w:noProof/>
         </w:rPr>
-        <w:lastRenderedPageBreak/>
         <w:drawing>
-          <wp:inline distT="0" distB="0" distL="0" distR="0" wp14:anchorId="59269AAC" wp14:editId="3908952C">
+          <wp:inline distT="0" distB="0" distL="0" distR="0" wp14:anchorId="1D9B5C4C" wp14:editId="6C30A493">
             <wp:extent cx="3200400" cy="6925993"/>
             <wp:effectExtent l="0" t="0" r="0" b="0"/>
             <wp:docPr id="72046" name="Admin: User Detail (Role Toggle + Assigned Manager)"/>
@@ -23905,12 +22932,49 @@
     <w:p>
       <w:pPr>
         <w:jc w:val="center"/>
-      </w:pPr>
-      <w:r>
         <w:rPr>
           <w:b/>
           <w:sz w:val="20"/>
         </w:rPr>
+      </w:pPr>
+    </w:p>
+    <w:p>
+      <w:pPr>
+        <w:jc w:val="center"/>
+        <w:rPr>
+          <w:b/>
+          <w:sz w:val="20"/>
+        </w:rPr>
+      </w:pPr>
+    </w:p>
+    <w:p>
+      <w:pPr>
+        <w:jc w:val="center"/>
+        <w:rPr>
+          <w:b/>
+          <w:sz w:val="20"/>
+        </w:rPr>
+      </w:pPr>
+    </w:p>
+    <w:p>
+      <w:pPr>
+        <w:jc w:val="center"/>
+        <w:rPr>
+          <w:b/>
+          <w:sz w:val="20"/>
+        </w:rPr>
+      </w:pPr>
+    </w:p>
+    <w:p>
+      <w:pPr>
+        <w:jc w:val="center"/>
+      </w:pPr>
+      <w:r>
+        <w:rPr>
+          <w:b/>
+          <w:sz w:val="20"/>
+        </w:rPr>
+        <w:lastRenderedPageBreak/>
         <w:t>Admin: User Detail Expanded (Clients Assignment)</w:t>
       </w:r>
     </w:p>
@@ -23922,9 +22986,8 @@
         <w:rPr>
           <w:noProof/>
         </w:rPr>
-        <w:lastRenderedPageBreak/>
         <w:drawing>
-          <wp:inline distT="0" distB="0" distL="0" distR="0" wp14:anchorId="194F86EA" wp14:editId="1AF76EE4">
+          <wp:inline distT="0" distB="0" distL="0" distR="0" wp14:anchorId="21269ADC" wp14:editId="610F9C59">
             <wp:extent cx="3200400" cy="6925993"/>
             <wp:effectExtent l="0" t="0" r="0" b="0"/>
             <wp:docPr id="73856" name="Admin: User Detail Expanded (Clients Assignment)"/>
@@ -23961,12 +23024,49 @@
     <w:p>
       <w:pPr>
         <w:jc w:val="center"/>
-      </w:pPr>
-      <w:r>
         <w:rPr>
           <w:b/>
           <w:sz w:val="20"/>
         </w:rPr>
+      </w:pPr>
+    </w:p>
+    <w:p>
+      <w:pPr>
+        <w:jc w:val="center"/>
+        <w:rPr>
+          <w:b/>
+          <w:sz w:val="20"/>
+        </w:rPr>
+      </w:pPr>
+    </w:p>
+    <w:p>
+      <w:pPr>
+        <w:jc w:val="center"/>
+        <w:rPr>
+          <w:b/>
+          <w:sz w:val="20"/>
+        </w:rPr>
+      </w:pPr>
+    </w:p>
+    <w:p>
+      <w:pPr>
+        <w:jc w:val="center"/>
+        <w:rPr>
+          <w:b/>
+          <w:sz w:val="20"/>
+        </w:rPr>
+      </w:pPr>
+    </w:p>
+    <w:p>
+      <w:pPr>
+        <w:jc w:val="center"/>
+      </w:pPr>
+      <w:r>
+        <w:rPr>
+          <w:b/>
+          <w:sz w:val="20"/>
+        </w:rPr>
+        <w:lastRenderedPageBreak/>
         <w:t>Admin: User Clients + Activities Assignment</w:t>
       </w:r>
     </w:p>
@@ -23978,9 +23078,8 @@
         <w:rPr>
           <w:noProof/>
         </w:rPr>
-        <w:lastRenderedPageBreak/>
         <w:drawing>
-          <wp:inline distT="0" distB="0" distL="0" distR="0" wp14:anchorId="2165D6EE" wp14:editId="5AF3217B">
+          <wp:inline distT="0" distB="0" distL="0" distR="0" wp14:anchorId="2EEDE58A" wp14:editId="778BA57D">
             <wp:extent cx="3200400" cy="6925993"/>
             <wp:effectExtent l="0" t="0" r="0" b="0"/>
             <wp:docPr id="92475" name="Admin: User Clients + Activities Assignment"/>
@@ -24017,12 +23116,49 @@
     <w:p>
       <w:pPr>
         <w:jc w:val="center"/>
-      </w:pPr>
-      <w:r>
         <w:rPr>
           <w:b/>
           <w:sz w:val="20"/>
         </w:rPr>
+      </w:pPr>
+    </w:p>
+    <w:p>
+      <w:pPr>
+        <w:jc w:val="center"/>
+        <w:rPr>
+          <w:b/>
+          <w:sz w:val="20"/>
+        </w:rPr>
+      </w:pPr>
+    </w:p>
+    <w:p>
+      <w:pPr>
+        <w:jc w:val="center"/>
+        <w:rPr>
+          <w:b/>
+          <w:sz w:val="20"/>
+        </w:rPr>
+      </w:pPr>
+    </w:p>
+    <w:p>
+      <w:pPr>
+        <w:jc w:val="center"/>
+        <w:rPr>
+          <w:b/>
+          <w:sz w:val="20"/>
+        </w:rPr>
+      </w:pPr>
+    </w:p>
+    <w:p>
+      <w:pPr>
+        <w:jc w:val="center"/>
+      </w:pPr>
+      <w:r>
+        <w:rPr>
+          <w:b/>
+          <w:sz w:val="20"/>
+        </w:rPr>
+        <w:lastRenderedPageBreak/>
         <w:t>Notifications Panel (Role-Scoped)</w:t>
       </w:r>
     </w:p>
@@ -24034,9 +23170,8 @@
         <w:rPr>
           <w:noProof/>
         </w:rPr>
-        <w:lastRenderedPageBreak/>
         <w:drawing>
-          <wp:inline distT="0" distB="0" distL="0" distR="0" wp14:anchorId="3C584E4A" wp14:editId="22C04839">
+          <wp:inline distT="0" distB="0" distL="0" distR="0" wp14:anchorId="43589BC1" wp14:editId="395C11F5">
             <wp:extent cx="3200400" cy="6925993"/>
             <wp:effectExtent l="0" t="0" r="0" b="0"/>
             <wp:docPr id="67859" name="Notifications Panel (Role-Scoped)"/>
@@ -24073,12 +23208,49 @@
     <w:p>
       <w:pPr>
         <w:jc w:val="center"/>
-      </w:pPr>
-      <w:r>
         <w:rPr>
           <w:b/>
           <w:sz w:val="20"/>
         </w:rPr>
+      </w:pPr>
+    </w:p>
+    <w:p>
+      <w:pPr>
+        <w:jc w:val="center"/>
+        <w:rPr>
+          <w:b/>
+          <w:sz w:val="20"/>
+        </w:rPr>
+      </w:pPr>
+    </w:p>
+    <w:p>
+      <w:pPr>
+        <w:jc w:val="center"/>
+        <w:rPr>
+          <w:b/>
+          <w:sz w:val="20"/>
+        </w:rPr>
+      </w:pPr>
+    </w:p>
+    <w:p>
+      <w:pPr>
+        <w:jc w:val="center"/>
+        <w:rPr>
+          <w:b/>
+          <w:sz w:val="20"/>
+        </w:rPr>
+      </w:pPr>
+    </w:p>
+    <w:p>
+      <w:pPr>
+        <w:jc w:val="center"/>
+      </w:pPr>
+      <w:r>
+        <w:rPr>
+          <w:b/>
+          <w:sz w:val="20"/>
+        </w:rPr>
+        <w:lastRenderedPageBreak/>
         <w:t>Manager View: Timesheets (team review)</w:t>
       </w:r>
     </w:p>
@@ -24090,9 +23262,8 @@
         <w:rPr>
           <w:noProof/>
         </w:rPr>
-        <w:lastRenderedPageBreak/>
         <w:drawing>
-          <wp:inline distT="0" distB="0" distL="0" distR="0" wp14:anchorId="459F764B" wp14:editId="1189EEF2">
+          <wp:inline distT="0" distB="0" distL="0" distR="0" wp14:anchorId="1C29AB7D" wp14:editId="05A498D4">
             <wp:extent cx="3200400" cy="6925993"/>
             <wp:effectExtent l="0" t="0" r="0" b="0"/>
             <wp:docPr id="74165" name="Manager View: Timesheets (team review)"/>
@@ -24129,26 +23300,70 @@
     <w:p>
       <w:pPr>
         <w:jc w:val="center"/>
-      </w:pPr>
-      <w:r>
         <w:rPr>
           <w:b/>
           <w:sz w:val="20"/>
         </w:rPr>
+      </w:pPr>
+    </w:p>
+    <w:p>
+      <w:pPr>
+        <w:jc w:val="center"/>
+        <w:rPr>
+          <w:b/>
+          <w:sz w:val="20"/>
+        </w:rPr>
+      </w:pPr>
+    </w:p>
+    <w:p>
+      <w:pPr>
+        <w:jc w:val="center"/>
+        <w:rPr>
+          <w:b/>
+          <w:sz w:val="20"/>
+        </w:rPr>
+      </w:pPr>
+    </w:p>
+    <w:p>
+      <w:pPr>
+        <w:jc w:val="center"/>
+        <w:rPr>
+          <w:b/>
+          <w:sz w:val="20"/>
+        </w:rPr>
+      </w:pPr>
+    </w:p>
+    <w:p>
+      <w:pPr>
+        <w:jc w:val="center"/>
+      </w:pPr>
+      <w:r>
+        <w:rPr>
+          <w:b/>
+          <w:sz w:val="20"/>
+        </w:rPr>
+        <w:lastRenderedPageBreak/>
         <w:t>Manager Profile Badge (no Admin tab)</w:t>
       </w:r>
     </w:p>
     <w:p>
       <w:pPr>
         <w:jc w:val="center"/>
-      </w:pPr>
-      <w:r>
         <w:rPr>
           <w:noProof/>
         </w:rPr>
-        <w:lastRenderedPageBreak/>
+      </w:pPr>
+    </w:p>
+    <w:p>
+      <w:pPr>
+        <w:jc w:val="center"/>
+      </w:pPr>
+      <w:r>
+        <w:rPr>
+          <w:noProof/>
+        </w:rPr>
         <w:drawing>
-          <wp:inline distT="0" distB="0" distL="0" distR="0" wp14:anchorId="73A06944" wp14:editId="6BF34E1C">
+          <wp:inline distT="0" distB="0" distL="0" distR="0" wp14:anchorId="1687BC42" wp14:editId="704DEF23">
             <wp:extent cx="3200400" cy="6925993"/>
             <wp:effectExtent l="0" t="0" r="0" b="0"/>
             <wp:docPr id="31056" name="Manager Profile Badge (no Admin tab)"/>
@@ -24185,12 +23400,40 @@
     <w:p>
       <w:pPr>
         <w:jc w:val="center"/>
-      </w:pPr>
-      <w:r>
         <w:rPr>
           <w:b/>
           <w:sz w:val="20"/>
         </w:rPr>
+      </w:pPr>
+    </w:p>
+    <w:p>
+      <w:pPr>
+        <w:jc w:val="center"/>
+        <w:rPr>
+          <w:b/>
+          <w:sz w:val="20"/>
+        </w:rPr>
+      </w:pPr>
+    </w:p>
+    <w:p>
+      <w:pPr>
+        <w:jc w:val="center"/>
+        <w:rPr>
+          <w:b/>
+          <w:sz w:val="20"/>
+        </w:rPr>
+      </w:pPr>
+    </w:p>
+    <w:p>
+      <w:pPr>
+        <w:jc w:val="center"/>
+      </w:pPr>
+      <w:r>
+        <w:rPr>
+          <w:b/>
+          <w:sz w:val="20"/>
+        </w:rPr>
+        <w:lastRenderedPageBreak/>
         <w:t>Employee View: Own Timesheets Only</w:t>
       </w:r>
     </w:p>
@@ -24202,9 +23445,8 @@
         <w:rPr>
           <w:noProof/>
         </w:rPr>
-        <w:lastRenderedPageBreak/>
         <w:drawing>
-          <wp:inline distT="0" distB="0" distL="0" distR="0" wp14:anchorId="7008847A" wp14:editId="11CF235A">
+          <wp:inline distT="0" distB="0" distL="0" distR="0" wp14:anchorId="78DC16A2" wp14:editId="2E5D4E0C">
             <wp:extent cx="3200400" cy="6925993"/>
             <wp:effectExtent l="0" t="0" r="0" b="0"/>
             <wp:docPr id="60542" name="Employee View: Own Timesheets Only"/>
@@ -24241,12 +23483,49 @@
     <w:p>
       <w:pPr>
         <w:jc w:val="center"/>
-      </w:pPr>
-      <w:r>
         <w:rPr>
           <w:b/>
           <w:sz w:val="20"/>
         </w:rPr>
+      </w:pPr>
+    </w:p>
+    <w:p>
+      <w:pPr>
+        <w:jc w:val="center"/>
+        <w:rPr>
+          <w:b/>
+          <w:sz w:val="20"/>
+        </w:rPr>
+      </w:pPr>
+    </w:p>
+    <w:p>
+      <w:pPr>
+        <w:jc w:val="center"/>
+        <w:rPr>
+          <w:b/>
+          <w:sz w:val="20"/>
+        </w:rPr>
+      </w:pPr>
+    </w:p>
+    <w:p>
+      <w:pPr>
+        <w:jc w:val="center"/>
+        <w:rPr>
+          <w:b/>
+          <w:sz w:val="20"/>
+        </w:rPr>
+      </w:pPr>
+    </w:p>
+    <w:p>
+      <w:pPr>
+        <w:jc w:val="center"/>
+      </w:pPr>
+      <w:r>
+        <w:rPr>
+          <w:b/>
+          <w:sz w:val="20"/>
+        </w:rPr>
+        <w:lastRenderedPageBreak/>
         <w:t>Employee Profile Badge</w:t>
       </w:r>
     </w:p>
@@ -24258,9 +23537,8 @@
         <w:rPr>
           <w:noProof/>
         </w:rPr>
-        <w:lastRenderedPageBreak/>
         <w:drawing>
-          <wp:inline distT="0" distB="0" distL="0" distR="0" wp14:anchorId="528BDDE1" wp14:editId="5ACBE4B1">
+          <wp:inline distT="0" distB="0" distL="0" distR="0" wp14:anchorId="4C87EC50" wp14:editId="15819D9F">
             <wp:extent cx="3200400" cy="6925993"/>
             <wp:effectExtent l="0" t="0" r="0" b="0"/>
             <wp:docPr id="69882" name="Employee Profile Badge"/>
@@ -24297,12 +23575,49 @@
     <w:p>
       <w:pPr>
         <w:jc w:val="center"/>
-      </w:pPr>
-      <w:r>
         <w:rPr>
           <w:b/>
           <w:sz w:val="20"/>
         </w:rPr>
+      </w:pPr>
+    </w:p>
+    <w:p>
+      <w:pPr>
+        <w:jc w:val="center"/>
+        <w:rPr>
+          <w:b/>
+          <w:sz w:val="20"/>
+        </w:rPr>
+      </w:pPr>
+    </w:p>
+    <w:p>
+      <w:pPr>
+        <w:jc w:val="center"/>
+        <w:rPr>
+          <w:b/>
+          <w:sz w:val="20"/>
+        </w:rPr>
+      </w:pPr>
+    </w:p>
+    <w:p>
+      <w:pPr>
+        <w:jc w:val="center"/>
+        <w:rPr>
+          <w:b/>
+          <w:sz w:val="20"/>
+        </w:rPr>
+      </w:pPr>
+    </w:p>
+    <w:p>
+      <w:pPr>
+        <w:jc w:val="center"/>
+      </w:pPr>
+      <w:r>
+        <w:rPr>
+          <w:b/>
+          <w:sz w:val="20"/>
+        </w:rPr>
+        <w:lastRenderedPageBreak/>
         <w:t>Admin View: All Users Timesheets</w:t>
       </w:r>
     </w:p>
@@ -24314,9 +23629,8 @@
         <w:rPr>
           <w:noProof/>
         </w:rPr>
-        <w:lastRenderedPageBreak/>
         <w:drawing>
-          <wp:inline distT="0" distB="0" distL="0" distR="0" wp14:anchorId="5B113FFA" wp14:editId="3FD04651">
+          <wp:inline distT="0" distB="0" distL="0" distR="0" wp14:anchorId="28888719" wp14:editId="18B3959D">
             <wp:extent cx="3200400" cy="6925993"/>
             <wp:effectExtent l="0" t="0" r="0" b="0"/>
             <wp:docPr id="86732" name="Admin View: All Users Timesheets"/>
@@ -24373,58 +23687,28 @@
     </w:p>
     <w:p>
       <w:r>
-        <w:t xml:space="preserve">  </w:t>
-      </w:r>
-      <w:r>
-        <w:t>└</w:t>
-      </w:r>
-      <w:r>
-        <w:t xml:space="preserve"> Region: Bihar (optional grouping layer for reporting)</w:t>
-      </w:r>
-    </w:p>
-    <w:p>
-      <w:r>
-        <w:t xml:space="preserve">    </w:t>
-      </w:r>
-      <w:r>
-        <w:t>└</w:t>
-      </w:r>
-      <w:r>
-        <w:t xml:space="preserve"> Center: Bihar Sharif Main Lab</w:t>
+        <w:t xml:space="preserve">  └ Region: Bihar (optional grouping layer for reporting)</w:t>
       </w:r>
     </w:p>
     <w:p>
       <w:r>
         <w:lastRenderedPageBreak/>
-        <w:t xml:space="preserve">      </w:t>
-      </w:r>
-      <w:r>
-        <w:t>└</w:t>
-      </w:r>
-      <w:r>
-        <w:t xml:space="preserve"> Sub-center: Bihar Sharif Collection Point A, B</w:t>
-      </w:r>
-    </w:p>
-    <w:p>
-      <w:r>
-        <w:t xml:space="preserve">    </w:t>
-      </w:r>
-      <w:r>
-        <w:t>└</w:t>
-      </w:r>
-      <w:r>
-        <w:t xml:space="preserve"> Center: Madhubani Main Lab</w:t>
-      </w:r>
-    </w:p>
-    <w:p>
-      <w:r>
-        <w:t xml:space="preserve">      </w:t>
-      </w:r>
-      <w:r>
-        <w:t>└</w:t>
-      </w:r>
-      <w:r>
-        <w:t xml:space="preserve"> Sub-center: Madhubani Collection Point 1, 2</w:t>
+        <w:t xml:space="preserve">    └ Center: Bihar Sharif Main Lab</w:t>
+      </w:r>
+    </w:p>
+    <w:p>
+      <w:r>
+        <w:t xml:space="preserve">      └ Sub-center: Bihar Sharif Collection Point A, B</w:t>
+      </w:r>
+    </w:p>
+    <w:p>
+      <w:r>
+        <w:t xml:space="preserve">    └ Center: Madhubani Main Lab</w:t>
+      </w:r>
+    </w:p>
+    <w:p>
+      <w:r>
+        <w:t xml:space="preserve">      └ Sub-center: Madhubani Collection Point 1, 2</w:t>
       </w:r>
     </w:p>
     <w:p>
@@ -24530,13 +23814,7 @@
         </w:numPr>
       </w:pPr>
       <w:r>
-        <w:t xml:space="preserve">Request lifecycle: PENDING </w:t>
-      </w:r>
-      <w:r>
-        <w:t>→</w:t>
-      </w:r>
-      <w:r>
-        <w:t xml:space="preserve"> APPROVED | REJECTED | EXPIRED.</w:t>
+        <w:t>Request lifecycle: PENDING → APPROVED | REJECTED | EXPIRED.</w:t>
       </w:r>
     </w:p>
     <w:p>
@@ -24565,13 +23843,7 @@
     </w:p>
     <w:p>
       <w:r>
-        <w:t>Notifications triggered by domain events and routed by recipient</w:t>
-      </w:r>
-      <w:r>
-        <w:t>’</w:t>
-      </w:r>
-      <w:r>
-        <w:t>s role + center assignment:</w:t>
+        <w:t>Notifications triggered by domain events and routed by recipient’s role + center assignment:</w:t>
       </w:r>
     </w:p>
     <w:p>
@@ -24582,19 +23854,7 @@
         </w:numPr>
       </w:pPr>
       <w:r>
-        <w:t xml:space="preserve">Report ready for collection </w:t>
-      </w:r>
-      <w:r>
-        <w:t>→</w:t>
-      </w:r>
-      <w:r>
-        <w:t xml:space="preserve"> Receptionist (same center) </w:t>
-      </w:r>
-      <w:r>
-        <w:t>—</w:t>
-      </w:r>
-      <w:r>
-        <w:t xml:space="preserve"> in-app, normal priority.</w:t>
+        <w:t>Report ready for collection → Receptionist (same center) — in-app, normal priority.</w:t>
       </w:r>
     </w:p>
     <w:p>
@@ -24605,19 +23865,7 @@
         </w:numPr>
       </w:pPr>
       <w:r>
-        <w:t xml:space="preserve">New sample pending </w:t>
-      </w:r>
-      <w:r>
-        <w:t>→</w:t>
-      </w:r>
-      <w:r>
-        <w:t xml:space="preserve"> Lab Tech (same center, same dept) </w:t>
-      </w:r>
-      <w:r>
-        <w:t>—</w:t>
-      </w:r>
-      <w:r>
-        <w:t xml:space="preserve"> in-app, normal.</w:t>
+        <w:t>New sample pending → Lab Tech (same center, same dept) — in-app, normal.</w:t>
       </w:r>
     </w:p>
     <w:p>
@@ -24628,19 +23876,7 @@
         </w:numPr>
       </w:pPr>
       <w:r>
-        <w:t xml:space="preserve">Result awaiting sign-off </w:t>
-      </w:r>
-      <w:r>
-        <w:t>→</w:t>
-      </w:r>
-      <w:r>
-        <w:t xml:space="preserve"> Pathologist (same center) </w:t>
-      </w:r>
-      <w:r>
-        <w:t>—</w:t>
-      </w:r>
-      <w:r>
-        <w:t xml:space="preserve"> in-app + push, high.</w:t>
+        <w:t>Result awaiting sign-off → Pathologist (same center) — in-app + push, high.</w:t>
       </w:r>
     </w:p>
     <w:p>
@@ -24651,19 +23887,7 @@
         </w:numPr>
       </w:pPr>
       <w:r>
-        <w:t xml:space="preserve">Discount override requested </w:t>
-      </w:r>
-      <w:r>
-        <w:t>→</w:t>
-      </w:r>
-      <w:r>
-        <w:t xml:space="preserve"> Center Head (same center) </w:t>
-      </w:r>
-      <w:r>
-        <w:t>—</w:t>
-      </w:r>
-      <w:r>
-        <w:t xml:space="preserve"> in-app + WhatsApp, high.</w:t>
+        <w:t>Discount override requested → Center Head (same center) — in-app + WhatsApp, high.</w:t>
       </w:r>
     </w:p>
     <w:p>
@@ -24674,19 +23898,7 @@
         </w:numPr>
       </w:pPr>
       <w:r>
-        <w:t xml:space="preserve">Critical result flag </w:t>
-      </w:r>
-      <w:r>
-        <w:t>→</w:t>
-      </w:r>
-      <w:r>
-        <w:t xml:space="preserve"> Pathologist + Center Head </w:t>
-      </w:r>
-      <w:r>
-        <w:t>—</w:t>
-      </w:r>
-      <w:r>
-        <w:t xml:space="preserve"> in-app + WhatsApp + push, urgent.</w:t>
+        <w:t>Critical result flag → Pathologist + Center Head — in-app + WhatsApp + push, urgent.</w:t>
       </w:r>
     </w:p>
     <w:p>
@@ -24697,19 +23909,7 @@
         </w:numPr>
       </w:pPr>
       <w:r>
-        <w:t xml:space="preserve">Daily close pending (past 8 PM) </w:t>
-      </w:r>
-      <w:r>
-        <w:t>→</w:t>
-      </w:r>
-      <w:r>
-        <w:t xml:space="preserve"> Center Head + Finance </w:t>
-      </w:r>
-      <w:r>
-        <w:t>—</w:t>
-      </w:r>
-      <w:r>
-        <w:t xml:space="preserve"> in-app + WhatsApp, high.</w:t>
+        <w:t>Daily close pending (past 8 PM) → Center Head + Finance — in-app + WhatsApp, high.</w:t>
       </w:r>
     </w:p>
     <w:p>
@@ -24720,19 +23920,7 @@
         </w:numPr>
       </w:pPr>
       <w:r>
-        <w:t xml:space="preserve">Payment reconciliation mismatch </w:t>
-      </w:r>
-      <w:r>
-        <w:t>→</w:t>
-      </w:r>
-      <w:r>
-        <w:t xml:space="preserve"> Finance (same center) </w:t>
-      </w:r>
-      <w:r>
-        <w:t>—</w:t>
-      </w:r>
-      <w:r>
-        <w:t xml:space="preserve"> in-app, high.</w:t>
+        <w:t>Payment reconciliation mismatch → Finance (same center) — in-app, high.</w:t>
       </w:r>
     </w:p>
     <w:p>
@@ -24762,13 +23950,7 @@
       </w:pPr>
       <w:r>
         <w:lastRenderedPageBreak/>
-        <w:t xml:space="preserve">org_tenants, org_regions, org_centers </w:t>
-      </w:r>
-      <w:r>
-        <w:t>—</w:t>
-      </w:r>
-      <w:r>
-        <w:t xml:space="preserve"> org hierarchy with center_type (MAIN_LAB | COLLECTION_POINT) and parent_center_id.</w:t>
+        <w:t>org_tenants, org_regions, org_centers — org hierarchy with center_type (MAIN_LAB | COLLECTION_POINT) and parent_center_id.</w:t>
       </w:r>
     </w:p>
     <w:p>
@@ -24779,19 +23961,7 @@
         </w:numPr>
       </w:pPr>
       <w:r>
-        <w:t xml:space="preserve">auth_roles </w:t>
-      </w:r>
-      <w:r>
-        <w:t>—</w:t>
-      </w:r>
-      <w:r>
-        <w:t xml:space="preserve"> tenant-scoped, level (0</w:t>
-      </w:r>
-      <w:r>
-        <w:t>–</w:t>
-      </w:r>
-      <w:r>
-        <w:t>3), permissions JSONB, is_system flag.</w:t>
+        <w:t>auth_roles — tenant-scoped, level (0–3), permissions JSONB, is_system flag.</w:t>
       </w:r>
     </w:p>
     <w:p>
@@ -24802,25 +23972,7 @@
         </w:numPr>
       </w:pPr>
       <w:r>
-        <w:t xml:space="preserve">auth_user_assignments </w:t>
-      </w:r>
-      <w:r>
-        <w:t>—</w:t>
-      </w:r>
-      <w:r>
-        <w:t xml:space="preserve"> many-to-many-to-many: user </w:t>
-      </w:r>
-      <w:r>
-        <w:t>↔</w:t>
-      </w:r>
-      <w:r>
-        <w:t xml:space="preserve"> role </w:t>
-      </w:r>
-      <w:r>
-        <w:t>↔</w:t>
-      </w:r>
-      <w:r>
-        <w:t xml:space="preserve"> center. is_primary for default login role.</w:t>
+        <w:t>auth_user_assignments — many-to-many-to-many: user ↔ role ↔ center. is_primary for default login role.</w:t>
       </w:r>
     </w:p>
     <w:p>
@@ -24831,13 +23983,7 @@
         </w:numPr>
       </w:pPr>
       <w:r>
-        <w:t xml:space="preserve">approval_chains, approval_requests, approval_decisions </w:t>
-      </w:r>
-      <w:r>
-        <w:t>—</w:t>
-      </w:r>
-      <w:r>
-        <w:t xml:space="preserve"> configurable multi-step approval.</w:t>
+        <w:t>approval_chains, approval_requests, approval_decisions — configurable multi-step approval.</w:t>
       </w:r>
     </w:p>
     <w:p>
@@ -24848,13 +23994,7 @@
         </w:numPr>
       </w:pPr>
       <w:r>
-        <w:t xml:space="preserve">notifications </w:t>
-      </w:r>
-      <w:r>
-        <w:t>—</w:t>
-      </w:r>
-      <w:r>
-        <w:t xml:space="preserve"> role-scoped, multi-channel (IN_APP, WHATSAPP, EMAIL, PUSH), priority levels, read/dismiss.</w:t>
+        <w:t>notifications — role-scoped, multi-channel (IN_APP, WHATSAPP, EMAIL, PUSH), priority levels, read/dismiss.</w:t>
       </w:r>
     </w:p>
     <w:p>
@@ -24907,13 +24047,7 @@
         </w:numPr>
       </w:pPr>
       <w:r>
-        <w:t xml:space="preserve">Who initiates override discount at report collection? Who approves? (receptionist </w:t>
-      </w:r>
-      <w:r>
-        <w:t>→</w:t>
-      </w:r>
-      <w:r>
-        <w:t xml:space="preserve"> center head likely).</w:t>
+        <w:t>Who initiates override discount at report collection? Who approves? (receptionist → center head likely).</w:t>
       </w:r>
     </w:p>
     <w:p>
@@ -25036,25 +24170,7 @@
         </w:numPr>
       </w:pPr>
       <w:r>
-        <w:t xml:space="preserve">Draft override-discount-at-pickup workflow: trigger </w:t>
-      </w:r>
-      <w:r>
-        <w:t>→</w:t>
-      </w:r>
-      <w:r>
-        <w:t xml:space="preserve"> approval </w:t>
-      </w:r>
-      <w:r>
-        <w:t>→</w:t>
-      </w:r>
-      <w:r>
-        <w:t xml:space="preserve"> apply </w:t>
-      </w:r>
-      <w:r>
-        <w:t>→</w:t>
-      </w:r>
-      <w:r>
-        <w:t xml:space="preserve"> audit.</w:t>
+        <w:t>Draft override-discount-at-pickup workflow: trigger → approval → apply → audit.</w:t>
       </w:r>
     </w:p>
     <w:p>
@@ -25098,19 +24214,7 @@
         </w:numPr>
       </w:pPr>
       <w:r>
-        <w:t xml:space="preserve">Build notification system (domain events </w:t>
-      </w:r>
-      <w:r>
-        <w:t>→</w:t>
-      </w:r>
-      <w:r>
-        <w:t xml:space="preserve"> routing rules </w:t>
-      </w:r>
-      <w:r>
-        <w:t>→</w:t>
-      </w:r>
-      <w:r>
-        <w:t xml:space="preserve"> multi-channel delivery).</w:t>
+        <w:t>Build notification system (domain events → routing rules → multi-channel delivery).</w:t>
       </w:r>
     </w:p>
     <w:p>
@@ -25167,19 +24271,7 @@
         </w:numPr>
       </w:pPr>
       <w:r>
-        <w:t xml:space="preserve">v2.1 (original) </w:t>
-      </w:r>
-      <w:r>
-        <w:t>—</w:t>
-      </w:r>
-      <w:r>
-        <w:t xml:space="preserve"> Sections 1</w:t>
-      </w:r>
-      <w:r>
-        <w:t>–</w:t>
-      </w:r>
-      <w:r>
-        <w:t>14. Phase 1 LIMS, Billing, Basic Finance PRD.</w:t>
+        <w:t>v2.1 (original) — Sections 1–14. Phase 1 LIMS, Billing, Basic Finance PRD.</w:t>
       </w:r>
     </w:p>
     <w:p>
@@ -25190,19 +24282,7 @@
         </w:numPr>
       </w:pPr>
       <w:r>
-        <w:t xml:space="preserve">v3.0 (this version) </w:t>
-      </w:r>
-      <w:r>
-        <w:t>—</w:t>
-      </w:r>
-      <w:r>
-        <w:t xml:space="preserve"> Sections 15</w:t>
-      </w:r>
-      <w:r>
-        <w:t>–</w:t>
-      </w:r>
-      <w:r>
-        <w:t>20 added. Prototype learnings, production additions, authorization model, new features.</w:t>
+        <w:t>v3.0 (this version) — Sections 15–20 added. Prototype learnings, production additions, authorization model, new features.</w:t>
       </w:r>
     </w:p>
     <w:p>
@@ -25214,6 +24294,865 @@
       </w:pPr>
       <w:r>
         <w:t>Source files preserved intact: Medrelief_ERP_PRD_v2.1-Phase-1.docx, Medrelief-Prototype-Flow.docx, PROTOTYPE-FEEDBACK-ADDITIONS.md.</w:t>
+      </w:r>
+    </w:p>
+    <w:p>
+      <w:r>
+        <w:br w:type="page"/>
+      </w:r>
+    </w:p>
+    <w:p>
+      <w:pPr>
+        <w:spacing w:before="240" w:line="271" w:lineRule="auto"/>
+      </w:pPr>
+      <w:r>
+        <w:rPr>
+          <w:b/>
+          <w:sz w:val="42"/>
+        </w:rPr>
+        <w:lastRenderedPageBreak/>
+        <w:t>21. Decisions Log and Known Gaps</w:t>
+      </w:r>
+    </w:p>
+    <w:p>
+      <w:r>
+        <w:t>Added 17 April 2026 after critical review of PRD v3.0. This section logs binding decisions made during review and tracks known gaps that must be resolved before or during implementation. Production build should NOT begin work on items marked as open gaps until they are decided.</w:t>
+      </w:r>
+    </w:p>
+    <w:p>
+      <w:pPr>
+        <w:spacing w:before="240" w:line="271" w:lineRule="auto"/>
+      </w:pPr>
+      <w:r>
+        <w:rPr>
+          <w:rFonts w:eastAsia="Georgia" w:hAnsi="Georgia" w:cs="Georgia"/>
+          <w:b/>
+          <w:sz w:val="33"/>
+        </w:rPr>
+        <w:t>21.1 Decisions Locked (Binding)</w:t>
+      </w:r>
+    </w:p>
+    <w:p>
+      <w:pPr>
+        <w:spacing w:before="180" w:line="271" w:lineRule="auto"/>
+      </w:pPr>
+      <w:r>
+        <w:rPr>
+          <w:b/>
+          <w:sz w:val="28"/>
+        </w:rPr>
+        <w:t>DECISION-01: Registration Entry Point = Scan Prescription First</w:t>
+      </w:r>
+    </w:p>
+    <w:p>
+      <w:pPr>
+        <w:shd w:val="clear" w:color="auto" w:fill="E8F7E8"/>
+      </w:pPr>
+      <w:r>
+        <w:t>Primary CTA on New Visit screen is Scan Prescription. Mobile Search is secondary, visible but smaller. Falls back to mobile search when prescription capture is skipped or AI confidence is low. This overrides PRD Section 7.1 Step 1 (which said search first).</w:t>
+      </w:r>
+    </w:p>
+    <w:p>
+      <w:pPr>
+        <w:numPr>
+          <w:ilvl w:val="0"/>
+          <w:numId w:val="41"/>
+        </w:numPr>
+      </w:pPr>
+      <w:r>
+        <w:t>Primary button: Scan Prescription (large, top).</w:t>
+      </w:r>
+    </w:p>
+    <w:p>
+      <w:pPr>
+        <w:numPr>
+          <w:ilvl w:val="0"/>
+          <w:numId w:val="41"/>
+        </w:numPr>
+      </w:pPr>
+      <w:r>
+        <w:t>Secondary button: Search by Mobile (smaller, below).</w:t>
+      </w:r>
+    </w:p>
+    <w:p>
+      <w:pPr>
+        <w:numPr>
+          <w:ilvl w:val="0"/>
+          <w:numId w:val="41"/>
+        </w:numPr>
+      </w:pPr>
+      <w:r>
+        <w:t>Fallback chain: Scan AI-fails -&gt; Manual Entry -&gt; Search by Mobile for existing patient dedup.</w:t>
+      </w:r>
+    </w:p>
+    <w:p>
+      <w:pPr>
+        <w:spacing w:before="180" w:line="271" w:lineRule="auto"/>
+      </w:pPr>
+      <w:r>
+        <w:rPr>
+          <w:b/>
+          <w:sz w:val="28"/>
+        </w:rPr>
+        <w:t>DECISION-02: Role Model = Super Admin + System Admin + 6 Personas</w:t>
+      </w:r>
+    </w:p>
+    <w:p>
+      <w:pPr>
+        <w:shd w:val="clear" w:color="auto" w:fill="E8F7E8"/>
+      </w:pPr>
+      <w:r>
+        <w:t>Super Admin and System Admin are separate roles with different scopes. This extends Section 5 and Section 19.1 rather than replacing them.</w:t>
+      </w:r>
+    </w:p>
+    <w:p>
+      <w:pPr>
+        <w:numPr>
+          <w:ilvl w:val="0"/>
+          <w:numId w:val="41"/>
+        </w:numPr>
+      </w:pPr>
+      <w:r>
+        <w:t>Super Admin (Noshtek-wide): Future-proof for multi-tenant. One or two Noshtek employees only. Can manage any tenant's config.</w:t>
+      </w:r>
+    </w:p>
+    <w:p>
+      <w:pPr>
+        <w:numPr>
+          <w:ilvl w:val="0"/>
+          <w:numId w:val="41"/>
+        </w:numPr>
+      </w:pPr>
+      <w:r>
+        <w:t>System Admin (Medrelief tenant-scoped): Manages Medrelief tenant config, users across all centers, rate plan templates, MDM.</w:t>
+      </w:r>
+    </w:p>
+    <w:p>
+      <w:pPr>
+        <w:numPr>
+          <w:ilvl w:val="0"/>
+          <w:numId w:val="41"/>
+        </w:numPr>
+      </w:pPr>
+      <w:r>
+        <w:t>Center Head (assigned centers): Operational authority within their assigned center(s).</w:t>
+      </w:r>
+    </w:p>
+    <w:p>
+      <w:pPr>
+        <w:numPr>
+          <w:ilvl w:val="0"/>
+          <w:numId w:val="41"/>
+        </w:numPr>
+      </w:pPr>
+      <w:r>
+        <w:t>6 original personas (Receptionist, Phlebotomist, Lab Tech, Pathologist, Finance Manager, and Center Head) remain. These are L2/L3 roles in the new hierarchy.</w:t>
+      </w:r>
+    </w:p>
+    <w:p>
+      <w:pPr>
+        <w:numPr>
+          <w:ilvl w:val="0"/>
+          <w:numId w:val="41"/>
+        </w:numPr>
+      </w:pPr>
+      <w:r>
+        <w:t>Department Lead (L2) stays optional per Section 19.1 - enable per center.</w:t>
+      </w:r>
+    </w:p>
+    <w:p>
+      <w:pPr>
+        <w:spacing w:before="180" w:line="271" w:lineRule="auto"/>
+      </w:pPr>
+      <w:r>
+        <w:rPr>
+          <w:b/>
+          <w:sz w:val="28"/>
+        </w:rPr>
+        <w:t>DECISION-03: Status Model = Main + Sub-Status (recommended default)</w:t>
+      </w:r>
+    </w:p>
+    <w:p>
+      <w:pPr>
+        <w:shd w:val="clear" w:color="auto" w:fill="E8F7E8"/>
+      </w:pPr>
+      <w:r>
+        <w:t>Status decision deferred by stakeholder during review. Implementation default: keep original enums as main_status, add sub_status column for the new taxonomy. Revisit after 2 weeks of production data.</w:t>
+      </w:r>
+    </w:p>
+    <w:p>
+      <w:pPr>
+        <w:numPr>
+          <w:ilvl w:val="0"/>
+          <w:numId w:val="41"/>
+        </w:numPr>
+      </w:pPr>
+      <w:r>
+        <w:t>billing_bills.bill_status remains: DRAFT, PENDING_PAYMENT, PARTIALLY_PAID, PAID, CANCELLED, REFUNDED.</w:t>
+      </w:r>
+    </w:p>
+    <w:p>
+      <w:pPr>
+        <w:numPr>
+          <w:ilvl w:val="0"/>
+          <w:numId w:val="41"/>
+        </w:numPr>
+      </w:pPr>
+      <w:r>
+        <w:t>billing_bills.payment_sub_status (new): PAYMENT_IN_PROGRESS, PARTIAL_PAYMENT, FULL_PAYMENT, REFUND_IN_PROGRESS, REFUNDED, WRITTEN_OFF.</w:t>
+      </w:r>
+    </w:p>
+    <w:p>
+      <w:pPr>
+        <w:numPr>
+          <w:ilvl w:val="0"/>
+          <w:numId w:val="41"/>
+        </w:numPr>
+      </w:pPr>
+      <w:r>
+        <w:lastRenderedPageBreak/>
+        <w:t>lims_reports.report_status remains: GENERATED, SIGNED_OFF, AMENDED.</w:t>
+      </w:r>
+    </w:p>
+    <w:p>
+      <w:pPr>
+        <w:numPr>
+          <w:ilvl w:val="0"/>
+          <w:numId w:val="41"/>
+        </w:numPr>
+      </w:pPr>
+      <w:r>
+        <w:t>lims_reports.delivery_sub_status (new): REPORT_COLLECTED, REPORT_DELIVERED, REPORT_SENT_WHATSAPP, REPORT_SENT_EMAIL, REPORT_SENT_SMS, REPORT_DELIVERY_FAILED.</w:t>
+      </w:r>
+    </w:p>
+    <w:p>
+      <w:pPr>
+        <w:numPr>
+          <w:ilvl w:val="0"/>
+          <w:numId w:val="41"/>
+        </w:numPr>
+      </w:pPr>
+      <w:r>
+        <w:t>Main status transitions trigger domain events. Sub-status transitions are operational and do not emit events.</w:t>
+      </w:r>
+    </w:p>
+    <w:p>
+      <w:pPr>
+        <w:spacing w:before="180" w:line="271" w:lineRule="auto"/>
+      </w:pPr>
+      <w:r>
+        <w:rPr>
+          <w:b/>
+          <w:sz w:val="28"/>
+        </w:rPr>
+        <w:t>DECISION-04: Settlement Rule = On Report Delivered (recommended default)</w:t>
+      </w:r>
+    </w:p>
+    <w:p>
+      <w:pPr>
+        <w:shd w:val="clear" w:color="auto" w:fill="E8F7E8"/>
+      </w:pPr>
+      <w:r>
+        <w:t>Settlement decision deferred by stakeholder. Implementation default: bill is locked from edits only when report is delivered, not when payment completes. Enables discount-at-pickup scenario. Revisit after ops feedback from rollout.</w:t>
+      </w:r>
+    </w:p>
+    <w:p>
+      <w:pPr>
+        <w:numPr>
+          <w:ilvl w:val="0"/>
+          <w:numId w:val="41"/>
+        </w:numPr>
+      </w:pPr>
+      <w:r>
+        <w:t>Add to billing_bills: is_settled BOOLEAN DEFAULT false, settled_at TIMESTAMPTZ NULL.</w:t>
+      </w:r>
+    </w:p>
+    <w:p>
+      <w:pPr>
+        <w:numPr>
+          <w:ilvl w:val="0"/>
+          <w:numId w:val="41"/>
+        </w:numPr>
+      </w:pPr>
+      <w:r>
+        <w:t>is_settled flips to true when lims_reports.delivery_sub_status transitions to REPORT_DELIVERED (or any successful channel dispatch).</w:t>
+      </w:r>
+    </w:p>
+    <w:p>
+      <w:pPr>
+        <w:numPr>
+          <w:ilvl w:val="0"/>
+          <w:numId w:val="41"/>
+        </w:numPr>
+      </w:pPr>
+      <w:r>
+        <w:t>UI rule: show Apply Discount action only when is_settled = false AND bill_status IN (PAID, PARTIALLY_PAID).</w:t>
+      </w:r>
+    </w:p>
+    <w:p>
+      <w:pPr>
+        <w:numPr>
+          <w:ilvl w:val="0"/>
+          <w:numId w:val="41"/>
+        </w:numPr>
+      </w:pPr>
+      <w:r>
+        <w:t>API rule: reject discount endpoint with 422 when is_settled = true. Return BILL_ALREADY_SETTLED error_code.</w:t>
+      </w:r>
+    </w:p>
+    <w:p>
+      <w:pPr>
+        <w:spacing w:before="240" w:line="271" w:lineRule="auto"/>
+      </w:pPr>
+      <w:r>
+        <w:rPr>
+          <w:rFonts w:eastAsia="Georgia" w:hAnsi="Georgia" w:cs="Georgia"/>
+          <w:b/>
+          <w:sz w:val="33"/>
+        </w:rPr>
+        <w:t>21.2 Known Gaps - Must Resolve Before Code</w:t>
+      </w:r>
+    </w:p>
+    <w:p>
+      <w:pPr>
+        <w:spacing w:before="180" w:line="271" w:lineRule="auto"/>
+      </w:pPr>
+      <w:r>
+        <w:rPr>
+          <w:b/>
+          <w:sz w:val="28"/>
+        </w:rPr>
+        <w:t>GAP-01: mdm_branches vs org_centers Relationship</w:t>
+      </w:r>
+    </w:p>
+    <w:p>
+      <w:pPr>
+        <w:shd w:val="clear" w:color="auto" w:fill="FFF4E5"/>
+      </w:pPr>
+      <w:r>
+        <w:t>Section 3.1 uses mdm_branches with branch_id on every transactional table. Section 19 introduces org_centers, org_regions, org_tenants. Both cannot coexist without conflict.</w:t>
+      </w:r>
+    </w:p>
+    <w:p>
+      <w:pPr>
+        <w:numPr>
+          <w:ilvl w:val="0"/>
+          <w:numId w:val="41"/>
+        </w:numPr>
+      </w:pPr>
+      <w:r>
+        <w:t>Recommendation: org_centers replaces mdm_branches. Rename branch_id to center_id everywhere. Provide migration SQL.</w:t>
+      </w:r>
+    </w:p>
+    <w:p>
+      <w:pPr>
+        <w:numPr>
+          <w:ilvl w:val="0"/>
+          <w:numId w:val="41"/>
+        </w:numPr>
+      </w:pPr>
+      <w:r>
+        <w:t>Sub-centers (collection points) get their own center_id but parent_center_id points to the main lab. Samples accessioned against parent center.</w:t>
+      </w:r>
+    </w:p>
+    <w:p>
+      <w:pPr>
+        <w:numPr>
+          <w:ilvl w:val="0"/>
+          <w:numId w:val="41"/>
+        </w:numPr>
+      </w:pPr>
+      <w:r>
+        <w:t>Before implementation: confirm with stakeholder that mdm_branches is retired and center_id is the canonical foreign key.</w:t>
+      </w:r>
+    </w:p>
+    <w:p>
+      <w:pPr>
+        <w:spacing w:before="180" w:line="271" w:lineRule="auto"/>
+      </w:pPr>
+      <w:r>
+        <w:rPr>
+          <w:b/>
+          <w:sz w:val="28"/>
+        </w:rPr>
+        <w:t>DECISION-05: WhatsApp Scope = Patient-Facing Only</w:t>
+      </w:r>
+    </w:p>
+    <w:p>
+      <w:pPr>
+        <w:shd w:val="clear" w:color="auto" w:fill="FFF4E5"/>
+      </w:pPr>
+      <w:r>
+        <w:t>Resolved 17 April 2026. WhatsApp Business API is patient-facing only. Internal staff notifications use in-app push only for Phase 1. SMS and email escalation paths are deferred to Phase 1.5 or later based on operational feedback. Sections 18.1 and 19.5 are amended accordingly.</w:t>
+      </w:r>
+    </w:p>
+    <w:p>
+      <w:pPr>
+        <w:numPr>
+          <w:ilvl w:val="0"/>
+          <w:numId w:val="41"/>
+        </w:numPr>
+      </w:pPr>
+      <w:r>
+        <w:t>WhatsApp is for patient-facing communication only: report delivery, appointment reminders, payment receipts. Meta Cloud API direct or via provider (Gupshup/AiSensy/WATI, provider TBD per GAP-05 in 21.3).</w:t>
+      </w:r>
+    </w:p>
+    <w:p>
+      <w:pPr>
+        <w:numPr>
+          <w:ilvl w:val="0"/>
+          <w:numId w:val="41"/>
+        </w:numPr>
+      </w:pPr>
+      <w:r>
+        <w:t>Internal urgent alerts (discount override, critical result, reconciliation mismatch, daily close pending) use in-app push only for Phase 1.</w:t>
+      </w:r>
+    </w:p>
+    <w:p>
+      <w:pPr>
+        <w:numPr>
+          <w:ilvl w:val="0"/>
+          <w:numId w:val="41"/>
+        </w:numPr>
+      </w:pPr>
+      <w:r>
+        <w:t>Section 18.1 notification channels simplified to: in-app push only for internal staff. WhatsApp removed from internal comms. SMS and email defer to later phase.</w:t>
+      </w:r>
+    </w:p>
+    <w:p>
+      <w:pPr>
+        <w:spacing w:before="180" w:line="271" w:lineRule="auto"/>
+      </w:pPr>
+      <w:r>
+        <w:rPr>
+          <w:b/>
+          <w:sz w:val="28"/>
+        </w:rPr>
+        <w:lastRenderedPageBreak/>
+        <w:t>GAP-03: AI Failure and Fallback Modes</w:t>
+      </w:r>
+    </w:p>
+    <w:p>
+      <w:pPr>
+        <w:shd w:val="clear" w:color="auto" w:fill="FFF4E5"/>
+      </w:pPr>
+      <w:r>
+        <w:t>AI is the core differentiator, but no failure spec exists. Medical domain needs explicit fallback paths.</w:t>
+      </w:r>
+    </w:p>
+    <w:p>
+      <w:pPr>
+        <w:numPr>
+          <w:ilvl w:val="0"/>
+          <w:numId w:val="41"/>
+        </w:numPr>
+      </w:pPr>
+      <w:r>
+        <w:t>Required per AI-assisted screen: manual entry always reachable in one tap, even when AI is working.</w:t>
+      </w:r>
+    </w:p>
+    <w:p>
+      <w:pPr>
+        <w:numPr>
+          <w:ilvl w:val="0"/>
+          <w:numId w:val="41"/>
+        </w:numPr>
+      </w:pPr>
+      <w:r>
+        <w:t>OCR confidence below threshold (default 0.7): force manual review with pre-filled low-confidence fields highlighted.</w:t>
+      </w:r>
+    </w:p>
+    <w:p>
+      <w:pPr>
+        <w:numPr>
+          <w:ilvl w:val="0"/>
+          <w:numId w:val="41"/>
+        </w:numPr>
+      </w:pPr>
+      <w:r>
+        <w:t>Voice assistant: always show transcript before submit. User confirms before form is populated.</w:t>
+      </w:r>
+    </w:p>
+    <w:p>
+      <w:pPr>
+        <w:numPr>
+          <w:ilvl w:val="0"/>
+          <w:numId w:val="41"/>
+        </w:numPr>
+      </w:pPr>
+      <w:r>
+        <w:t>AI service down (Anthropic outage): degrade to pure manual entry with a banner. Bill creation must not block on AI.</w:t>
+      </w:r>
+    </w:p>
+    <w:p>
+      <w:pPr>
+        <w:numPr>
+          <w:ilvl w:val="0"/>
+          <w:numId w:val="41"/>
+        </w:numPr>
+      </w:pPr>
+      <w:r>
+        <w:t>Log every AI response with confidence scores in an ai_interactions table for audit and quality review.</w:t>
+      </w:r>
+    </w:p>
+    <w:p>
+      <w:pPr>
+        <w:spacing w:before="180" w:line="271" w:lineRule="auto"/>
+      </w:pPr>
+      <w:r>
+        <w:rPr>
+          <w:b/>
+          <w:sz w:val="28"/>
+        </w:rPr>
+        <w:t>GAP-04: DPDP Act 2023 Compliance Plan</w:t>
+      </w:r>
+    </w:p>
+    <w:p>
+      <w:pPr>
+        <w:shd w:val="clear" w:color="auto" w:fill="FFF4E5"/>
+      </w:pPr>
+      <w:r>
+        <w:t>Patient medical data is sensitive personal data under India's DPDP Act. Current architecture sends data to Anthropic (US-based) and stores in Neon PostgreSQL (region unspecified).</w:t>
+      </w:r>
+    </w:p>
+    <w:p>
+      <w:pPr>
+        <w:numPr>
+          <w:ilvl w:val="0"/>
+          <w:numId w:val="41"/>
+        </w:numPr>
+      </w:pPr>
+      <w:r>
+        <w:t>Confirm Neon database region. Recommend ap-south-1 (Mumbai) or in-west (Hyderabad if available).</w:t>
+      </w:r>
+    </w:p>
+    <w:p>
+      <w:pPr>
+        <w:numPr>
+          <w:ilvl w:val="0"/>
+          <w:numId w:val="41"/>
+        </w:numPr>
+      </w:pPr>
+      <w:r>
+        <w:t>Capture explicit patient consent for AI processing at registration (checkbox + date + signature/OTP).</w:t>
+      </w:r>
+    </w:p>
+    <w:p>
+      <w:pPr>
+        <w:numPr>
+          <w:ilvl w:val="0"/>
+          <w:numId w:val="41"/>
+        </w:numPr>
+      </w:pPr>
+      <w:r>
+        <w:t>Document data processor agreement with Anthropic if they are the AI provider.</w:t>
+      </w:r>
+    </w:p>
+    <w:p>
+      <w:pPr>
+        <w:numPr>
+          <w:ilvl w:val="0"/>
+          <w:numId w:val="41"/>
+        </w:numPr>
+      </w:pPr>
+      <w:r>
+        <w:t>Implement right to erasure API (delete patient + cascade to visits, bills, reports). Retain audit records per regulatory minimum.</w:t>
+      </w:r>
+    </w:p>
+    <w:p>
+      <w:pPr>
+        <w:numPr>
+          <w:ilvl w:val="0"/>
+          <w:numId w:val="41"/>
+        </w:numPr>
+      </w:pPr>
+      <w:r>
+        <w:t>Document data retention policy: reports 2 years minimum, patient records 7 years for medical records per ICMR guidelines.</w:t>
+      </w:r>
+    </w:p>
+    <w:p>
+      <w:pPr>
+        <w:spacing w:before="180" w:line="271" w:lineRule="auto"/>
+      </w:pPr>
+      <w:r>
+        <w:rPr>
+          <w:b/>
+          <w:sz w:val="28"/>
+        </w:rPr>
+        <w:t>GAP-05: AI Cost Projection and Budget</w:t>
+      </w:r>
+    </w:p>
+    <w:p>
+      <w:pPr>
+        <w:shd w:val="clear" w:color="auto" w:fill="FFF4E5"/>
+      </w:pPr>
+      <w:r>
+        <w:t>Prototype costs ~Rs 0.08 per OCR scan. At 60 visits/day across 2 centers plus voice STT and AI assistant usage, monthly cost is non-trivial. No budget defined in PRD.</w:t>
+      </w:r>
+    </w:p>
+    <w:p>
+      <w:pPr>
+        <w:numPr>
+          <w:ilvl w:val="0"/>
+          <w:numId w:val="41"/>
+        </w:numPr>
+      </w:pPr>
+      <w:r>
+        <w:t>Estimate: 60 visits/day x 2 centers x 30 days x Rs 0.08 = Rs 288/month on prescription OCR alone.</w:t>
+      </w:r>
+    </w:p>
+    <w:p>
+      <w:pPr>
+        <w:numPr>
+          <w:ilvl w:val="0"/>
+          <w:numId w:val="41"/>
+        </w:numPr>
+      </w:pPr>
+      <w:r>
+        <w:t>Plus: AI assistant chat (unknown volume), voice STT (Rs 0.50-2 per minute depending on provider), report generation LLM calls.</w:t>
+      </w:r>
+    </w:p>
+    <w:p>
+      <w:pPr>
+        <w:numPr>
+          <w:ilvl w:val="0"/>
+          <w:numId w:val="41"/>
+        </w:numPr>
+      </w:pPr>
+      <w:r>
+        <w:t>Add: ai_cost_log table tracking each call's provider, tokens, cost. Daily report to System Admin.</w:t>
+      </w:r>
+    </w:p>
+    <w:p>
+      <w:pPr>
+        <w:numPr>
+          <w:ilvl w:val="0"/>
+          <w:numId w:val="41"/>
+        </w:numPr>
+      </w:pPr>
+      <w:r>
+        <w:t>Set per-tenant monthly AI budget (config). Soft-fail at 80% (warn), hard-fail at 100% (require approval to exceed).</w:t>
+      </w:r>
+    </w:p>
+    <w:p>
+      <w:pPr>
+        <w:spacing w:before="180" w:line="271" w:lineRule="auto"/>
+      </w:pPr>
+      <w:r>
+        <w:rPr>
+          <w:b/>
+          <w:sz w:val="28"/>
+        </w:rPr>
+        <w:t>GAP-06: Notification Preferences Per User</w:t>
+      </w:r>
+    </w:p>
+    <w:p>
+      <w:pPr>
+        <w:shd w:val="clear" w:color="auto" w:fill="FFF4E5"/>
+      </w:pPr>
+      <w:r>
+        <w:t>Section 19.5 specifies routing but no per-user opt-out or channel preference. Notification fatigue will occur without preferences.</w:t>
+      </w:r>
+    </w:p>
+    <w:p>
+      <w:pPr>
+        <w:numPr>
+          <w:ilvl w:val="0"/>
+          <w:numId w:val="41"/>
+        </w:numPr>
+      </w:pPr>
+      <w:r>
+        <w:lastRenderedPageBreak/>
+        <w:t>Add user_notification_preferences table: user_id, event_type, channel, enabled, quiet_hours_start, quiet_hours_end.</w:t>
+      </w:r>
+    </w:p>
+    <w:p>
+      <w:pPr>
+        <w:numPr>
+          <w:ilvl w:val="0"/>
+          <w:numId w:val="41"/>
+        </w:numPr>
+      </w:pPr>
+      <w:r>
+        <w:t>Defaults come from role-based templates (Receptionist: all in-app, critical WhatsApp).</w:t>
+      </w:r>
+    </w:p>
+    <w:p>
+      <w:pPr>
+        <w:numPr>
+          <w:ilvl w:val="0"/>
+          <w:numId w:val="41"/>
+        </w:numPr>
+      </w:pPr>
+      <w:r>
+        <w:t>User can opt out of non-critical channels (in-app cannot be disabled for urgent or critical priority).</w:t>
+      </w:r>
+    </w:p>
+    <w:p>
+      <w:pPr>
+        <w:spacing w:before="180" w:line="271" w:lineRule="auto"/>
+      </w:pPr>
+      <w:r>
+        <w:rPr>
+          <w:b/>
+          <w:sz w:val="28"/>
+        </w:rPr>
+        <w:t>GAP-08: SLA Definitions Missing</w:t>
+      </w:r>
+    </w:p>
+    <w:p>
+      <w:pPr>
+        <w:shd w:val="clear" w:color="auto" w:fill="FFF4E5"/>
+      </w:pPr>
+      <w:r>
+        <w:t>PRD sets performance targets (2 min registration, 60 sec sign-off) but no system SLA or escalation rules for pending approvals.</w:t>
+      </w:r>
+    </w:p>
+    <w:p>
+      <w:pPr>
+        <w:numPr>
+          <w:ilvl w:val="0"/>
+          <w:numId w:val="41"/>
+        </w:numPr>
+      </w:pPr>
+      <w:r>
+        <w:t>Discount approval SLA: 15 minutes initial, auto-escalate to Super Admin if pending &gt; 30 minutes.</w:t>
+      </w:r>
+    </w:p>
+    <w:p>
+      <w:pPr>
+        <w:numPr>
+          <w:ilvl w:val="0"/>
+          <w:numId w:val="41"/>
+        </w:numPr>
+      </w:pPr>
+      <w:r>
+        <w:t>Report delivery SLA: 10 minutes after sign-off for WhatsApp (patient). If failed, auto-retry with exponential backoff, escalate via in-app push to Center Head after 3 failed attempts.</w:t>
+      </w:r>
+    </w:p>
+    <w:p>
+      <w:pPr>
+        <w:numPr>
+          <w:ilvl w:val="0"/>
+          <w:numId w:val="41"/>
+        </w:numPr>
+      </w:pPr>
+      <w:r>
+        <w:t>Critical result notification SLA: 5 minutes. If not acknowledged by Pathologist within 5 min, escalate via in-app push to Center Head.</w:t>
+      </w:r>
+    </w:p>
+    <w:p>
+      <w:pPr>
+        <w:spacing w:before="240" w:line="271" w:lineRule="auto"/>
+      </w:pPr>
+      <w:r>
+        <w:rPr>
+          <w:rFonts w:eastAsia="Georgia" w:hAnsi="Georgia" w:cs="Georgia"/>
+          <w:b/>
+          <w:sz w:val="33"/>
+        </w:rPr>
+        <w:t>21.3 Deferred Items (Explicit)</w:t>
+      </w:r>
+    </w:p>
+    <w:p>
+      <w:pPr>
+        <w:numPr>
+          <w:ilvl w:val="0"/>
+          <w:numId w:val="41"/>
+        </w:numPr>
+      </w:pPr>
+      <w:r>
+        <w:t>Department Lead (L2) tier: defer to Phase 1.5. Ship Phase 1 with L0/L1/L3 only.</w:t>
+      </w:r>
+    </w:p>
+    <w:p>
+      <w:pPr>
+        <w:numPr>
+          <w:ilvl w:val="0"/>
+          <w:numId w:val="41"/>
+        </w:numPr>
+      </w:pPr>
+      <w:r>
+        <w:t>Region layer: optional in schema. Populate during onboarding only if the tenant has &gt; 5 centers or multiple states.</w:t>
+      </w:r>
+    </w:p>
+    <w:p>
+      <w:pPr>
+        <w:numPr>
+          <w:ilvl w:val="0"/>
+          <w:numId w:val="41"/>
+        </w:numPr>
+      </w:pPr>
+      <w:r>
+        <w:t>STT provider selection (Whisper vs Google vs Sarvam vs Bhashini): decide after prototype-to-production STT accuracy test with 50 Hindi + 50 English + 50 code-mixed samples.</w:t>
+      </w:r>
+    </w:p>
+    <w:p>
+      <w:pPr>
+        <w:numPr>
+          <w:ilvl w:val="0"/>
+          <w:numId w:val="41"/>
+        </w:numPr>
+      </w:pPr>
+      <w:r>
+        <w:t>WhatsApp Business API provider (Meta Cloud vs Gupshup vs AiSensy vs WATI): decide after cost comparison and template approval SLA test with each.</w:t>
+      </w:r>
+    </w:p>
+    <w:p>
+      <w:pPr>
+        <w:spacing w:before="240" w:line="271" w:lineRule="auto"/>
+      </w:pPr>
+      <w:r>
+        <w:rPr>
+          <w:rFonts w:eastAsia="Georgia" w:hAnsi="Georgia" w:cs="Georgia"/>
+          <w:b/>
+          <w:sz w:val="33"/>
+        </w:rPr>
+        <w:t>21.4 Review and Sign-Off</w:t>
+      </w:r>
+    </w:p>
+    <w:p>
+      <w:r>
+        <w:t>This decisions log must be reviewed and signed off by the following before implementation begins:</w:t>
+      </w:r>
+    </w:p>
+    <w:p>
+      <w:pPr>
+        <w:numPr>
+          <w:ilvl w:val="0"/>
+          <w:numId w:val="41"/>
+        </w:numPr>
+      </w:pPr>
+      <w:r>
+        <w:t>Khalid Shaikh (Product Owner) - all 4 decisions + 8 gaps.</w:t>
+      </w:r>
+    </w:p>
+    <w:p>
+      <w:pPr>
+        <w:numPr>
+          <w:ilvl w:val="0"/>
+          <w:numId w:val="41"/>
+        </w:numPr>
+      </w:pPr>
+      <w:r>
+        <w:t>Mithlesh Jha (Business Owner) - settlement rule, AI cost budget.</w:t>
+      </w:r>
+    </w:p>
+    <w:p>
+      <w:pPr>
+        <w:numPr>
+          <w:ilvl w:val="0"/>
+          <w:numId w:val="41"/>
+        </w:numPr>
+      </w:pPr>
+      <w:r>
+        <w:t>Technical review by Claude - schema migration plan for mdm_branches to org_centers, AI cost tracking implementation.</w:t>
+      </w:r>
+    </w:p>
+    <w:p>
+      <w:r>
+        <w:lastRenderedPageBreak/>
+        <w:t>Saturday review (next scheduled): walk through GAP-01 (branches to centers migration) and GAP-04 (DPDP compliance) with stakeholder. Lock before Monday code start. DECISION-05 (WhatsApp scope) is resolved.</w:t>
       </w:r>
     </w:p>
     <w:sectPr>

</xml_diff>

<commit_message>
docs: PRD v3.1 + v3.2 + Saturday decisions + eval strategy + prod-plan
PRD versions (all older kept intact):
- v3.1: Section 22 added (Saturday call decisions, engineering methodology,
  DECISION-06 through DECISION-13, folder structure, gap resolutions)
- v3.2: Section 23 added (Patient + B2B portals in Phase 1,
  WhatsApp utility templates with branding, DECISION-14 through DECISION-17)

New planning docs:
- docs/PRD-SATURDAY-DECISIONS.md — supplement to PRD v3.0 with all
  Saturday decisions, WhatsApp/SMS cost model, MSG91 + Fast2SMS providers
- docs/EVAL-STRATEGY.md — multi-Claude-model maker-checker workflow
  (Opus/Sonnet/Haiku matrix), eval categories checklist, anti-patterns
- docs/prod-plan/README.md — build order (20 core + 6 portal + 7 infra features)
- docs/prod-plan/00-template.req.md — requirement file template
- docs/prod-plan/00-template.eval.md — eval file template (7 mandatory categories)

Co-Authored-By: Claude Opus 4.6 (1M context) <noreply@anthropic.com>
</commit_message>
<xml_diff>
--- a/docs/Medrelief_ERP_PRD_v3.0-Phase-1.docx
+++ b/docs/Medrelief_ERP_PRD_v3.0-Phase-1.docx
@@ -741,7 +741,35 @@
           <w:sz w:val="24"/>
           <w:szCs w:val="24"/>
         </w:rPr>
-        <w:t xml:space="preserve"> Use two sources only: (1) environment variables for deployment/static secrets (DB/Redis credentials, JWT secret, storage and provider keys), and (2) DB config tables for runtime business configuration (discount limits, rounding rules, allowed payment modes per branch, report retention, duplicate merge rules). Resolution order: branch config → tenant config → code default. Cache resolved config briefly (e.g., 5 minutes) and invalidate on update.</w:t>
+        <w:t xml:space="preserve"> Use two sources only: (1) environment variables for deployment/static secrets (DB/Redis credentials, JWT secret, storage and provider keys), and (2) DB config tables for runtime business configuration (discount limits, rounding rules, allowed payment modes per branch, report retention, duplicate merge rules). Resolution order: branch config </w:t>
+      </w:r>
+      <w:r>
+        <w:rPr>
+          <w:sz w:val="24"/>
+          <w:szCs w:val="24"/>
+        </w:rPr>
+        <w:t>→</w:t>
+      </w:r>
+      <w:r>
+        <w:rPr>
+          <w:sz w:val="24"/>
+          <w:szCs w:val="24"/>
+        </w:rPr>
+        <w:t xml:space="preserve"> tenant config </w:t>
+      </w:r>
+      <w:r>
+        <w:rPr>
+          <w:sz w:val="24"/>
+          <w:szCs w:val="24"/>
+        </w:rPr>
+        <w:t>→</w:t>
+      </w:r>
+      <w:r>
+        <w:rPr>
+          <w:sz w:val="24"/>
+          <w:szCs w:val="24"/>
+        </w:rPr>
+        <w:t xml:space="preserve"> code default. Cache resolved config briefly (e.g., 5 minutes) and invalidate on update.</w:t>
       </w:r>
     </w:p>
     <w:p>
@@ -1578,6 +1606,12 @@
           <w:szCs w:val="24"/>
         </w:rPr>
         <w:t xml:space="preserve"> File names use kebab-case; classes use PascalCase; variables/functions use camelCase; DB tables use snake_case with module prefix; columns use snake_case; API routes use kebab-case; </w:t>
+      </w:r>
+      <w:r>
+        <w:rPr>
+          <w:sz w:val="24"/>
+          <w:szCs w:val="24"/>
+        </w:rPr>
         <w:lastRenderedPageBreak/>
         <w:t>enums use PascalCase type with UPPER values; constants use UPPER_SNAKE_CASE.</w:t>
       </w:r>
@@ -3126,7 +3160,19 @@
         <w:rPr>
           <w:b/>
         </w:rPr>
-        <w:t>13–15 inch touch-enabled devices and tablets</w:t>
+        <w:t>13</w:t>
+      </w:r>
+      <w:r>
+        <w:rPr>
+          <w:b/>
+        </w:rPr>
+        <w:t>–</w:t>
+      </w:r>
+      <w:r>
+        <w:rPr>
+          <w:b/>
+        </w:rPr>
+        <w:t>15 inch touch-enabled devices and tablets</w:t>
       </w:r>
       <w:r>
         <w:t>.</w:t>
@@ -3202,7 +3248,19 @@
         <w:rPr>
           <w:b/>
         </w:rPr>
-        <w:t>Create and confirm a simple bill (existing patient, 1–3 tests, cash)</w:t>
+        <w:t>Create and confirm a simple bill (existing patient, 1</w:t>
+      </w:r>
+      <w:r>
+        <w:rPr>
+          <w:b/>
+        </w:rPr>
+        <w:t>–</w:t>
+      </w:r>
+      <w:r>
+        <w:rPr>
+          <w:b/>
+        </w:rPr>
+        <w:t>3 tests, cash)</w:t>
       </w:r>
       <w:r>
         <w:t>:</w:t>
@@ -6127,6 +6185,11 @@
                 <w:rFonts w:cs="Times New Roman"/>
               </w:rPr>
               <w:t xml:space="preserve"> </w:t>
+            </w:r>
+            <w:r>
+              <w:rPr>
+                <w:rFonts w:cs="Times New Roman"/>
+              </w:rPr>
               <w:lastRenderedPageBreak/>
               <w:t xml:space="preserve">(nullable), </w:t>
             </w:r>
@@ -9531,14 +9594,44 @@
           <w:rFonts w:ascii="menlo" w:eastAsia="menlo" w:hAnsi="menlo" w:cs="menlo"/>
         </w:rPr>
         <w:t>DRAFT → PENDING_PAYMENT → PAID</w:t>
+      </w:r>
+      <w:r>
+        <w:rPr>
+          <w:rStyle w:val="VerbatimChar"/>
+          <w:rFonts w:ascii="menlo" w:eastAsia="menlo" w:hAnsi="menlo" w:cs="menlo"/>
+        </w:rPr>
         <w:br/>
         <w:t xml:space="preserve">                        → PARTIALLY_PAID → PAID</w:t>
+      </w:r>
+      <w:r>
+        <w:rPr>
+          <w:rStyle w:val="VerbatimChar"/>
+          <w:rFonts w:ascii="menlo" w:eastAsia="menlo" w:hAnsi="menlo" w:cs="menlo"/>
+        </w:rPr>
         <w:br/>
         <w:t xml:space="preserve">          ↓                ↓</w:t>
+      </w:r>
+      <w:r>
+        <w:rPr>
+          <w:rStyle w:val="VerbatimChar"/>
+          <w:rFonts w:ascii="menlo" w:eastAsia="menlo" w:hAnsi="menlo" w:cs="menlo"/>
+        </w:rPr>
         <w:br/>
         <w:t xml:space="preserve">       CANCELLED        CANCELLED (with audit)</w:t>
+      </w:r>
+      <w:r>
+        <w:rPr>
+          <w:rStyle w:val="VerbatimChar"/>
+          <w:rFonts w:ascii="menlo" w:eastAsia="menlo" w:hAnsi="menlo" w:cs="menlo"/>
+        </w:rPr>
         <w:br/>
         <w:t xml:space="preserve">                        → REFUNDED (via Credit Note)</w:t>
+      </w:r>
+      <w:r>
+        <w:rPr>
+          <w:rStyle w:val="VerbatimChar"/>
+          <w:rFonts w:ascii="menlo" w:eastAsia="menlo" w:hAnsi="menlo" w:cs="menlo"/>
+        </w:rPr>
         <w:br/>
       </w:r>
     </w:p>
@@ -9798,14 +9891,50 @@
           <w:rFonts w:ascii="menlo" w:eastAsia="menlo" w:hAnsi="menlo" w:cs="menlo"/>
         </w:rPr>
         <w:t>Sample: PENDING_COLLECTION → COLLECTED → RECEIVED_AT_LAB → IN_PROCESS → COMPLETED</w:t>
+      </w:r>
+      <w:r>
+        <w:rPr>
+          <w:rStyle w:val="VerbatimChar"/>
+          <w:rFonts w:ascii="menlo" w:eastAsia="menlo" w:hAnsi="menlo" w:cs="menlo"/>
+        </w:rPr>
         <w:br/>
         <w:t xml:space="preserve">                                                                        → REJECTED</w:t>
+      </w:r>
+      <w:r>
+        <w:rPr>
+          <w:rStyle w:val="VerbatimChar"/>
+          <w:rFonts w:ascii="menlo" w:eastAsia="menlo" w:hAnsi="menlo" w:cs="menlo"/>
+        </w:rPr>
         <w:br/>
+      </w:r>
+      <w:r>
+        <w:rPr>
+          <w:rStyle w:val="VerbatimChar"/>
+          <w:rFonts w:ascii="menlo" w:eastAsia="menlo" w:hAnsi="menlo" w:cs="menlo"/>
+        </w:rPr>
         <w:br/>
         <w:t>Test Order: ORDERED → IN_PROCESS → COMPLETED → APPROVED</w:t>
+      </w:r>
+      <w:r>
+        <w:rPr>
+          <w:rStyle w:val="VerbatimChar"/>
+          <w:rFonts w:ascii="menlo" w:eastAsia="menlo" w:hAnsi="menlo" w:cs="menlo"/>
+        </w:rPr>
         <w:br/>
+      </w:r>
+      <w:r>
+        <w:rPr>
+          <w:rStyle w:val="VerbatimChar"/>
+          <w:rFonts w:ascii="menlo" w:eastAsia="menlo" w:hAnsi="menlo" w:cs="menlo"/>
+        </w:rPr>
         <w:br/>
         <w:t>Report: GENERATED → SIGNED_OFF → AMENDED (new version, old kept)</w:t>
+      </w:r>
+      <w:r>
+        <w:rPr>
+          <w:rStyle w:val="VerbatimChar"/>
+          <w:rFonts w:ascii="menlo" w:eastAsia="menlo" w:hAnsi="menlo" w:cs="menlo"/>
+        </w:rPr>
         <w:br/>
       </w:r>
     </w:p>
@@ -10700,7 +10829,13 @@
         <w:t>Rate plan resolution (deterministic):</w:t>
       </w:r>
       <w:r>
-        <w:t xml:space="preserve"> Use strict priority: (1) explicit bill-level override plan (Finance Manager/System Admin only), (2) referrer-linked active plan, (3) organization/corporate active plan, (4) payer-type mapped plan, (5) branch default plan, (6) tenant default MRP plan. Plan must be ACTIVE and effective for billDateTime (effective_from ≤ billDateTime &lt; effective_to; effective_to may be null). If multiple plans match at the same priority: choose highest explicit priority, then latest effective_from, then lowest internal id (tie-breaker). If a test is missing in the resolved plan, fall back down the chain for that test only; if still missing, fall back to tenant MRP for that test. If any tests remain unresolved: reject bill creation with a clear error listing unresolved tests (no silent pricing fallback).</w:t>
+        <w:t xml:space="preserve"> Use strict priority: (1) explicit bill-level override plan (Finance Manager/System Admin only), (2) referrer-linked active plan, (3) organization/corporate active plan, (4) payer-type mapped plan, (5) branch default plan, (6) tenant default MRP plan. Plan must be ACTIVE and effective for billDateTime (effective_from </w:t>
+      </w:r>
+      <w:r>
+        <w:t>≤</w:t>
+      </w:r>
+      <w:r>
+        <w:t xml:space="preserve"> billDateTime &lt; effective_to; effective_to may be null). If multiple plans match at the same priority: choose highest explicit priority, then latest effective_from, then lowest internal id (tie-breaker). If a test is missing in the resolved plan, fall back down the chain for that test only; if still missing, fall back to tenant MRP for that test. If any tests remain unresolved: reject bill creation with a clear error listing unresolved tests (no silent pricing fallback).</w:t>
       </w:r>
     </w:p>
     <w:p>
@@ -10865,6 +11000,8 @@
       </w:r>
       <w:r>
         <w:t>.</w:t>
+      </w:r>
+      <w:r>
         <w:br/>
       </w:r>
       <w:r>
@@ -12198,6 +12335,8 @@
       </w:r>
       <w:r>
         <w:t xml:space="preserve"> &lt; 2 minutes for a simple walk-in case.</w:t>
+      </w:r>
+      <w:r>
         <w:br/>
       </w:r>
       <w:r>
@@ -13540,7 +13679,35 @@
           <w:sz w:val="24"/>
           <w:szCs w:val="24"/>
         </w:rPr>
-        <w:t>Partial payments: allow multiple payment rows per bill; bill payment_status transitions UNPAID → PARTIALLY_PAID → PAID; emit BillConfirmed only on transition to fully paid unless an approved credit rule allows accession earlier.</w:t>
+        <w:t xml:space="preserve">Partial payments: allow multiple payment rows per bill; bill payment_status transitions UNPAID </w:t>
+      </w:r>
+      <w:r>
+        <w:rPr>
+          <w:sz w:val="24"/>
+          <w:szCs w:val="24"/>
+        </w:rPr>
+        <w:t>→</w:t>
+      </w:r>
+      <w:r>
+        <w:rPr>
+          <w:sz w:val="24"/>
+          <w:szCs w:val="24"/>
+        </w:rPr>
+        <w:t xml:space="preserve"> PARTIALLY_PAID </w:t>
+      </w:r>
+      <w:r>
+        <w:rPr>
+          <w:sz w:val="24"/>
+          <w:szCs w:val="24"/>
+        </w:rPr>
+        <w:t>→</w:t>
+      </w:r>
+      <w:r>
+        <w:rPr>
+          <w:sz w:val="24"/>
+          <w:szCs w:val="24"/>
+        </w:rPr>
+        <w:t xml:space="preserve"> PAID; emit BillConfirmed only on transition to fully paid unless an approved credit rule allows accession earlier.</w:t>
       </w:r>
     </w:p>
     <w:p>
@@ -14606,7 +14773,21 @@
           <w:sz w:val="24"/>
           <w:szCs w:val="24"/>
         </w:rPr>
-        <w:t>Sample rejection → recollection: rejection reason mandatory (e.g., HEMOLYZED, INSUFFICIENT_QTY, LEAKED, MISLABELED). On rejection, create a recollection task and mark impacted tests RECOLLECTION_REQUIRED; MVP default is same accession with a new sample sequence.</w:t>
+        <w:t xml:space="preserve">Sample rejection </w:t>
+      </w:r>
+      <w:r>
+        <w:rPr>
+          <w:sz w:val="24"/>
+          <w:szCs w:val="24"/>
+        </w:rPr>
+        <w:t>→</w:t>
+      </w:r>
+      <w:r>
+        <w:rPr>
+          <w:sz w:val="24"/>
+          <w:szCs w:val="24"/>
+        </w:rPr>
+        <w:t xml:space="preserve"> recollection: rejection reason mandatory (e.g., HEMOLYZED, INSUFFICIENT_QTY, LEAKED, MISLABELED). On rejection, create a recollection task and mark impacted tests RECOLLECTION_REQUIRED; MVP default is same accession with a new sample sequence.</w:t>
       </w:r>
     </w:p>
     <w:p>
@@ -15335,7 +15516,13 @@
         <w:t>Report storage:</w:t>
       </w:r>
       <w:r>
-        <w:t xml:space="preserve"> Store generated PDFs in local disk for dev and S3-compatible object storage for staging/prod (never as DB blobs). Use private storage; access via signed URL or backend proxy after auth + RBAC + tenant/branch checks. Suggested naming: tenants/{tenantId}/branches/{branchId}/reports/{yyyy}/{mm}/{accessionNumber}/{reportVersion}.pdf. Signed links expire (configurable, e.g., 24–72 hours). Retain physical report files per tenant policy (MVP default: 2 years). Amended reports keep prior versions; never overwrite old files.</w:t>
+        <w:t xml:space="preserve"> Store generated PDFs in local disk for dev and S3-compatible object storage for staging/prod (never as DB blobs). Use private storage; access via signed URL or backend proxy after auth + RBAC + tenant/branch checks. Suggested naming: tenants/{tenantId}/branches/{branchId}/reports/{yyyy}/{mm}/{accessionNumber}/{reportVersion}.pdf. Signed links expire (configurable, e.g., 24</w:t>
+      </w:r>
+      <w:r>
+        <w:t>–</w:t>
+      </w:r>
+      <w:r>
+        <w:t>72 hours). Retain physical report files per tenant policy (MVP default: 2 years). Amended reports keep prior versions; never overwrite old files.</w:t>
       </w:r>
     </w:p>
     <w:p>
@@ -17573,7 +17760,43 @@
         <w:rPr>
           <w:b/>
         </w:rPr>
-        <w:t>DB Schema → Billing Engine → LIMS → Report Dispatch</w:t>
+        <w:t xml:space="preserve">DB Schema </w:t>
+      </w:r>
+      <w:r>
+        <w:rPr>
+          <w:b/>
+        </w:rPr>
+        <w:t>→</w:t>
+      </w:r>
+      <w:r>
+        <w:rPr>
+          <w:b/>
+        </w:rPr>
+        <w:t xml:space="preserve"> Billing Engine </w:t>
+      </w:r>
+      <w:r>
+        <w:rPr>
+          <w:b/>
+        </w:rPr>
+        <w:t>→</w:t>
+      </w:r>
+      <w:r>
+        <w:rPr>
+          <w:b/>
+        </w:rPr>
+        <w:t xml:space="preserve"> LIMS </w:t>
+      </w:r>
+      <w:r>
+        <w:rPr>
+          <w:b/>
+        </w:rPr>
+        <w:t>→</w:t>
+      </w:r>
+      <w:r>
+        <w:rPr>
+          <w:b/>
+        </w:rPr>
+        <w:t xml:space="preserve"> Report Dispatch</w:t>
       </w:r>
       <w:r>
         <w:t xml:space="preserve"> is the primary critical path.</w:t>
@@ -17682,93 +17905,243 @@
           <w:rFonts w:ascii="menlo" w:eastAsia="menlo" w:hAnsi="menlo" w:cs="menlo"/>
         </w:rPr>
         <w:t>{</w:t>
+      </w:r>
+      <w:r>
+        <w:rPr>
+          <w:rStyle w:val="VerbatimChar"/>
+          <w:rFonts w:ascii="menlo" w:eastAsia="menlo" w:hAnsi="menlo" w:cs="menlo"/>
+        </w:rPr>
         <w:br/>
         <w:t xml:space="preserve">  "full_name": "Rahul Kumar",</w:t>
+      </w:r>
+      <w:r>
+        <w:rPr>
+          <w:rStyle w:val="VerbatimChar"/>
+          <w:rFonts w:ascii="menlo" w:eastAsia="menlo" w:hAnsi="menlo" w:cs="menlo"/>
+        </w:rPr>
         <w:br/>
         <w:t xml:space="preserve">  "gender": "MALE",</w:t>
+      </w:r>
+      <w:r>
+        <w:rPr>
+          <w:rStyle w:val="VerbatimChar"/>
+          <w:rFonts w:ascii="menlo" w:eastAsia="menlo" w:hAnsi="menlo" w:cs="menlo"/>
+        </w:rPr>
         <w:br/>
         <w:t xml:space="preserve">  "dob": "1990-05-15",</w:t>
+      </w:r>
+      <w:r>
+        <w:rPr>
+          <w:rStyle w:val="VerbatimChar"/>
+          <w:rFonts w:ascii="menlo" w:eastAsia="menlo" w:hAnsi="menlo" w:cs="menlo"/>
+        </w:rPr>
         <w:br/>
         <w:t xml:space="preserve">  "age_years": 34,</w:t>
+      </w:r>
+      <w:r>
+        <w:rPr>
+          <w:rStyle w:val="VerbatimChar"/>
+          <w:rFonts w:ascii="menlo" w:eastAsia="menlo" w:hAnsi="menlo" w:cs="menlo"/>
+        </w:rPr>
         <w:br/>
         <w:t xml:space="preserve">  "mobile": "9876543210",</w:t>
+      </w:r>
+      <w:r>
+        <w:rPr>
+          <w:rStyle w:val="VerbatimChar"/>
+          <w:rFonts w:ascii="menlo" w:eastAsia="menlo" w:hAnsi="menlo" w:cs="menlo"/>
+        </w:rPr>
         <w:br/>
         <w:t xml:space="preserve">  "email": "rahul@example.com",</w:t>
+      </w:r>
+      <w:r>
+        <w:rPr>
+          <w:rStyle w:val="VerbatimChar"/>
+          <w:rFonts w:ascii="menlo" w:eastAsia="menlo" w:hAnsi="menlo" w:cs="menlo"/>
+        </w:rPr>
         <w:br/>
         <w:t xml:space="preserve">  "address": "Madhubani, Bihar",</w:t>
+      </w:r>
+      <w:r>
+        <w:rPr>
+          <w:rStyle w:val="VerbatimChar"/>
+          <w:rFonts w:ascii="menlo" w:eastAsia="menlo" w:hAnsi="menlo" w:cs="menlo"/>
+        </w:rPr>
         <w:br/>
         <w:t xml:space="preserve">  "allow_merge_with_existing": true</w:t>
+      </w:r>
+      <w:r>
+        <w:rPr>
+          <w:rStyle w:val="VerbatimChar"/>
+          <w:rFonts w:ascii="menlo" w:eastAsia="menlo" w:hAnsi="menlo" w:cs="menlo"/>
+        </w:rPr>
         <w:br/>
+      </w:r>
+      <w:r>
+        <w:rPr>
+          <w:rStyle w:val="VerbatimChar"/>
+          <w:rFonts w:ascii="menlo" w:eastAsia="menlo" w:hAnsi="menlo" w:cs="menlo"/>
+        </w:rPr>
         <w:lastRenderedPageBreak/>
         <w:t>}</w:t>
-        <w:br/>
-      </w:r>
-    </w:p>
-    <w:p>
-      <w:pPr>
-        <w:spacing w:after="210"/>
-      </w:pPr>
-      <w:r>
-        <w:rPr>
-          <w:b/>
-        </w:rPr>
-        <w:t>Response (201 Created):</w:t>
-      </w:r>
-    </w:p>
-    <w:p>
-      <w:pPr>
-        <w:shd w:val="clear" w:color="auto" w:fill="F8F8FA"/>
-      </w:pPr>
+      </w:r>
       <w:r>
         <w:rPr>
           <w:rStyle w:val="VerbatimChar"/>
           <w:rFonts w:ascii="menlo" w:eastAsia="menlo" w:hAnsi="menlo" w:cs="menlo"/>
         </w:rPr>
+        <w:br/>
+      </w:r>
+    </w:p>
+    <w:p>
+      <w:pPr>
+        <w:spacing w:after="210"/>
+      </w:pPr>
+      <w:r>
+        <w:rPr>
+          <w:b/>
+        </w:rPr>
+        <w:t>Response (201 Created):</w:t>
+      </w:r>
+    </w:p>
+    <w:p>
+      <w:pPr>
+        <w:shd w:val="clear" w:color="auto" w:fill="F8F8FA"/>
+      </w:pPr>
+      <w:r>
+        <w:rPr>
+          <w:rStyle w:val="VerbatimChar"/>
+          <w:rFonts w:ascii="menlo" w:eastAsia="menlo" w:hAnsi="menlo" w:cs="menlo"/>
+        </w:rPr>
         <w:t>{</w:t>
+      </w:r>
+      <w:r>
+        <w:rPr>
+          <w:rStyle w:val="VerbatimChar"/>
+          <w:rFonts w:ascii="menlo" w:eastAsia="menlo" w:hAnsi="menlo" w:cs="menlo"/>
+        </w:rPr>
         <w:br/>
         <w:t xml:space="preserve">  "id": "pat_12345",</w:t>
+      </w:r>
+      <w:r>
+        <w:rPr>
+          <w:rStyle w:val="VerbatimChar"/>
+          <w:rFonts w:ascii="menlo" w:eastAsia="menlo" w:hAnsi="menlo" w:cs="menlo"/>
+        </w:rPr>
         <w:br/>
         <w:t xml:space="preserve">  "patient_code": "MR-PAT-00001",</w:t>
+      </w:r>
+      <w:r>
+        <w:rPr>
+          <w:rStyle w:val="VerbatimChar"/>
+          <w:rFonts w:ascii="menlo" w:eastAsia="menlo" w:hAnsi="menlo" w:cs="menlo"/>
+        </w:rPr>
         <w:br/>
         <w:t xml:space="preserve">  "full_name": "Rahul Kumar",</w:t>
+      </w:r>
+      <w:r>
+        <w:rPr>
+          <w:rStyle w:val="VerbatimChar"/>
+          <w:rFonts w:ascii="menlo" w:eastAsia="menlo" w:hAnsi="menlo" w:cs="menlo"/>
+        </w:rPr>
         <w:br/>
         <w:t xml:space="preserve">  "mobile": "9876543210",</w:t>
+      </w:r>
+      <w:r>
+        <w:rPr>
+          <w:rStyle w:val="VerbatimChar"/>
+          <w:rFonts w:ascii="menlo" w:eastAsia="menlo" w:hAnsi="menlo" w:cs="menlo"/>
+        </w:rPr>
         <w:br/>
         <w:t xml:space="preserve">  "status": "ACTIVE"</w:t>
+      </w:r>
+      <w:r>
+        <w:rPr>
+          <w:rStyle w:val="VerbatimChar"/>
+          <w:rFonts w:ascii="menlo" w:eastAsia="menlo" w:hAnsi="menlo" w:cs="menlo"/>
+        </w:rPr>
         <w:br/>
         <w:t>}</w:t>
-        <w:br/>
-      </w:r>
-    </w:p>
-    <w:p>
-      <w:pPr>
-        <w:spacing w:after="210"/>
-      </w:pPr>
-      <w:r>
-        <w:rPr>
-          <w:b/>
-        </w:rPr>
-        <w:t>Error (409 Conflict – duplicate mobile):</w:t>
-      </w:r>
-    </w:p>
-    <w:p>
-      <w:pPr>
-        <w:shd w:val="clear" w:color="auto" w:fill="F8F8FA"/>
-      </w:pPr>
+      </w:r>
       <w:r>
         <w:rPr>
           <w:rStyle w:val="VerbatimChar"/>
           <w:rFonts w:ascii="menlo" w:eastAsia="menlo" w:hAnsi="menlo" w:cs="menlo"/>
         </w:rPr>
+        <w:br/>
+      </w:r>
+    </w:p>
+    <w:p>
+      <w:pPr>
+        <w:spacing w:after="210"/>
+      </w:pPr>
+      <w:r>
+        <w:rPr>
+          <w:b/>
+        </w:rPr>
+        <w:t xml:space="preserve">Error (409 Conflict </w:t>
+      </w:r>
+      <w:r>
+        <w:rPr>
+          <w:b/>
+        </w:rPr>
+        <w:t>–</w:t>
+      </w:r>
+      <w:r>
+        <w:rPr>
+          <w:b/>
+        </w:rPr>
+        <w:t xml:space="preserve"> duplicate mobile):</w:t>
+      </w:r>
+    </w:p>
+    <w:p>
+      <w:pPr>
+        <w:shd w:val="clear" w:color="auto" w:fill="F8F8FA"/>
+      </w:pPr>
+      <w:r>
+        <w:rPr>
+          <w:rStyle w:val="VerbatimChar"/>
+          <w:rFonts w:ascii="menlo" w:eastAsia="menlo" w:hAnsi="menlo" w:cs="menlo"/>
+        </w:rPr>
         <w:t>{</w:t>
+      </w:r>
+      <w:r>
+        <w:rPr>
+          <w:rStyle w:val="VerbatimChar"/>
+          <w:rFonts w:ascii="menlo" w:eastAsia="menlo" w:hAnsi="menlo" w:cs="menlo"/>
+        </w:rPr>
         <w:br/>
         <w:t xml:space="preserve">  "error_code": "PATIENT_DUPLICATE_MOBILE",</w:t>
+      </w:r>
+      <w:r>
+        <w:rPr>
+          <w:rStyle w:val="VerbatimChar"/>
+          <w:rFonts w:ascii="menlo" w:eastAsia="menlo" w:hAnsi="menlo" w:cs="menlo"/>
+        </w:rPr>
         <w:br/>
         <w:t xml:space="preserve">  "message": "A patient with this mobile already exists.",</w:t>
+      </w:r>
+      <w:r>
+        <w:rPr>
+          <w:rStyle w:val="VerbatimChar"/>
+          <w:rFonts w:ascii="menlo" w:eastAsia="menlo" w:hAnsi="menlo" w:cs="menlo"/>
+        </w:rPr>
         <w:br/>
         <w:t xml:space="preserve">  "existing_patient_id": "pat_67890"</w:t>
+      </w:r>
+      <w:r>
+        <w:rPr>
+          <w:rStyle w:val="VerbatimChar"/>
+          <w:rFonts w:ascii="menlo" w:eastAsia="menlo" w:hAnsi="menlo" w:cs="menlo"/>
+        </w:rPr>
         <w:br/>
         <w:t>}</w:t>
+      </w:r>
+      <w:r>
+        <w:rPr>
+          <w:rStyle w:val="VerbatimChar"/>
+          <w:rFonts w:ascii="menlo" w:eastAsia="menlo" w:hAnsi="menlo" w:cs="menlo"/>
+        </w:rPr>
         <w:br/>
       </w:r>
     </w:p>
@@ -17829,87 +18202,273 @@
           <w:rFonts w:ascii="menlo" w:eastAsia="menlo" w:hAnsi="menlo" w:cs="menlo"/>
         </w:rPr>
         <w:t>{</w:t>
+      </w:r>
+      <w:r>
+        <w:rPr>
+          <w:rStyle w:val="VerbatimChar"/>
+          <w:rFonts w:ascii="menlo" w:eastAsia="menlo" w:hAnsi="menlo" w:cs="menlo"/>
+        </w:rPr>
         <w:br/>
         <w:t xml:space="preserve">  "branch_id": "br_mdh_01",</w:t>
+      </w:r>
+      <w:r>
+        <w:rPr>
+          <w:rStyle w:val="VerbatimChar"/>
+          <w:rFonts w:ascii="menlo" w:eastAsia="menlo" w:hAnsi="menlo" w:cs="menlo"/>
+        </w:rPr>
         <w:br/>
         <w:t xml:space="preserve">  "patient_id": "pat_12345",</w:t>
+      </w:r>
+      <w:r>
+        <w:rPr>
+          <w:rStyle w:val="VerbatimChar"/>
+          <w:rFonts w:ascii="menlo" w:eastAsia="menlo" w:hAnsi="menlo" w:cs="menlo"/>
+        </w:rPr>
         <w:br/>
         <w:t xml:space="preserve">  "visit_type": "WALK_IN",</w:t>
+      </w:r>
+      <w:r>
+        <w:rPr>
+          <w:rStyle w:val="VerbatimChar"/>
+          <w:rFonts w:ascii="menlo" w:eastAsia="menlo" w:hAnsi="menlo" w:cs="menlo"/>
+        </w:rPr>
         <w:br/>
         <w:t xml:space="preserve">  "payer_type": "SELF",</w:t>
+      </w:r>
+      <w:r>
+        <w:rPr>
+          <w:rStyle w:val="VerbatimChar"/>
+          <w:rFonts w:ascii="menlo" w:eastAsia="menlo" w:hAnsi="menlo" w:cs="menlo"/>
+        </w:rPr>
         <w:br/>
         <w:t xml:space="preserve">  "referrer_id": "doc_001",</w:t>
+      </w:r>
+      <w:r>
+        <w:rPr>
+          <w:rStyle w:val="VerbatimChar"/>
+          <w:rFonts w:ascii="menlo" w:eastAsia="menlo" w:hAnsi="menlo" w:cs="menlo"/>
+        </w:rPr>
         <w:br/>
         <w:t xml:space="preserve">  "tests": [</w:t>
+      </w:r>
+      <w:r>
+        <w:rPr>
+          <w:rStyle w:val="VerbatimChar"/>
+          <w:rFonts w:ascii="menlo" w:eastAsia="menlo" w:hAnsi="menlo" w:cs="menlo"/>
+        </w:rPr>
         <w:br/>
         <w:t xml:space="preserve">    { "test_id": "test_cbc", "quantity": 1 },</w:t>
+      </w:r>
+      <w:r>
+        <w:rPr>
+          <w:rStyle w:val="VerbatimChar"/>
+          <w:rFonts w:ascii="menlo" w:eastAsia="menlo" w:hAnsi="menlo" w:cs="menlo"/>
+        </w:rPr>
         <w:br/>
         <w:t xml:space="preserve">    { "test_id": "test_fbs", "quantity": 1 }</w:t>
+      </w:r>
+      <w:r>
+        <w:rPr>
+          <w:rStyle w:val="VerbatimChar"/>
+          <w:rFonts w:ascii="menlo" w:eastAsia="menlo" w:hAnsi="menlo" w:cs="menlo"/>
+        </w:rPr>
         <w:br/>
         <w:t xml:space="preserve">  ],</w:t>
+      </w:r>
+      <w:r>
+        <w:rPr>
+          <w:rStyle w:val="VerbatimChar"/>
+          <w:rFonts w:ascii="menlo" w:eastAsia="menlo" w:hAnsi="menlo" w:cs="menlo"/>
+        </w:rPr>
         <w:br/>
         <w:t xml:space="preserve">  "manual_discount_percent": 5,</w:t>
+      </w:r>
+      <w:r>
+        <w:rPr>
+          <w:rStyle w:val="VerbatimChar"/>
+          <w:rFonts w:ascii="menlo" w:eastAsia="menlo" w:hAnsi="menlo" w:cs="menlo"/>
+        </w:rPr>
         <w:br/>
         <w:t xml:space="preserve">  "discount_reason_code": "SENIOR_CITIZEN",</w:t>
+      </w:r>
+      <w:r>
+        <w:rPr>
+          <w:rStyle w:val="VerbatimChar"/>
+          <w:rFonts w:ascii="menlo" w:eastAsia="menlo" w:hAnsi="menlo" w:cs="menlo"/>
+        </w:rPr>
         <w:br/>
         <w:t xml:space="preserve">  "payment": {</w:t>
+      </w:r>
+      <w:r>
+        <w:rPr>
+          <w:rStyle w:val="VerbatimChar"/>
+          <w:rFonts w:ascii="menlo" w:eastAsia="menlo" w:hAnsi="menlo" w:cs="menlo"/>
+        </w:rPr>
         <w:br/>
         <w:t xml:space="preserve">    "mode": "UPI",</w:t>
+      </w:r>
+      <w:r>
+        <w:rPr>
+          <w:rStyle w:val="VerbatimChar"/>
+          <w:rFonts w:ascii="menlo" w:eastAsia="menlo" w:hAnsi="menlo" w:cs="menlo"/>
+        </w:rPr>
         <w:br/>
         <w:t xml:space="preserve">    "amount": 750.00,</w:t>
+      </w:r>
+      <w:r>
+        <w:rPr>
+          <w:rStyle w:val="VerbatimChar"/>
+          <w:rFonts w:ascii="menlo" w:eastAsia="menlo" w:hAnsi="menlo" w:cs="menlo"/>
+        </w:rPr>
         <w:br/>
         <w:t xml:space="preserve">    "initiated_by": "user_001"</w:t>
+      </w:r>
+      <w:r>
+        <w:rPr>
+          <w:rStyle w:val="VerbatimChar"/>
+          <w:rFonts w:ascii="menlo" w:eastAsia="menlo" w:hAnsi="menlo" w:cs="menlo"/>
+        </w:rPr>
         <w:br/>
         <w:t xml:space="preserve">  }</w:t>
+      </w:r>
+      <w:r>
+        <w:rPr>
+          <w:rStyle w:val="VerbatimChar"/>
+          <w:rFonts w:ascii="menlo" w:eastAsia="menlo" w:hAnsi="menlo" w:cs="menlo"/>
+        </w:rPr>
         <w:br/>
         <w:t>}</w:t>
-        <w:br/>
-      </w:r>
-    </w:p>
-    <w:p>
-      <w:pPr>
-        <w:spacing w:after="210"/>
-      </w:pPr>
-      <w:r>
-        <w:rPr>
-          <w:b/>
-        </w:rPr>
-        <w:t>Response (201 Created):</w:t>
-      </w:r>
-    </w:p>
-    <w:p>
-      <w:pPr>
-        <w:shd w:val="clear" w:color="auto" w:fill="F8F8FA"/>
-      </w:pPr>
+      </w:r>
       <w:r>
         <w:rPr>
           <w:rStyle w:val="VerbatimChar"/>
           <w:rFonts w:ascii="menlo" w:eastAsia="menlo" w:hAnsi="menlo" w:cs="menlo"/>
         </w:rPr>
+        <w:br/>
+      </w:r>
+    </w:p>
+    <w:p>
+      <w:pPr>
+        <w:spacing w:after="210"/>
+      </w:pPr>
+      <w:r>
+        <w:rPr>
+          <w:b/>
+        </w:rPr>
+        <w:t>Response (201 Created):</w:t>
+      </w:r>
+    </w:p>
+    <w:p>
+      <w:pPr>
+        <w:shd w:val="clear" w:color="auto" w:fill="F8F8FA"/>
+      </w:pPr>
+      <w:r>
+        <w:rPr>
+          <w:rStyle w:val="VerbatimChar"/>
+          <w:rFonts w:ascii="menlo" w:eastAsia="menlo" w:hAnsi="menlo" w:cs="menlo"/>
+        </w:rPr>
         <w:t>{</w:t>
+      </w:r>
+      <w:r>
+        <w:rPr>
+          <w:rStyle w:val="VerbatimChar"/>
+          <w:rFonts w:ascii="menlo" w:eastAsia="menlo" w:hAnsi="menlo" w:cs="menlo"/>
+        </w:rPr>
         <w:br/>
         <w:t xml:space="preserve">  "bill_id": "bill_1001",</w:t>
+      </w:r>
+      <w:r>
+        <w:rPr>
+          <w:rStyle w:val="VerbatimChar"/>
+          <w:rFonts w:ascii="menlo" w:eastAsia="menlo" w:hAnsi="menlo" w:cs="menlo"/>
+        </w:rPr>
         <w:br/>
+      </w:r>
+      <w:r>
+        <w:rPr>
+          <w:rStyle w:val="VerbatimChar"/>
+          <w:rFonts w:ascii="menlo" w:eastAsia="menlo" w:hAnsi="menlo" w:cs="menlo"/>
+        </w:rPr>
         <w:lastRenderedPageBreak/>
         <w:t xml:space="preserve">  "bill_number": "MDH-20260401-0001",</w:t>
+      </w:r>
+      <w:r>
+        <w:rPr>
+          <w:rStyle w:val="VerbatimChar"/>
+          <w:rFonts w:ascii="menlo" w:eastAsia="menlo" w:hAnsi="menlo" w:cs="menlo"/>
+        </w:rPr>
         <w:br/>
         <w:t xml:space="preserve">  "gross_amount": 800.00,</w:t>
+      </w:r>
+      <w:r>
+        <w:rPr>
+          <w:rStyle w:val="VerbatimChar"/>
+          <w:rFonts w:ascii="menlo" w:eastAsia="menlo" w:hAnsi="menlo" w:cs="menlo"/>
+        </w:rPr>
         <w:br/>
         <w:t xml:space="preserve">  "discount_amount": 40.00,</w:t>
+      </w:r>
+      <w:r>
+        <w:rPr>
+          <w:rStyle w:val="VerbatimChar"/>
+          <w:rFonts w:ascii="menlo" w:eastAsia="menlo" w:hAnsi="menlo" w:cs="menlo"/>
+        </w:rPr>
         <w:br/>
         <w:t xml:space="preserve">  "net_amount": 760.00,</w:t>
+      </w:r>
+      <w:r>
+        <w:rPr>
+          <w:rStyle w:val="VerbatimChar"/>
+          <w:rFonts w:ascii="menlo" w:eastAsia="menlo" w:hAnsi="menlo" w:cs="menlo"/>
+        </w:rPr>
         <w:br/>
         <w:t xml:space="preserve">  "rounding_adjustment": -10.00,</w:t>
+      </w:r>
+      <w:r>
+        <w:rPr>
+          <w:rStyle w:val="VerbatimChar"/>
+          <w:rFonts w:ascii="menlo" w:eastAsia="menlo" w:hAnsi="menlo" w:cs="menlo"/>
+        </w:rPr>
         <w:br/>
         <w:t xml:space="preserve">  "final_amount": 750.00,</w:t>
+      </w:r>
+      <w:r>
+        <w:rPr>
+          <w:rStyle w:val="VerbatimChar"/>
+          <w:rFonts w:ascii="menlo" w:eastAsia="menlo" w:hAnsi="menlo" w:cs="menlo"/>
+        </w:rPr>
         <w:br/>
         <w:t xml:space="preserve">  "bill_status": "PAID",</w:t>
+      </w:r>
+      <w:r>
+        <w:rPr>
+          <w:rStyle w:val="VerbatimChar"/>
+          <w:rFonts w:ascii="menlo" w:eastAsia="menlo" w:hAnsi="menlo" w:cs="menlo"/>
+        </w:rPr>
         <w:br/>
         <w:t xml:space="preserve">  "payment_status": "SUCCESS",</w:t>
+      </w:r>
+      <w:r>
+        <w:rPr>
+          <w:rStyle w:val="VerbatimChar"/>
+          <w:rFonts w:ascii="menlo" w:eastAsia="menlo" w:hAnsi="menlo" w:cs="menlo"/>
+        </w:rPr>
         <w:br/>
         <w:t xml:space="preserve">  "accession_number": "ACC-MDH-20260401-0001"</w:t>
+      </w:r>
+      <w:r>
+        <w:rPr>
+          <w:rStyle w:val="VerbatimChar"/>
+          <w:rFonts w:ascii="menlo" w:eastAsia="menlo" w:hAnsi="menlo" w:cs="menlo"/>
+        </w:rPr>
         <w:br/>
         <w:t>}</w:t>
+      </w:r>
+      <w:r>
+        <w:rPr>
+          <w:rStyle w:val="VerbatimChar"/>
+          <w:rFonts w:ascii="menlo" w:eastAsia="menlo" w:hAnsi="menlo" w:cs="menlo"/>
+        </w:rPr>
         <w:br/>
       </w:r>
     </w:p>
@@ -17970,44 +18529,98 @@
           <w:rFonts w:ascii="menlo" w:eastAsia="menlo" w:hAnsi="menlo" w:cs="menlo"/>
         </w:rPr>
         <w:t>{</w:t>
+      </w:r>
+      <w:r>
+        <w:rPr>
+          <w:rStyle w:val="VerbatimChar"/>
+          <w:rFonts w:ascii="menlo" w:eastAsia="menlo" w:hAnsi="menlo" w:cs="menlo"/>
+        </w:rPr>
         <w:br/>
         <w:t xml:space="preserve">  "approved_by": "user_path_01",</w:t>
+      </w:r>
+      <w:r>
+        <w:rPr>
+          <w:rStyle w:val="VerbatimChar"/>
+          <w:rFonts w:ascii="menlo" w:eastAsia="menlo" w:hAnsi="menlo" w:cs="menlo"/>
+        </w:rPr>
         <w:br/>
         <w:t xml:space="preserve">  "comments": "Normal CBC. No significant abnormality."</w:t>
+      </w:r>
+      <w:r>
+        <w:rPr>
+          <w:rStyle w:val="VerbatimChar"/>
+          <w:rFonts w:ascii="menlo" w:eastAsia="menlo" w:hAnsi="menlo" w:cs="menlo"/>
+        </w:rPr>
         <w:br/>
         <w:t>}</w:t>
-        <w:br/>
-      </w:r>
-    </w:p>
-    <w:p>
-      <w:pPr>
-        <w:spacing w:after="210"/>
-      </w:pPr>
-      <w:r>
-        <w:rPr>
-          <w:b/>
-        </w:rPr>
-        <w:t>Response (200 OK):</w:t>
-      </w:r>
-    </w:p>
-    <w:p>
-      <w:pPr>
-        <w:shd w:val="clear" w:color="auto" w:fill="F8F8FA"/>
-      </w:pPr>
+      </w:r>
       <w:r>
         <w:rPr>
           <w:rStyle w:val="VerbatimChar"/>
           <w:rFonts w:ascii="menlo" w:eastAsia="menlo" w:hAnsi="menlo" w:cs="menlo"/>
         </w:rPr>
+        <w:br/>
+      </w:r>
+    </w:p>
+    <w:p>
+      <w:pPr>
+        <w:spacing w:after="210"/>
+      </w:pPr>
+      <w:r>
+        <w:rPr>
+          <w:b/>
+        </w:rPr>
+        <w:t>Response (200 OK):</w:t>
+      </w:r>
+    </w:p>
+    <w:p>
+      <w:pPr>
+        <w:shd w:val="clear" w:color="auto" w:fill="F8F8FA"/>
+      </w:pPr>
+      <w:r>
+        <w:rPr>
+          <w:rStyle w:val="VerbatimChar"/>
+          <w:rFonts w:ascii="menlo" w:eastAsia="menlo" w:hAnsi="menlo" w:cs="menlo"/>
+        </w:rPr>
         <w:t>{</w:t>
+      </w:r>
+      <w:r>
+        <w:rPr>
+          <w:rStyle w:val="VerbatimChar"/>
+          <w:rFonts w:ascii="menlo" w:eastAsia="menlo" w:hAnsi="menlo" w:cs="menlo"/>
+        </w:rPr>
         <w:br/>
         <w:t xml:space="preserve">  "test_order_id": "to_56789",</w:t>
+      </w:r>
+      <w:r>
+        <w:rPr>
+          <w:rStyle w:val="VerbatimChar"/>
+          <w:rFonts w:ascii="menlo" w:eastAsia="menlo" w:hAnsi="menlo" w:cs="menlo"/>
+        </w:rPr>
         <w:br/>
         <w:t xml:space="preserve">  "status": "APPROVED",</w:t>
+      </w:r>
+      <w:r>
+        <w:rPr>
+          <w:rStyle w:val="VerbatimChar"/>
+          <w:rFonts w:ascii="menlo" w:eastAsia="menlo" w:hAnsi="menlo" w:cs="menlo"/>
+        </w:rPr>
         <w:br/>
         <w:t xml:space="preserve">  "approved_at": "2026-04-01T18:32:00+05:30"</w:t>
+      </w:r>
+      <w:r>
+        <w:rPr>
+          <w:rStyle w:val="VerbatimChar"/>
+          <w:rFonts w:ascii="menlo" w:eastAsia="menlo" w:hAnsi="menlo" w:cs="menlo"/>
+        </w:rPr>
         <w:br/>
         <w:t>}</w:t>
+      </w:r>
+      <w:r>
+        <w:rPr>
+          <w:rStyle w:val="VerbatimChar"/>
+          <w:rFonts w:ascii="menlo" w:eastAsia="menlo" w:hAnsi="menlo" w:cs="menlo"/>
+        </w:rPr>
         <w:br/>
       </w:r>
     </w:p>
@@ -18059,22 +18672,76 @@
           <w:rFonts w:ascii="menlo" w:eastAsia="menlo" w:hAnsi="menlo" w:cs="menlo"/>
         </w:rPr>
         <w:t>{</w:t>
+      </w:r>
+      <w:r>
+        <w:rPr>
+          <w:rStyle w:val="VerbatimChar"/>
+          <w:rFonts w:ascii="menlo" w:eastAsia="menlo" w:hAnsi="menlo" w:cs="menlo"/>
+        </w:rPr>
         <w:br/>
         <w:t xml:space="preserve">  "error_code": "BILL_INVALID_STATE",</w:t>
+      </w:r>
+      <w:r>
+        <w:rPr>
+          <w:rStyle w:val="VerbatimChar"/>
+          <w:rFonts w:ascii="menlo" w:eastAsia="menlo" w:hAnsi="menlo" w:cs="menlo"/>
+        </w:rPr>
         <w:br/>
         <w:t xml:space="preserve">  "message": "Bill cannot be edited after payment is confirmed.",</w:t>
+      </w:r>
+      <w:r>
+        <w:rPr>
+          <w:rStyle w:val="VerbatimChar"/>
+          <w:rFonts w:ascii="menlo" w:eastAsia="menlo" w:hAnsi="menlo" w:cs="menlo"/>
+        </w:rPr>
         <w:br/>
         <w:t xml:space="preserve">  "details": {</w:t>
+      </w:r>
+      <w:r>
+        <w:rPr>
+          <w:rStyle w:val="VerbatimChar"/>
+          <w:rFonts w:ascii="menlo" w:eastAsia="menlo" w:hAnsi="menlo" w:cs="menlo"/>
+        </w:rPr>
         <w:br/>
         <w:t xml:space="preserve">    "bill_id": "bill_1001",</w:t>
+      </w:r>
+      <w:r>
+        <w:rPr>
+          <w:rStyle w:val="VerbatimChar"/>
+          <w:rFonts w:ascii="menlo" w:eastAsia="menlo" w:hAnsi="menlo" w:cs="menlo"/>
+        </w:rPr>
         <w:br/>
         <w:t xml:space="preserve">    "current_status": "PAID"</w:t>
+      </w:r>
+      <w:r>
+        <w:rPr>
+          <w:rStyle w:val="VerbatimChar"/>
+          <w:rFonts w:ascii="menlo" w:eastAsia="menlo" w:hAnsi="menlo" w:cs="menlo"/>
+        </w:rPr>
         <w:br/>
         <w:t xml:space="preserve">  },</w:t>
+      </w:r>
+      <w:r>
+        <w:rPr>
+          <w:rStyle w:val="VerbatimChar"/>
+          <w:rFonts w:ascii="menlo" w:eastAsia="menlo" w:hAnsi="menlo" w:cs="menlo"/>
+        </w:rPr>
         <w:br/>
         <w:t xml:space="preserve">  "correlation_id": "1f3d8c24-..."</w:t>
+      </w:r>
+      <w:r>
+        <w:rPr>
+          <w:rStyle w:val="VerbatimChar"/>
+          <w:rFonts w:ascii="menlo" w:eastAsia="menlo" w:hAnsi="menlo" w:cs="menlo"/>
+        </w:rPr>
         <w:br/>
         <w:t>}</w:t>
+      </w:r>
+      <w:r>
+        <w:rPr>
+          <w:rStyle w:val="VerbatimChar"/>
+          <w:rFonts w:ascii="menlo" w:eastAsia="menlo" w:hAnsi="menlo" w:cs="menlo"/>
+        </w:rPr>
         <w:br/>
       </w:r>
     </w:p>
@@ -18535,7 +19202,25 @@
           <w:sz w:val="33"/>
           <w:szCs w:val="33"/>
         </w:rPr>
-        <w:t>11.3 Concurrent Edits – Same Bill</w:t>
+        <w:t xml:space="preserve">11.3 Concurrent Edits </w:t>
+      </w:r>
+      <w:r>
+        <w:rPr>
+          <w:b/>
+          <w:bCs/>
+          <w:sz w:val="33"/>
+          <w:szCs w:val="33"/>
+        </w:rPr>
+        <w:t>–</w:t>
+      </w:r>
+      <w:r>
+        <w:rPr>
+          <w:b/>
+          <w:bCs/>
+          <w:sz w:val="33"/>
+          <w:szCs w:val="33"/>
+        </w:rPr>
+        <w:t xml:space="preserve"> Same Bill</w:t>
       </w:r>
     </w:p>
     <w:p>
@@ -18559,7 +19244,19 @@
         <w:t>Application-level edit-session lock:</w:t>
       </w:r>
       <w:r>
-        <w:t xml:space="preserve"> For high-conflict screens (bill edit), add: locked_by_user_id, lock_acquired_at, lock_expires_at (TTL ~ 5 minutes, renewable). UI behavior: first editor gets the lock; other users see a read-only view with “currently edited by …”.</w:t>
+        <w:t xml:space="preserve"> For high-conflict screens (bill edit), add: locked_by_user_id, lock_acquired_at, lock_expires_at (TTL ~ 5 minutes, renewable). UI behavior: first editor gets the lock; other users see a read-only view with </w:t>
+      </w:r>
+      <w:r>
+        <w:t>“</w:t>
+      </w:r>
+      <w:r>
+        <w:t xml:space="preserve">currently edited by </w:t>
+      </w:r>
+      <w:r>
+        <w:t>…”</w:t>
+      </w:r>
+      <w:r>
+        <w:t>.</w:t>
       </w:r>
     </w:p>
     <w:p>
@@ -20487,17 +21184,59 @@
         <w:rPr>
           <w:sz w:val="22"/>
         </w:rPr>
-        <w:t>Medrelief is an AI-first diagnostic lab system. Not a traditional LIMS with AI features added. The receptionist scans a prescription; AI reads it. The receptionist speaks; AI fills the form. The lab tech dictates results; AI enters them. Reports auto-generate. WhatsApp delivers them. Every manual entry point is replaced by AI assistance. The UI is kiosk-style (touch-first, mobile-first, vending-machine simplicity). A Siri/Alexa-style AI voice assistant helps every role — receptionist, lab tech, pathologist, center head — complete their tasks by speaking naturally instead of typing. The prototype (v0.6.0) demonstrates this product. The production build implements the same product from scratch with multi-center support, authorization controls, and the additional features documented below.</w:t>
-      </w:r>
-    </w:p>
-    <w:p>
-      <w:r>
-        <w:t>Added: April 2026. Sections 15–20 below extend the original PRD (sections 1–14) with production additions, new features, and the authorization model. The original sections are unchanged.</w:t>
-      </w:r>
-    </w:p>
-    <w:p>
-      <w:r>
-        <w:t>The core innovation: AI replaces manual data entry at every stage — prescription OCR at registration, conversational voice assistant for form filling, auto-flagging in the lab, AI-generated reports. The receptionist never types patient details; they scan and confirm.</w:t>
+        <w:t xml:space="preserve">Medrelief is an AI-first diagnostic lab system. Not a traditional LIMS with AI features added. The receptionist scans a prescription; AI reads it. The receptionist speaks; AI fills the form. The lab tech dictates results; AI enters them. Reports auto-generate. WhatsApp delivers them. Every manual entry point is replaced by AI assistance. The UI is kiosk-style (touch-first, mobile-first, vending-machine simplicity). A Siri/Alexa-style AI voice assistant helps every role </w:t>
+      </w:r>
+      <w:r>
+        <w:rPr>
+          <w:sz w:val="22"/>
+        </w:rPr>
+        <w:t>—</w:t>
+      </w:r>
+      <w:r>
+        <w:rPr>
+          <w:sz w:val="22"/>
+        </w:rPr>
+        <w:t xml:space="preserve"> receptionist, lab tech, pathologist, center head </w:t>
+      </w:r>
+      <w:r>
+        <w:rPr>
+          <w:sz w:val="22"/>
+        </w:rPr>
+        <w:t>—</w:t>
+      </w:r>
+      <w:r>
+        <w:rPr>
+          <w:sz w:val="22"/>
+        </w:rPr>
+        <w:t xml:space="preserve"> complete their tasks by speaking naturally instead of typing. The prototype (v0.6.0) demonstrates this product. The production build implements the same product from scratch with multi-center support, authorization controls, and the additional features documented below.</w:t>
+      </w:r>
+    </w:p>
+    <w:p>
+      <w:r>
+        <w:t>Added: April 2026. Sections 15</w:t>
+      </w:r>
+      <w:r>
+        <w:t>–</w:t>
+      </w:r>
+      <w:r>
+        <w:t>20 below extend the original PRD (sections 1</w:t>
+      </w:r>
+      <w:r>
+        <w:t>–</w:t>
+      </w:r>
+      <w:r>
+        <w:t>14) with production additions, new features, and the authorization model. The original sections are unchanged.</w:t>
+      </w:r>
+    </w:p>
+    <w:p>
+      <w:r>
+        <w:t xml:space="preserve">The core innovation: AI replaces manual data entry at every stage </w:t>
+      </w:r>
+      <w:r>
+        <w:t>—</w:t>
+      </w:r>
+      <w:r>
+        <w:t xml:space="preserve"> prescription OCR at registration, conversational voice assistant for form filling, auto-flagging in the lab, AI-generated reports. The receptionist never types patient details; they scan and confirm.</w:t>
       </w:r>
     </w:p>
     <w:p>
@@ -20525,7 +21264,67 @@
     </w:p>
     <w:p>
       <w:r>
-        <w:t>Medrelief is not a traditional LIMS. It is an AI-first lab management system where the core flow is: scan prescription → AI extracts details → confirm → pay → auto-accession → lab processes → AI-assisted result entry → sign-off → auto-generated report → WhatsApp delivery. The v0.6.0 prototype below IS the product — the production system implements the same experience from scratch in a new codebase with production-grade infrastructure.</w:t>
+        <w:t xml:space="preserve">Medrelief is not a traditional LIMS. It is an AI-first lab management system where the core flow is: scan prescription </w:t>
+      </w:r>
+      <w:r>
+        <w:t>→</w:t>
+      </w:r>
+      <w:r>
+        <w:t xml:space="preserve"> AI extracts details </w:t>
+      </w:r>
+      <w:r>
+        <w:t>→</w:t>
+      </w:r>
+      <w:r>
+        <w:t xml:space="preserve"> confirm </w:t>
+      </w:r>
+      <w:r>
+        <w:t>→</w:t>
+      </w:r>
+      <w:r>
+        <w:t xml:space="preserve"> pay </w:t>
+      </w:r>
+      <w:r>
+        <w:t>→</w:t>
+      </w:r>
+      <w:r>
+        <w:t xml:space="preserve"> auto-accession </w:t>
+      </w:r>
+      <w:r>
+        <w:t>→</w:t>
+      </w:r>
+      <w:r>
+        <w:t xml:space="preserve"> lab processes </w:t>
+      </w:r>
+      <w:r>
+        <w:t>→</w:t>
+      </w:r>
+      <w:r>
+        <w:t xml:space="preserve"> AI-assisted result entry </w:t>
+      </w:r>
+      <w:r>
+        <w:t>→</w:t>
+      </w:r>
+      <w:r>
+        <w:t xml:space="preserve"> sign-off </w:t>
+      </w:r>
+      <w:r>
+        <w:t>→</w:t>
+      </w:r>
+      <w:r>
+        <w:t xml:space="preserve"> auto-generated report </w:t>
+      </w:r>
+      <w:r>
+        <w:t>→</w:t>
+      </w:r>
+      <w:r>
+        <w:t xml:space="preserve"> WhatsApp delivery. The v0.6.0 prototype below IS the product </w:t>
+      </w:r>
+      <w:r>
+        <w:t>—</w:t>
+      </w:r>
+      <w:r>
+        <w:t xml:space="preserve"> the production system implements the same experience from scratch in a new codebase with production-grade infrastructure.</w:t>
       </w:r>
     </w:p>
     <w:p>
@@ -20560,7 +21359,13 @@
         </w:numPr>
       </w:pPr>
       <w:r>
-        <w:t>Frontend: React 19 + Vite + Tailwind 4 PWA on GitHub Pages (mobile-first kiosk, 390×844 viewport).</w:t>
+        <w:t>Frontend: React 19 + Vite + Tailwind 4 PWA on GitHub Pages (mobile-first kiosk, 390</w:t>
+      </w:r>
+      <w:r>
+        <w:t>×</w:t>
+      </w:r>
+      <w:r>
+        <w:t>844 viewport).</w:t>
       </w:r>
     </w:p>
     <w:p>
@@ -20571,7 +21376,13 @@
         </w:numPr>
       </w:pPr>
       <w:r>
-        <w:t>AI: Claude Vision for prescription OCR (₹0.08/scan) + Claude Haiku business assistant.</w:t>
+        <w:t>AI: Claude Vision for prescription OCR (</w:t>
+      </w:r>
+      <w:r>
+        <w:t>₹</w:t>
+      </w:r>
+      <w:r>
+        <w:t>0.08/scan) + Claude Haiku business assistant.</w:t>
       </w:r>
     </w:p>
     <w:p>
@@ -20634,7 +21445,43 @@
         </w:numPr>
       </w:pPr>
       <w:r>
-        <w:t>Registration → prescription OCR → patient verify → test selection → rate plan pricing → payment (Razorpay) → accession auto-creation.</w:t>
+        <w:t xml:space="preserve">Registration </w:t>
+      </w:r>
+      <w:r>
+        <w:t>→</w:t>
+      </w:r>
+      <w:r>
+        <w:t xml:space="preserve"> prescription OCR </w:t>
+      </w:r>
+      <w:r>
+        <w:t>→</w:t>
+      </w:r>
+      <w:r>
+        <w:t xml:space="preserve"> patient verify </w:t>
+      </w:r>
+      <w:r>
+        <w:t>→</w:t>
+      </w:r>
+      <w:r>
+        <w:t xml:space="preserve"> test selection </w:t>
+      </w:r>
+      <w:r>
+        <w:t>→</w:t>
+      </w:r>
+      <w:r>
+        <w:t xml:space="preserve"> rate plan pricing </w:t>
+      </w:r>
+      <w:r>
+        <w:t>→</w:t>
+      </w:r>
+      <w:r>
+        <w:t xml:space="preserve"> payment (Razorpay) </w:t>
+      </w:r>
+      <w:r>
+        <w:t>→</w:t>
+      </w:r>
+      <w:r>
+        <w:t xml:space="preserve"> accession auto-creation.</w:t>
       </w:r>
     </w:p>
     <w:p>
@@ -20645,7 +21492,37 @@
         </w:numPr>
       </w:pPr>
       <w:r>
-        <w:t>Lab worklist → sample collection → receive → start processing → result entry (with voice input) → auto-flagging (NORMAL/HIGH/LOW/CRITICAL).</w:t>
+        <w:t xml:space="preserve">Lab worklist </w:t>
+      </w:r>
+      <w:r>
+        <w:t>→</w:t>
+      </w:r>
+      <w:r>
+        <w:t xml:space="preserve"> sample collection </w:t>
+      </w:r>
+      <w:r>
+        <w:t>→</w:t>
+      </w:r>
+      <w:r>
+        <w:t xml:space="preserve"> receive </w:t>
+      </w:r>
+      <w:r>
+        <w:t>→</w:t>
+      </w:r>
+      <w:r>
+        <w:t xml:space="preserve"> start processing </w:t>
+      </w:r>
+      <w:r>
+        <w:t>→</w:t>
+      </w:r>
+      <w:r>
+        <w:t xml:space="preserve"> result entry (with voice input) </w:t>
+      </w:r>
+      <w:r>
+        <w:t>→</w:t>
+      </w:r>
+      <w:r>
+        <w:t xml:space="preserve"> auto-flagging (NORMAL/HIGH/LOW/CRITICAL).</w:t>
       </w:r>
     </w:p>
     <w:p>
@@ -20656,7 +21533,19 @@
         </w:numPr>
       </w:pPr>
       <w:r>
-        <w:t>Pathologist sign-off → report auto-generation → delivery (WhatsApp + Email stubs).</w:t>
+        <w:t xml:space="preserve">Pathologist sign-off </w:t>
+      </w:r>
+      <w:r>
+        <w:t>→</w:t>
+      </w:r>
+      <w:r>
+        <w:t xml:space="preserve"> report auto-generation </w:t>
+      </w:r>
+      <w:r>
+        <w:t>→</w:t>
+      </w:r>
+      <w:r>
+        <w:t xml:space="preserve"> delivery (WhatsApp + Email stubs).</w:t>
       </w:r>
     </w:p>
     <w:p>
@@ -21581,7 +22470,13 @@
     </w:p>
     <w:p>
       <w:r>
-        <w:t>The production system builds the same product from scratch in a new codebase. The prototype defines WHAT to build; the production architecture defines HOW. Same AI-first UX, same scan-to-report flow, same mobile-first kiosk — but with these production-grade additions:</w:t>
+        <w:t xml:space="preserve">The production system builds the same product from scratch in a new codebase. The prototype defines WHAT to build; the production architecture defines HOW. Same AI-first UX, same scan-to-report flow, same mobile-first kiosk </w:t>
+      </w:r>
+      <w:r>
+        <w:t>—</w:t>
+      </w:r>
+      <w:r>
+        <w:t xml:space="preserve"> but with these production-grade additions:</w:t>
       </w:r>
     </w:p>
     <w:p>
@@ -21592,7 +22487,31 @@
         </w:numPr>
       </w:pPr>
       <w:r>
-        <w:t>Multi-center org hierarchy (Tenant → Region → Center → Sub-center) vs prototype’s single-branch model.</w:t>
+        <w:t xml:space="preserve">Multi-center org hierarchy (Tenant </w:t>
+      </w:r>
+      <w:r>
+        <w:t>→</w:t>
+      </w:r>
+      <w:r>
+        <w:t xml:space="preserve"> Region </w:t>
+      </w:r>
+      <w:r>
+        <w:t>→</w:t>
+      </w:r>
+      <w:r>
+        <w:t xml:space="preserve"> Center </w:t>
+      </w:r>
+      <w:r>
+        <w:t>→</w:t>
+      </w:r>
+      <w:r>
+        <w:t xml:space="preserve"> Sub-center) vs prototype</w:t>
+      </w:r>
+      <w:r>
+        <w:t>’</w:t>
+      </w:r>
+      <w:r>
+        <w:t>s single-branch model.</w:t>
       </w:r>
     </w:p>
     <w:p>
@@ -21603,7 +22522,13 @@
         </w:numPr>
       </w:pPr>
       <w:r>
-        <w:t>Full authorization model (4-tier RBAC + approval chains) vs prototype’s flat demo credentials.</w:t>
+        <w:t>Full authorization model (4-tier RBAC + approval chains) vs prototype</w:t>
+      </w:r>
+      <w:r>
+        <w:t>’</w:t>
+      </w:r>
+      <w:r>
+        <w:t>s flat demo credentials.</w:t>
       </w:r>
     </w:p>
     <w:p>
@@ -21615,7 +22540,13 @@
       </w:pPr>
       <w:r>
         <w:lastRenderedPageBreak/>
-        <w:t>Transaction-level tracking with main status + sub-status vs prototype’s simpler bill/sample/test states.</w:t>
+        <w:t>Transaction-level tracking with main status + sub-status vs prototype</w:t>
+      </w:r>
+      <w:r>
+        <w:t>’</w:t>
+      </w:r>
+      <w:r>
+        <w:t>s simpler bill/sample/test states.</w:t>
       </w:r>
     </w:p>
     <w:p>
@@ -21626,7 +22557,13 @@
         </w:numPr>
       </w:pPr>
       <w:r>
-        <w:t>Real WhatsApp Business API integration vs prototype’s stub delivery logs.</w:t>
+        <w:t>Real WhatsApp Business API integration vs prototype</w:t>
+      </w:r>
+      <w:r>
+        <w:t>’</w:t>
+      </w:r>
+      <w:r>
+        <w:t>s stub delivery logs.</w:t>
       </w:r>
     </w:p>
     <w:p>
@@ -21637,7 +22574,13 @@
         </w:numPr>
       </w:pPr>
       <w:r>
-        <w:t>Conversational AI voice assistant vs prototype’s per-field voice input buttons.</w:t>
+        <w:t>Conversational AI voice assistant vs prototype</w:t>
+      </w:r>
+      <w:r>
+        <w:t>’</w:t>
+      </w:r>
+      <w:r>
+        <w:t>s per-field voice input buttons.</w:t>
       </w:r>
     </w:p>
     <w:p>
@@ -21648,7 +22591,13 @@
         </w:numPr>
       </w:pPr>
       <w:r>
-        <w:t>In-app report viewer with action bar vs prototype’s direct PDF download.</w:t>
+        <w:t>In-app report viewer with action bar vs prototype</w:t>
+      </w:r>
+      <w:r>
+        <w:t>’</w:t>
+      </w:r>
+      <w:r>
+        <w:t>s direct PDF download.</w:t>
       </w:r>
     </w:p>
     <w:p>
@@ -21689,7 +22638,13 @@
     </w:p>
     <w:p>
       <w:r>
-        <w:t>Even when an agreed bill amount exists, allow an authorized role to apply a discount — but only before report delivery. After delivery, discounts are locked at the API and UI layer.</w:t>
+        <w:t xml:space="preserve">Even when an agreed bill amount exists, allow an authorized role to apply a discount </w:t>
+      </w:r>
+      <w:r>
+        <w:t>—</w:t>
+      </w:r>
+      <w:r>
+        <w:t xml:space="preserve"> but only before report delivery. After delivery, discounts are locked at the API and UI layer.</w:t>
       </w:r>
     </w:p>
     <w:p>
@@ -21743,7 +22698,13 @@
     </w:p>
     <w:p>
       <w:r>
-        <w:t>Support a discount-at-pickup path for hardship scenarios (example: ₹450 still pending at report collection). Routed via the same approval workflow as any other override. The system must distinguish this from a standard discount.</w:t>
+        <w:t xml:space="preserve">Support a discount-at-pickup path for hardship scenarios (example: </w:t>
+      </w:r>
+      <w:r>
+        <w:t>₹</w:t>
+      </w:r>
+      <w:r>
+        <w:t>450 still pending at report collection). Routed via the same approval workflow as any other override. The system must distinguish this from a standard discount.</w:t>
       </w:r>
     </w:p>
     <w:p>
@@ -21769,7 +22730,13 @@
     </w:p>
     <w:p>
       <w:r>
-        <w:t>Gate all permission checks, workflow locks, and automations on this rule — not on payment completion alone. This is the single source of truth for when a bill transitions from amendable to locked.</w:t>
+        <w:t xml:space="preserve">Gate all permission checks, workflow locks, and automations on this rule </w:t>
+      </w:r>
+      <w:r>
+        <w:t>—</w:t>
+      </w:r>
+      <w:r>
+        <w:t xml:space="preserve"> not on payment completion alone. This is the single source of truth for when a bill transitions from amendable to locked.</w:t>
       </w:r>
     </w:p>
     <w:p>
@@ -21805,7 +22772,13 @@
     </w:p>
     <w:p>
       <w:r>
-        <w:t>Assign a document_id (or transaction_id) per invoice. Treat each invoice as one transaction — the canonical unit for end-to-end tracking, audits, and reporting.</w:t>
+        <w:t xml:space="preserve">Assign a document_id (or transaction_id) per invoice. Treat each invoice as one transaction </w:t>
+      </w:r>
+      <w:r>
+        <w:t>—</w:t>
+      </w:r>
+      <w:r>
+        <w:t xml:space="preserve"> the canonical unit for end-to-end tracking, audits, and reporting.</w:t>
       </w:r>
     </w:p>
     <w:p>
@@ -21964,7 +22937,19 @@
     </w:p>
     <w:p>
       <w:r>
-        <w:t>Every captured document (prescription, bill, report) exposes its complete status flow — payment state, sample state, report state, delivery state — in one consolidated timeline per transaction.</w:t>
+        <w:t xml:space="preserve">Every captured document (prescription, bill, report) exposes its complete status flow </w:t>
+      </w:r>
+      <w:r>
+        <w:t>—</w:t>
+      </w:r>
+      <w:r>
+        <w:t xml:space="preserve"> payment state, sample state, report state, delivery state </w:t>
+      </w:r>
+      <w:r>
+        <w:t>—</w:t>
+      </w:r>
+      <w:r>
+        <w:t xml:space="preserve"> in one consolidated timeline per transaction.</w:t>
       </w:r>
     </w:p>
     <w:p>
@@ -22096,7 +23081,13 @@
     </w:p>
     <w:p>
       <w:r>
-        <w:t>WhatsApp is a delivery channel for patient-facing communication only — not internal staff comms.</w:t>
+        <w:t xml:space="preserve">WhatsApp is a delivery channel for patient-facing communication only </w:t>
+      </w:r>
+      <w:r>
+        <w:t>—</w:t>
+      </w:r>
+      <w:r>
+        <w:t xml:space="preserve"> not internal staff comms.</w:t>
       </w:r>
     </w:p>
     <w:p>
@@ -22152,7 +23143,13 @@
     </w:p>
     <w:p>
       <w:r>
-        <w:t>When a receptionist clicks Report, the default action opens a system-rendered report view — not a PDF download. From that view:</w:t>
+        <w:t xml:space="preserve">When a receptionist clicks Report, the default action opens a system-rendered report view </w:t>
+      </w:r>
+      <w:r>
+        <w:t>—</w:t>
+      </w:r>
+      <w:r>
+        <w:t xml:space="preserve"> not a PDF download. From that view:</w:t>
       </w:r>
     </w:p>
     <w:p>
@@ -22236,7 +23233,16 @@
     </w:p>
     <w:p>
       <w:r>
-        <w:t>Example: “Patient name is Ramesh Kumar, age 42, male, mobile 9876543210, referred by Dr. Mithlesh, CBC and lipid profile.”</w:t>
+        <w:t xml:space="preserve">Example: </w:t>
+      </w:r>
+      <w:r>
+        <w:t>“</w:t>
+      </w:r>
+      <w:r>
+        <w:t>Patient name is Ramesh Kumar, age 42, male, mobile 9876543210, referred by Dr. Mithlesh, CBC and lipid profile.</w:t>
+      </w:r>
+      <w:r>
+        <w:t>”</w:t>
       </w:r>
     </w:p>
     <w:p>
@@ -22253,7 +23259,13 @@
         <w:t xml:space="preserve">Receptionist: </w:t>
       </w:r>
       <w:r>
-        <w:t>“Patient Ramesh Kumar, male, 42, mobile 9876543210, Dr. Mithlesh referred, CBC and lipid profile.”</w:t>
+        <w:t>“</w:t>
+      </w:r>
+      <w:r>
+        <w:t>Patient Ramesh Kumar, male, 42, mobile 9876543210, Dr. Mithlesh referred, CBC and lipid profile.</w:t>
+      </w:r>
+      <w:r>
+        <w:t>”</w:t>
       </w:r>
     </w:p>
     <w:p>
@@ -22270,7 +23282,13 @@
         <w:t xml:space="preserve">Lab tech: </w:t>
       </w:r>
       <w:r>
-        <w:t>“Pooja Jha CBC result 13.5, hemoglobin normal.”</w:t>
+        <w:t>“</w:t>
+      </w:r>
+      <w:r>
+        <w:t>Pooja Jha CBC result 13.5, hemoglobin normal.</w:t>
+      </w:r>
+      <w:r>
+        <w:t>”</w:t>
       </w:r>
     </w:p>
     <w:p>
@@ -22287,7 +23305,13 @@
         <w:t xml:space="preserve">Pathologist: </w:t>
       </w:r>
       <w:r>
-        <w:t>“Approve Pooja Jha CBC, comment looks normal.”</w:t>
+        <w:t>“</w:t>
+      </w:r>
+      <w:r>
+        <w:t>Approve Pooja Jha CBC, comment looks normal.</w:t>
+      </w:r>
+      <w:r>
+        <w:t>”</w:t>
       </w:r>
     </w:p>
     <w:p>
@@ -22304,7 +23328,19 @@
         <w:t xml:space="preserve">Center head: </w:t>
       </w:r>
       <w:r>
-        <w:t>“Show me today’s revenue and pending cases.”</w:t>
+        <w:t>“</w:t>
+      </w:r>
+      <w:r>
+        <w:t>Show me today</w:t>
+      </w:r>
+      <w:r>
+        <w:t>’</w:t>
+      </w:r>
+      <w:r>
+        <w:t>s revenue and pending cases.</w:t>
+      </w:r>
+      <w:r>
+        <w:t>”</w:t>
       </w:r>
     </w:p>
     <w:p>
@@ -22315,7 +23351,25 @@
         </w:numPr>
       </w:pPr>
       <w:r>
-        <w:t>Speech-to-text → LLM extracts structured fields → populates form → user confirms.</w:t>
+        <w:t xml:space="preserve">Speech-to-text </w:t>
+      </w:r>
+      <w:r>
+        <w:t>→</w:t>
+      </w:r>
+      <w:r>
+        <w:t xml:space="preserve"> LLM extracts structured fields </w:t>
+      </w:r>
+      <w:r>
+        <w:t>→</w:t>
+      </w:r>
+      <w:r>
+        <w:t xml:space="preserve"> populates form </w:t>
+      </w:r>
+      <w:r>
+        <w:t>→</w:t>
+      </w:r>
+      <w:r>
+        <w:t xml:space="preserve"> user confirms.</w:t>
       </w:r>
     </w:p>
     <w:p>
@@ -22371,7 +23425,13 @@
     </w:p>
     <w:p>
       <w:r>
-        <w:t>Source: TimeFlow app (ntapp01-d432c.web.app) authorization flow analysis. Patterns cloned and extended for Medrelief’s multi-center diagnostic lab domain.</w:t>
+        <w:t>Source: TimeFlow app (ntapp01-d432c.web.app) authorization flow analysis. Patterns cloned and extended for Medrelief</w:t>
+      </w:r>
+      <w:r>
+        <w:t>’</w:t>
+      </w:r>
+      <w:r>
+        <w:t>s multi-center diagnostic lab domain.</w:t>
       </w:r>
     </w:p>
     <w:p>
@@ -22392,7 +23452,19 @@
         <w:rPr>
           <w:b/>
         </w:rPr>
-        <w:t>L0 — Super Admin (Org-wide)</w:t>
+        <w:t xml:space="preserve">L0 </w:t>
+      </w:r>
+      <w:r>
+        <w:rPr>
+          <w:b/>
+        </w:rPr>
+        <w:t>—</w:t>
+      </w:r>
+      <w:r>
+        <w:rPr>
+          <w:b/>
+        </w:rPr>
+        <w:t xml:space="preserve"> Super Admin (Org-wide)</w:t>
       </w:r>
     </w:p>
     <w:p>
@@ -22405,7 +23477,19 @@
         <w:rPr>
           <w:b/>
         </w:rPr>
-        <w:t>L1 — Center Head (Assigned center(s))</w:t>
+        <w:t xml:space="preserve">L1 </w:t>
+      </w:r>
+      <w:r>
+        <w:rPr>
+          <w:b/>
+        </w:rPr>
+        <w:t>—</w:t>
+      </w:r>
+      <w:r>
+        <w:rPr>
+          <w:b/>
+        </w:rPr>
+        <w:t xml:space="preserve"> Center Head (Assigned center(s))</w:t>
       </w:r>
     </w:p>
     <w:p>
@@ -22418,20 +23502,50 @@
         <w:rPr>
           <w:b/>
         </w:rPr>
-        <w:t>L2 — Department Lead (Department within center)</w:t>
-      </w:r>
-    </w:p>
-    <w:p>
-      <w:r>
-        <w:t>Senior lab tech or senior receptionist. Review capability, shift oversight, escalation receiver. Optional tier — skip if center is small.</w:t>
-      </w:r>
-    </w:p>
-    <w:p>
-      <w:r>
-        <w:rPr>
-          <w:b/>
-        </w:rPr>
-        <w:t>L3 — Staff (Role-specific within center)</w:t>
+        <w:t xml:space="preserve">L2 </w:t>
+      </w:r>
+      <w:r>
+        <w:rPr>
+          <w:b/>
+        </w:rPr>
+        <w:t>—</w:t>
+      </w:r>
+      <w:r>
+        <w:rPr>
+          <w:b/>
+        </w:rPr>
+        <w:t xml:space="preserve"> Department Lead (Department within center)</w:t>
+      </w:r>
+    </w:p>
+    <w:p>
+      <w:r>
+        <w:t xml:space="preserve">Senior lab tech or senior receptionist. Review capability, shift oversight, escalation receiver. Optional tier </w:t>
+      </w:r>
+      <w:r>
+        <w:t>—</w:t>
+      </w:r>
+      <w:r>
+        <w:t xml:space="preserve"> skip if center is small.</w:t>
+      </w:r>
+    </w:p>
+    <w:p>
+      <w:r>
+        <w:rPr>
+          <w:b/>
+        </w:rPr>
+        <w:t xml:space="preserve">L3 </w:t>
+      </w:r>
+      <w:r>
+        <w:rPr>
+          <w:b/>
+        </w:rPr>
+        <w:t>—</w:t>
+      </w:r>
+      <w:r>
+        <w:rPr>
+          <w:b/>
+        </w:rPr>
+        <w:t xml:space="preserve"> Staff (Role-specific within center)</w:t>
       </w:r>
     </w:p>
     <w:p>
@@ -22471,7 +23585,13 @@
         </w:numPr>
       </w:pPr>
       <w:r>
-        <w:t>Session-scoped switch — no re-login required.</w:t>
+        <w:t xml:space="preserve">Session-scoped switch </w:t>
+      </w:r>
+      <w:r>
+        <w:t>—</w:t>
+      </w:r>
+      <w:r>
+        <w:t xml:space="preserve"> no re-login required.</w:t>
       </w:r>
     </w:p>
     <w:p>
@@ -23687,28 +24807,58 @@
     </w:p>
     <w:p>
       <w:r>
-        <w:t xml:space="preserve">  └ Region: Bihar (optional grouping layer for reporting)</w:t>
+        <w:t xml:space="preserve">  </w:t>
+      </w:r>
+      <w:r>
+        <w:t>└</w:t>
+      </w:r>
+      <w:r>
+        <w:t xml:space="preserve"> Region: Bihar (optional grouping layer for reporting)</w:t>
       </w:r>
     </w:p>
     <w:p>
       <w:r>
         <w:lastRenderedPageBreak/>
-        <w:t xml:space="preserve">    └ Center: Bihar Sharif Main Lab</w:t>
-      </w:r>
-    </w:p>
-    <w:p>
-      <w:r>
-        <w:t xml:space="preserve">      └ Sub-center: Bihar Sharif Collection Point A, B</w:t>
-      </w:r>
-    </w:p>
-    <w:p>
-      <w:r>
-        <w:t xml:space="preserve">    └ Center: Madhubani Main Lab</w:t>
-      </w:r>
-    </w:p>
-    <w:p>
-      <w:r>
-        <w:t xml:space="preserve">      └ Sub-center: Madhubani Collection Point 1, 2</w:t>
+        <w:t xml:space="preserve">    </w:t>
+      </w:r>
+      <w:r>
+        <w:t>└</w:t>
+      </w:r>
+      <w:r>
+        <w:t xml:space="preserve"> Center: Bihar Sharif Main Lab</w:t>
+      </w:r>
+    </w:p>
+    <w:p>
+      <w:r>
+        <w:t xml:space="preserve">      </w:t>
+      </w:r>
+      <w:r>
+        <w:t>└</w:t>
+      </w:r>
+      <w:r>
+        <w:t xml:space="preserve"> Sub-center: Bihar Sharif Collection Point A, B</w:t>
+      </w:r>
+    </w:p>
+    <w:p>
+      <w:r>
+        <w:t xml:space="preserve">    </w:t>
+      </w:r>
+      <w:r>
+        <w:t>└</w:t>
+      </w:r>
+      <w:r>
+        <w:t xml:space="preserve"> Center: Madhubani Main Lab</w:t>
+      </w:r>
+    </w:p>
+    <w:p>
+      <w:r>
+        <w:t xml:space="preserve">      </w:t>
+      </w:r>
+      <w:r>
+        <w:t>└</w:t>
+      </w:r>
+      <w:r>
+        <w:t xml:space="preserve"> Sub-center: Madhubani Collection Point 1, 2</w:t>
       </w:r>
     </w:p>
     <w:p>
@@ -23814,7 +24964,13 @@
         </w:numPr>
       </w:pPr>
       <w:r>
-        <w:t>Request lifecycle: PENDING → APPROVED | REJECTED | EXPIRED.</w:t>
+        <w:t xml:space="preserve">Request lifecycle: PENDING </w:t>
+      </w:r>
+      <w:r>
+        <w:t>→</w:t>
+      </w:r>
+      <w:r>
+        <w:t xml:space="preserve"> APPROVED | REJECTED | EXPIRED.</w:t>
       </w:r>
     </w:p>
     <w:p>
@@ -23843,7 +24999,13 @@
     </w:p>
     <w:p>
       <w:r>
-        <w:t>Notifications triggered by domain events and routed by recipient’s role + center assignment:</w:t>
+        <w:t>Notifications triggered by domain events and routed by recipient</w:t>
+      </w:r>
+      <w:r>
+        <w:t>’</w:t>
+      </w:r>
+      <w:r>
+        <w:t>s role + center assignment:</w:t>
       </w:r>
     </w:p>
     <w:p>
@@ -23854,7 +25016,19 @@
         </w:numPr>
       </w:pPr>
       <w:r>
-        <w:t>Report ready for collection → Receptionist (same center) — in-app, normal priority.</w:t>
+        <w:t xml:space="preserve">Report ready for collection </w:t>
+      </w:r>
+      <w:r>
+        <w:t>→</w:t>
+      </w:r>
+      <w:r>
+        <w:t xml:space="preserve"> Receptionist (same center) </w:t>
+      </w:r>
+      <w:r>
+        <w:t>—</w:t>
+      </w:r>
+      <w:r>
+        <w:t xml:space="preserve"> in-app, normal priority.</w:t>
       </w:r>
     </w:p>
     <w:p>
@@ -23865,7 +25039,19 @@
         </w:numPr>
       </w:pPr>
       <w:r>
-        <w:t>New sample pending → Lab Tech (same center, same dept) — in-app, normal.</w:t>
+        <w:t xml:space="preserve">New sample pending </w:t>
+      </w:r>
+      <w:r>
+        <w:t>→</w:t>
+      </w:r>
+      <w:r>
+        <w:t xml:space="preserve"> Lab Tech (same center, same dept) </w:t>
+      </w:r>
+      <w:r>
+        <w:t>—</w:t>
+      </w:r>
+      <w:r>
+        <w:t xml:space="preserve"> in-app, normal.</w:t>
       </w:r>
     </w:p>
     <w:p>
@@ -23876,7 +25062,19 @@
         </w:numPr>
       </w:pPr>
       <w:r>
-        <w:t>Result awaiting sign-off → Pathologist (same center) — in-app + push, high.</w:t>
+        <w:t xml:space="preserve">Result awaiting sign-off </w:t>
+      </w:r>
+      <w:r>
+        <w:t>→</w:t>
+      </w:r>
+      <w:r>
+        <w:t xml:space="preserve"> Pathologist (same center) </w:t>
+      </w:r>
+      <w:r>
+        <w:t>—</w:t>
+      </w:r>
+      <w:r>
+        <w:t xml:space="preserve"> in-app + push, high.</w:t>
       </w:r>
     </w:p>
     <w:p>
@@ -23887,7 +25085,19 @@
         </w:numPr>
       </w:pPr>
       <w:r>
-        <w:t>Discount override requested → Center Head (same center) — in-app + WhatsApp, high.</w:t>
+        <w:t xml:space="preserve">Discount override requested </w:t>
+      </w:r>
+      <w:r>
+        <w:t>→</w:t>
+      </w:r>
+      <w:r>
+        <w:t xml:space="preserve"> Center Head (same center) </w:t>
+      </w:r>
+      <w:r>
+        <w:t>—</w:t>
+      </w:r>
+      <w:r>
+        <w:t xml:space="preserve"> in-app + WhatsApp, high.</w:t>
       </w:r>
     </w:p>
     <w:p>
@@ -23898,7 +25108,19 @@
         </w:numPr>
       </w:pPr>
       <w:r>
-        <w:t>Critical result flag → Pathologist + Center Head — in-app + WhatsApp + push, urgent.</w:t>
+        <w:t xml:space="preserve">Critical result flag </w:t>
+      </w:r>
+      <w:r>
+        <w:t>→</w:t>
+      </w:r>
+      <w:r>
+        <w:t xml:space="preserve"> Pathologist + Center Head </w:t>
+      </w:r>
+      <w:r>
+        <w:t>—</w:t>
+      </w:r>
+      <w:r>
+        <w:t xml:space="preserve"> in-app + WhatsApp + push, urgent.</w:t>
       </w:r>
     </w:p>
     <w:p>
@@ -23909,7 +25131,19 @@
         </w:numPr>
       </w:pPr>
       <w:r>
-        <w:t>Daily close pending (past 8 PM) → Center Head + Finance — in-app + WhatsApp, high.</w:t>
+        <w:t xml:space="preserve">Daily close pending (past 8 PM) </w:t>
+      </w:r>
+      <w:r>
+        <w:t>→</w:t>
+      </w:r>
+      <w:r>
+        <w:t xml:space="preserve"> Center Head + Finance </w:t>
+      </w:r>
+      <w:r>
+        <w:t>—</w:t>
+      </w:r>
+      <w:r>
+        <w:t xml:space="preserve"> in-app + WhatsApp, high.</w:t>
       </w:r>
     </w:p>
     <w:p>
@@ -23920,7 +25154,19 @@
         </w:numPr>
       </w:pPr>
       <w:r>
-        <w:t>Payment reconciliation mismatch → Finance (same center) — in-app, high.</w:t>
+        <w:t xml:space="preserve">Payment reconciliation mismatch </w:t>
+      </w:r>
+      <w:r>
+        <w:t>→</w:t>
+      </w:r>
+      <w:r>
+        <w:t xml:space="preserve"> Finance (same center) </w:t>
+      </w:r>
+      <w:r>
+        <w:t>—</w:t>
+      </w:r>
+      <w:r>
+        <w:t xml:space="preserve"> in-app, high.</w:t>
       </w:r>
     </w:p>
     <w:p>
@@ -23950,7 +25196,13 @@
       </w:pPr>
       <w:r>
         <w:lastRenderedPageBreak/>
-        <w:t>org_tenants, org_regions, org_centers — org hierarchy with center_type (MAIN_LAB | COLLECTION_POINT) and parent_center_id.</w:t>
+        <w:t xml:space="preserve">org_tenants, org_regions, org_centers </w:t>
+      </w:r>
+      <w:r>
+        <w:t>—</w:t>
+      </w:r>
+      <w:r>
+        <w:t xml:space="preserve"> org hierarchy with center_type (MAIN_LAB | COLLECTION_POINT) and parent_center_id.</w:t>
       </w:r>
     </w:p>
     <w:p>
@@ -23961,7 +25213,19 @@
         </w:numPr>
       </w:pPr>
       <w:r>
-        <w:t>auth_roles — tenant-scoped, level (0–3), permissions JSONB, is_system flag.</w:t>
+        <w:t xml:space="preserve">auth_roles </w:t>
+      </w:r>
+      <w:r>
+        <w:t>—</w:t>
+      </w:r>
+      <w:r>
+        <w:t xml:space="preserve"> tenant-scoped, level (0</w:t>
+      </w:r>
+      <w:r>
+        <w:t>–</w:t>
+      </w:r>
+      <w:r>
+        <w:t>3), permissions JSONB, is_system flag.</w:t>
       </w:r>
     </w:p>
     <w:p>
@@ -23972,7 +25236,25 @@
         </w:numPr>
       </w:pPr>
       <w:r>
-        <w:t>auth_user_assignments — many-to-many-to-many: user ↔ role ↔ center. is_primary for default login role.</w:t>
+        <w:t xml:space="preserve">auth_user_assignments </w:t>
+      </w:r>
+      <w:r>
+        <w:t>—</w:t>
+      </w:r>
+      <w:r>
+        <w:t xml:space="preserve"> many-to-many-to-many: user </w:t>
+      </w:r>
+      <w:r>
+        <w:t>↔</w:t>
+      </w:r>
+      <w:r>
+        <w:t xml:space="preserve"> role </w:t>
+      </w:r>
+      <w:r>
+        <w:t>↔</w:t>
+      </w:r>
+      <w:r>
+        <w:t xml:space="preserve"> center. is_primary for default login role.</w:t>
       </w:r>
     </w:p>
     <w:p>
@@ -23983,7 +25265,13 @@
         </w:numPr>
       </w:pPr>
       <w:r>
-        <w:t>approval_chains, approval_requests, approval_decisions — configurable multi-step approval.</w:t>
+        <w:t xml:space="preserve">approval_chains, approval_requests, approval_decisions </w:t>
+      </w:r>
+      <w:r>
+        <w:t>—</w:t>
+      </w:r>
+      <w:r>
+        <w:t xml:space="preserve"> configurable multi-step approval.</w:t>
       </w:r>
     </w:p>
     <w:p>
@@ -23994,7 +25282,13 @@
         </w:numPr>
       </w:pPr>
       <w:r>
-        <w:t>notifications — role-scoped, multi-channel (IN_APP, WHATSAPP, EMAIL, PUSH), priority levels, read/dismiss.</w:t>
+        <w:t xml:space="preserve">notifications </w:t>
+      </w:r>
+      <w:r>
+        <w:t>—</w:t>
+      </w:r>
+      <w:r>
+        <w:t xml:space="preserve"> role-scoped, multi-channel (IN_APP, WHATSAPP, EMAIL, PUSH), priority levels, read/dismiss.</w:t>
       </w:r>
     </w:p>
     <w:p>
@@ -24047,7 +25341,13 @@
         </w:numPr>
       </w:pPr>
       <w:r>
-        <w:t>Who initiates override discount at report collection? Who approves? (receptionist → center head likely).</w:t>
+        <w:t xml:space="preserve">Who initiates override discount at report collection? Who approves? (receptionist </w:t>
+      </w:r>
+      <w:r>
+        <w:t>→</w:t>
+      </w:r>
+      <w:r>
+        <w:t xml:space="preserve"> center head likely).</w:t>
       </w:r>
     </w:p>
     <w:p>
@@ -24170,7 +25470,25 @@
         </w:numPr>
       </w:pPr>
       <w:r>
-        <w:t>Draft override-discount-at-pickup workflow: trigger → approval → apply → audit.</w:t>
+        <w:t xml:space="preserve">Draft override-discount-at-pickup workflow: trigger </w:t>
+      </w:r>
+      <w:r>
+        <w:t>→</w:t>
+      </w:r>
+      <w:r>
+        <w:t xml:space="preserve"> approval </w:t>
+      </w:r>
+      <w:r>
+        <w:t>→</w:t>
+      </w:r>
+      <w:r>
+        <w:t xml:space="preserve"> apply </w:t>
+      </w:r>
+      <w:r>
+        <w:t>→</w:t>
+      </w:r>
+      <w:r>
+        <w:t xml:space="preserve"> audit.</w:t>
       </w:r>
     </w:p>
     <w:p>
@@ -24214,7 +25532,19 @@
         </w:numPr>
       </w:pPr>
       <w:r>
-        <w:t>Build notification system (domain events → routing rules → multi-channel delivery).</w:t>
+        <w:t xml:space="preserve">Build notification system (domain events </w:t>
+      </w:r>
+      <w:r>
+        <w:t>→</w:t>
+      </w:r>
+      <w:r>
+        <w:t xml:space="preserve"> routing rules </w:t>
+      </w:r>
+      <w:r>
+        <w:t>→</w:t>
+      </w:r>
+      <w:r>
+        <w:t xml:space="preserve"> multi-channel delivery).</w:t>
       </w:r>
     </w:p>
     <w:p>
@@ -24271,7 +25601,19 @@
         </w:numPr>
       </w:pPr>
       <w:r>
-        <w:t>v2.1 (original) — Sections 1–14. Phase 1 LIMS, Billing, Basic Finance PRD.</w:t>
+        <w:t xml:space="preserve">v2.1 (original) </w:t>
+      </w:r>
+      <w:r>
+        <w:t>—</w:t>
+      </w:r>
+      <w:r>
+        <w:t xml:space="preserve"> Sections 1</w:t>
+      </w:r>
+      <w:r>
+        <w:t>–</w:t>
+      </w:r>
+      <w:r>
+        <w:t>14. Phase 1 LIMS, Billing, Basic Finance PRD.</w:t>
       </w:r>
     </w:p>
     <w:p>
@@ -24282,7 +25624,19 @@
         </w:numPr>
       </w:pPr>
       <w:r>
-        <w:t>v3.0 (this version) — Sections 15–20 added. Prototype learnings, production additions, authorization model, new features.</w:t>
+        <w:t xml:space="preserve">v3.0 (this version) </w:t>
+      </w:r>
+      <w:r>
+        <w:t>—</w:t>
+      </w:r>
+      <w:r>
+        <w:t xml:space="preserve"> Sections 15</w:t>
+      </w:r>
+      <w:r>
+        <w:t>–</w:t>
+      </w:r>
+      <w:r>
+        <w:t>20 added. Prototype learnings, production additions, authorization model, new features.</w:t>
       </w:r>
     </w:p>
     <w:p>
@@ -24661,10 +26015,22 @@
           <w:ilvl w:val="0"/>
           <w:numId w:val="41"/>
         </w:numPr>
+        <w:rPr>
+          <w:color w:val="EE0000"/>
+        </w:rPr>
       </w:pPr>
       <w:r>
         <w:t>Before implementation: confirm with stakeholder that mdm_branches is retired and center_id is the canonical foreign key.</w:t>
       </w:r>
+      <w:r>
+        <w:t xml:space="preserve"> - </w:t>
+      </w:r>
+      <w:r>
+        <w:rPr>
+          <w:color w:val="EE0000"/>
+        </w:rPr>
+        <w:t>OK</w:t>
+      </w:r>
     </w:p>
     <w:p>
       <w:pPr>
@@ -24716,8 +26082,18 @@
         </w:numPr>
       </w:pPr>
       <w:r>
+        <w:lastRenderedPageBreak/>
         <w:t>Section 18.1 notification channels simplified to: in-app push only for internal staff. WhatsApp removed from internal comms. SMS and email defer to later phase.</w:t>
       </w:r>
+      <w:r>
+        <w:t xml:space="preserve"> </w:t>
+      </w:r>
+      <w:r>
+        <w:t>–</w:t>
+      </w:r>
+      <w:r>
+        <w:t xml:space="preserve"> RESET PASSWORD for only customers whatsapp otp, ok reseah this more</w:t>
+      </w:r>
     </w:p>
     <w:p>
       <w:pPr>
@@ -24728,8 +26104,249 @@
           <w:b/>
           <w:sz w:val="28"/>
         </w:rPr>
+        <w:t>GAP-03: AI Failure and Fallback Modes</w:t>
+      </w:r>
+    </w:p>
+    <w:p>
+      <w:pPr>
+        <w:shd w:val="clear" w:color="auto" w:fill="FFF4E5"/>
+      </w:pPr>
+      <w:r>
+        <w:t>AI is the core differentiator, but no failure spec exists. Medical domain needs explicit fallback paths.</w:t>
+      </w:r>
+    </w:p>
+    <w:p>
+      <w:pPr>
+        <w:numPr>
+          <w:ilvl w:val="0"/>
+          <w:numId w:val="41"/>
+        </w:numPr>
+      </w:pPr>
+      <w:r>
+        <w:t>Required per AI-assisted screen: manual entry always reachable in one tap, even when AI is working.</w:t>
+      </w:r>
+    </w:p>
+    <w:p>
+      <w:pPr>
+        <w:numPr>
+          <w:ilvl w:val="0"/>
+          <w:numId w:val="41"/>
+        </w:numPr>
+      </w:pPr>
+      <w:r>
+        <w:t>OCR confidence below threshold (default 0.7): force manual review with pre-filled low-confidence fields highlighted.</w:t>
+      </w:r>
+    </w:p>
+    <w:p>
+      <w:pPr>
+        <w:numPr>
+          <w:ilvl w:val="0"/>
+          <w:numId w:val="41"/>
+        </w:numPr>
+      </w:pPr>
+      <w:r>
+        <w:t>Voice assistant: always show transcript before submit. User confirms before form is populated.</w:t>
+      </w:r>
+    </w:p>
+    <w:p>
+      <w:pPr>
+        <w:numPr>
+          <w:ilvl w:val="0"/>
+          <w:numId w:val="41"/>
+        </w:numPr>
+      </w:pPr>
+      <w:r>
+        <w:t>AI service down (Anthropic outage): degrade to pure manual entry with a banner. Bill creation must not block on AI.</w:t>
+      </w:r>
+    </w:p>
+    <w:p>
+      <w:pPr>
+        <w:numPr>
+          <w:ilvl w:val="0"/>
+          <w:numId w:val="41"/>
+        </w:numPr>
+      </w:pPr>
+      <w:r>
+        <w:t>Log every AI response with confidence scores in an ai_interactions table for audit and quality review.</w:t>
+      </w:r>
+      <w:r>
+        <w:t xml:space="preserve"> </w:t>
+      </w:r>
+      <w:r>
+        <w:t>–</w:t>
+      </w:r>
+      <w:r>
+        <w:t xml:space="preserve"> fallback is manual - OK</w:t>
+      </w:r>
+    </w:p>
+    <w:p>
+      <w:pPr>
+        <w:spacing w:before="180" w:line="271" w:lineRule="auto"/>
+      </w:pPr>
+      <w:r>
+        <w:rPr>
+          <w:b/>
+          <w:sz w:val="28"/>
+        </w:rPr>
+        <w:t>GAP-04: DPDP Act 2023 Compliance Plan</w:t>
+      </w:r>
+    </w:p>
+    <w:p>
+      <w:pPr>
+        <w:shd w:val="clear" w:color="auto" w:fill="FFF4E5"/>
+      </w:pPr>
+      <w:r>
+        <w:t>Patient medical data is sensitive personal data under India's DPDP Act. Current architecture sends data to Anthropic (US-based) and stores in Neon PostgreSQL (region unspecified).</w:t>
+      </w:r>
+    </w:p>
+    <w:p>
+      <w:pPr>
+        <w:numPr>
+          <w:ilvl w:val="0"/>
+          <w:numId w:val="41"/>
+        </w:numPr>
+      </w:pPr>
+      <w:r>
+        <w:t>Confirm Neon database region. Recommend ap-south-1 (Mumbai) or in-west (Hyderabad if available).</w:t>
+      </w:r>
+    </w:p>
+    <w:p>
+      <w:pPr>
+        <w:numPr>
+          <w:ilvl w:val="0"/>
+          <w:numId w:val="41"/>
+        </w:numPr>
+      </w:pPr>
+      <w:r>
+        <w:t>Capture explicit patient consent for AI processing at registration (checkbox + date + signature/OTP).</w:t>
+      </w:r>
+    </w:p>
+    <w:p>
+      <w:pPr>
+        <w:numPr>
+          <w:ilvl w:val="0"/>
+          <w:numId w:val="41"/>
+        </w:numPr>
+      </w:pPr>
+      <w:r>
+        <w:t>Document data processor agreement with Anthropic if they are the AI provider.</w:t>
+      </w:r>
+    </w:p>
+    <w:p>
+      <w:pPr>
+        <w:numPr>
+          <w:ilvl w:val="0"/>
+          <w:numId w:val="41"/>
+        </w:numPr>
+      </w:pPr>
+      <w:r>
+        <w:t>Implement right to erasure API (delete patient + cascade to visits, bills, reports). Retain audit records per regulatory minimum.</w:t>
+      </w:r>
+    </w:p>
+    <w:p>
+      <w:pPr>
+        <w:numPr>
+          <w:ilvl w:val="0"/>
+          <w:numId w:val="41"/>
+        </w:numPr>
+      </w:pPr>
+      <w:r>
+        <w:t>Document data retention policy: reports 2 years minimum, patient records 7 years for medical records per ICMR guidelines.</w:t>
+      </w:r>
+      <w:r>
+        <w:t xml:space="preserve"> </w:t>
+      </w:r>
+      <w:r>
+        <w:t>–</w:t>
+      </w:r>
+      <w:r>
+        <w:t xml:space="preserve"> FLEXIBLITY OF MODEL SHOULD BE ANY API which is compliant</w:t>
+      </w:r>
+    </w:p>
+    <w:p>
+      <w:pPr>
+        <w:spacing w:before="180" w:line="271" w:lineRule="auto"/>
+      </w:pPr>
+      <w:r>
+        <w:rPr>
+          <w:b/>
+          <w:sz w:val="28"/>
+        </w:rPr>
+        <w:t>GAP-05: AI Cost Projection and Budget</w:t>
+      </w:r>
+    </w:p>
+    <w:p>
+      <w:pPr>
+        <w:shd w:val="clear" w:color="auto" w:fill="FFF4E5"/>
+      </w:pPr>
+      <w:r>
+        <w:t>Prototype costs ~Rs 0.08 per OCR scan. At 60 visits/day across 2 centers plus voice STT and AI assistant usage, monthly cost is non-trivial. No budget defined in PRD.</w:t>
+      </w:r>
+    </w:p>
+    <w:p>
+      <w:pPr>
+        <w:numPr>
+          <w:ilvl w:val="0"/>
+          <w:numId w:val="41"/>
+        </w:numPr>
+      </w:pPr>
+      <w:r>
+        <w:t>Estimate: 60 visits/day x 2 centers x 30 days x Rs 0.08 = Rs 288/month on prescription OCR alone.</w:t>
+      </w:r>
+    </w:p>
+    <w:p>
+      <w:pPr>
+        <w:numPr>
+          <w:ilvl w:val="0"/>
+          <w:numId w:val="41"/>
+        </w:numPr>
+      </w:pPr>
+      <w:r>
+        <w:t>Plus: AI assistant chat (unknown volume), voice STT (Rs 0.50-2 per minute depending on provider), report generation LLM calls.</w:t>
+      </w:r>
+    </w:p>
+    <w:p>
+      <w:pPr>
+        <w:numPr>
+          <w:ilvl w:val="0"/>
+          <w:numId w:val="41"/>
+        </w:numPr>
+      </w:pPr>
+      <w:r>
+        <w:t>Add: ai_cost_log table tracking each call's provider, tokens, cost. Daily report to System Admin.</w:t>
+      </w:r>
+    </w:p>
+    <w:p>
+      <w:pPr>
+        <w:numPr>
+          <w:ilvl w:val="0"/>
+          <w:numId w:val="41"/>
+        </w:numPr>
+      </w:pPr>
+      <w:r>
+        <w:t>Set per-tenant monthly AI budget (config). Soft-fail at 80% (warn), hard-fail at 100% (require approval to exceed).</w:t>
+      </w:r>
+      <w:r>
+        <w:t xml:space="preserve"> </w:t>
+      </w:r>
+      <w:r>
+        <w:t>–</w:t>
+      </w:r>
+      <w:r>
+        <w:t xml:space="preserve"> gatekeepers like android voice, Bixby, Siri</w:t>
+      </w:r>
+    </w:p>
+    <w:p>
+      <w:pPr>
+        <w:spacing w:before="180" w:line="271" w:lineRule="auto"/>
+      </w:pPr>
+      <w:r>
+        <w:rPr>
+          <w:b/>
+          <w:sz w:val="28"/>
+        </w:rPr>
         <w:lastRenderedPageBreak/>
-        <w:t>GAP-03: AI Failure and Fallback Modes</w:t>
+        <w:t>GAP-06: Notification Preferences Per User</w:t>
       </w:r>
     </w:p>
     <w:p>
@@ -24737,7 +26354,7 @@
         <w:shd w:val="clear" w:color="auto" w:fill="FFF4E5"/>
       </w:pPr>
       <w:r>
-        <w:t>AI is the core differentiator, but no failure spec exists. Medical domain needs explicit fallback paths.</w:t>
+        <w:t>Section 19.5 specifies routing but no per-user opt-out or channel preference. Notification fatigue will occur without preferences.</w:t>
       </w:r>
     </w:p>
     <w:p>
@@ -24748,7 +26365,7 @@
         </w:numPr>
       </w:pPr>
       <w:r>
-        <w:t>Required per AI-assisted screen: manual entry always reachable in one tap, even when AI is working.</w:t>
+        <w:t>Add user_notification_preferences table: user_id, event_type, channel, enabled, quiet_hours_start, quiet_hours_end.</w:t>
       </w:r>
     </w:p>
     <w:p>
@@ -24759,7 +26376,7 @@
         </w:numPr>
       </w:pPr>
       <w:r>
-        <w:t>OCR confidence below threshold (default 0.7): force manual review with pre-filled low-confidence fields highlighted.</w:t>
+        <w:t>Defaults come from role-based templates (Receptionist: all in-app, critical WhatsApp).</w:t>
       </w:r>
     </w:p>
     <w:p>
@@ -24770,7 +26387,30 @@
         </w:numPr>
       </w:pPr>
       <w:r>
-        <w:t>Voice assistant: always show transcript before submit. User confirms before form is populated.</w:t>
+        <w:t>User can opt out of non-critical channels (in-app cannot be disabled for urgent or critical priority).</w:t>
+      </w:r>
+      <w:r>
+        <w:t xml:space="preserve"> - OK</w:t>
+      </w:r>
+    </w:p>
+    <w:p>
+      <w:pPr>
+        <w:spacing w:before="180" w:line="271" w:lineRule="auto"/>
+      </w:pPr>
+      <w:r>
+        <w:rPr>
+          <w:b/>
+          <w:sz w:val="28"/>
+        </w:rPr>
+        <w:t>GAP-08: SLA Definitions Missing</w:t>
+      </w:r>
+    </w:p>
+    <w:p>
+      <w:pPr>
+        <w:shd w:val="clear" w:color="auto" w:fill="FFF4E5"/>
+      </w:pPr>
+      <w:r>
+        <w:t>PRD sets performance targets (2 min registration, 60 sec sign-off) but no system SLA or escalation rules for pending approvals.</w:t>
       </w:r>
     </w:p>
     <w:p>
@@ -24781,7 +26421,7 @@
         </w:numPr>
       </w:pPr>
       <w:r>
-        <w:t>AI service down (Anthropic outage): degrade to pure manual entry with a banner. Bill creation must not block on AI.</w:t>
+        <w:t>Discount approval SLA: 15 minutes initial, auto-escalate to Super Admin if pending &gt; 30 minutes.</w:t>
       </w:r>
     </w:p>
     <w:p>
@@ -24792,27 +26432,7 @@
         </w:numPr>
       </w:pPr>
       <w:r>
-        <w:t>Log every AI response with confidence scores in an ai_interactions table for audit and quality review.</w:t>
-      </w:r>
-    </w:p>
-    <w:p>
-      <w:pPr>
-        <w:spacing w:before="180" w:line="271" w:lineRule="auto"/>
-      </w:pPr>
-      <w:r>
-        <w:rPr>
-          <w:b/>
-          <w:sz w:val="28"/>
-        </w:rPr>
-        <w:t>GAP-04: DPDP Act 2023 Compliance Plan</w:t>
-      </w:r>
-    </w:p>
-    <w:p>
-      <w:pPr>
-        <w:shd w:val="clear" w:color="auto" w:fill="FFF4E5"/>
-      </w:pPr>
-      <w:r>
-        <w:t>Patient medical data is sensitive personal data under India's DPDP Act. Current architecture sends data to Anthropic (US-based) and stores in Neon PostgreSQL (region unspecified).</w:t>
+        <w:t>Report delivery SLA: 10 minutes after sign-off for WhatsApp (patient). If failed, auto-retry with exponential backoff, escalate via in-app push to Center Head after 3 failed attempts.</w:t>
       </w:r>
     </w:p>
     <w:p>
@@ -24823,222 +26443,16 @@
         </w:numPr>
       </w:pPr>
       <w:r>
-        <w:t>Confirm Neon database region. Recommend ap-south-1 (Mumbai) or in-west (Hyderabad if available).</w:t>
-      </w:r>
-    </w:p>
-    <w:p>
-      <w:pPr>
-        <w:numPr>
-          <w:ilvl w:val="0"/>
-          <w:numId w:val="41"/>
-        </w:numPr>
-      </w:pPr>
-      <w:r>
-        <w:t>Capture explicit patient consent for AI processing at registration (checkbox + date + signature/OTP).</w:t>
-      </w:r>
-    </w:p>
-    <w:p>
-      <w:pPr>
-        <w:numPr>
-          <w:ilvl w:val="0"/>
-          <w:numId w:val="41"/>
-        </w:numPr>
-      </w:pPr>
-      <w:r>
-        <w:t>Document data processor agreement with Anthropic if they are the AI provider.</w:t>
-      </w:r>
-    </w:p>
-    <w:p>
-      <w:pPr>
-        <w:numPr>
-          <w:ilvl w:val="0"/>
-          <w:numId w:val="41"/>
-        </w:numPr>
-      </w:pPr>
-      <w:r>
-        <w:t>Implement right to erasure API (delete patient + cascade to visits, bills, reports). Retain audit records per regulatory minimum.</w:t>
-      </w:r>
-    </w:p>
-    <w:p>
-      <w:pPr>
-        <w:numPr>
-          <w:ilvl w:val="0"/>
-          <w:numId w:val="41"/>
-        </w:numPr>
-      </w:pPr>
-      <w:r>
-        <w:t>Document data retention policy: reports 2 years minimum, patient records 7 years for medical records per ICMR guidelines.</w:t>
-      </w:r>
-    </w:p>
-    <w:p>
-      <w:pPr>
-        <w:spacing w:before="180" w:line="271" w:lineRule="auto"/>
-      </w:pPr>
-      <w:r>
-        <w:rPr>
-          <w:b/>
-          <w:sz w:val="28"/>
-        </w:rPr>
-        <w:t>GAP-05: AI Cost Projection and Budget</w:t>
-      </w:r>
-    </w:p>
-    <w:p>
-      <w:pPr>
-        <w:shd w:val="clear" w:color="auto" w:fill="FFF4E5"/>
-      </w:pPr>
-      <w:r>
-        <w:t>Prototype costs ~Rs 0.08 per OCR scan. At 60 visits/day across 2 centers plus voice STT and AI assistant usage, monthly cost is non-trivial. No budget defined in PRD.</w:t>
-      </w:r>
-    </w:p>
-    <w:p>
-      <w:pPr>
-        <w:numPr>
-          <w:ilvl w:val="0"/>
-          <w:numId w:val="41"/>
-        </w:numPr>
-      </w:pPr>
-      <w:r>
-        <w:t>Estimate: 60 visits/day x 2 centers x 30 days x Rs 0.08 = Rs 288/month on prescription OCR alone.</w:t>
-      </w:r>
-    </w:p>
-    <w:p>
-      <w:pPr>
-        <w:numPr>
-          <w:ilvl w:val="0"/>
-          <w:numId w:val="41"/>
-        </w:numPr>
-      </w:pPr>
-      <w:r>
-        <w:t>Plus: AI assistant chat (unknown volume), voice STT (Rs 0.50-2 per minute depending on provider), report generation LLM calls.</w:t>
-      </w:r>
-    </w:p>
-    <w:p>
-      <w:pPr>
-        <w:numPr>
-          <w:ilvl w:val="0"/>
-          <w:numId w:val="41"/>
-        </w:numPr>
-      </w:pPr>
-      <w:r>
-        <w:t>Add: ai_cost_log table tracking each call's provider, tokens, cost. Daily report to System Admin.</w:t>
-      </w:r>
-    </w:p>
-    <w:p>
-      <w:pPr>
-        <w:numPr>
-          <w:ilvl w:val="0"/>
-          <w:numId w:val="41"/>
-        </w:numPr>
-      </w:pPr>
-      <w:r>
-        <w:t>Set per-tenant monthly AI budget (config). Soft-fail at 80% (warn), hard-fail at 100% (require approval to exceed).</w:t>
-      </w:r>
-    </w:p>
-    <w:p>
-      <w:pPr>
-        <w:spacing w:before="180" w:line="271" w:lineRule="auto"/>
-      </w:pPr>
-      <w:r>
-        <w:rPr>
-          <w:b/>
-          <w:sz w:val="28"/>
-        </w:rPr>
-        <w:t>GAP-06: Notification Preferences Per User</w:t>
-      </w:r>
-    </w:p>
-    <w:p>
-      <w:pPr>
-        <w:shd w:val="clear" w:color="auto" w:fill="FFF4E5"/>
-      </w:pPr>
-      <w:r>
-        <w:t>Section 19.5 specifies routing but no per-user opt-out or channel preference. Notification fatigue will occur without preferences.</w:t>
-      </w:r>
-    </w:p>
-    <w:p>
-      <w:pPr>
-        <w:numPr>
-          <w:ilvl w:val="0"/>
-          <w:numId w:val="41"/>
-        </w:numPr>
-      </w:pPr>
-      <w:r>
-        <w:lastRenderedPageBreak/>
-        <w:t>Add user_notification_preferences table: user_id, event_type, channel, enabled, quiet_hours_start, quiet_hours_end.</w:t>
-      </w:r>
-    </w:p>
-    <w:p>
-      <w:pPr>
-        <w:numPr>
-          <w:ilvl w:val="0"/>
-          <w:numId w:val="41"/>
-        </w:numPr>
-      </w:pPr>
-      <w:r>
-        <w:t>Defaults come from role-based templates (Receptionist: all in-app, critical WhatsApp).</w:t>
-      </w:r>
-    </w:p>
-    <w:p>
-      <w:pPr>
-        <w:numPr>
-          <w:ilvl w:val="0"/>
-          <w:numId w:val="41"/>
-        </w:numPr>
-      </w:pPr>
-      <w:r>
-        <w:t>User can opt out of non-critical channels (in-app cannot be disabled for urgent or critical priority).</w:t>
-      </w:r>
-    </w:p>
-    <w:p>
-      <w:pPr>
-        <w:spacing w:before="180" w:line="271" w:lineRule="auto"/>
-      </w:pPr>
-      <w:r>
-        <w:rPr>
-          <w:b/>
-          <w:sz w:val="28"/>
-        </w:rPr>
-        <w:t>GAP-08: SLA Definitions Missing</w:t>
-      </w:r>
-    </w:p>
-    <w:p>
-      <w:pPr>
-        <w:shd w:val="clear" w:color="auto" w:fill="FFF4E5"/>
-      </w:pPr>
-      <w:r>
-        <w:t>PRD sets performance targets (2 min registration, 60 sec sign-off) but no system SLA or escalation rules for pending approvals.</w:t>
-      </w:r>
-    </w:p>
-    <w:p>
-      <w:pPr>
-        <w:numPr>
-          <w:ilvl w:val="0"/>
-          <w:numId w:val="41"/>
-        </w:numPr>
-      </w:pPr>
-      <w:r>
-        <w:t>Discount approval SLA: 15 minutes initial, auto-escalate to Super Admin if pending &gt; 30 minutes.</w:t>
-      </w:r>
-    </w:p>
-    <w:p>
-      <w:pPr>
-        <w:numPr>
-          <w:ilvl w:val="0"/>
-          <w:numId w:val="41"/>
-        </w:numPr>
-      </w:pPr>
-      <w:r>
-        <w:t>Report delivery SLA: 10 minutes after sign-off for WhatsApp (patient). If failed, auto-retry with exponential backoff, escalate via in-app push to Center Head after 3 failed attempts.</w:t>
-      </w:r>
-    </w:p>
-    <w:p>
-      <w:pPr>
-        <w:numPr>
-          <w:ilvl w:val="0"/>
-          <w:numId w:val="41"/>
-        </w:numPr>
-      </w:pPr>
-      <w:r>
         <w:t>Critical result notification SLA: 5 minutes. If not acknowledged by Pathologist within 5 min, escalate via in-app push to Center Head.</w:t>
+      </w:r>
+      <w:r>
+        <w:t xml:space="preserve"> </w:t>
+      </w:r>
+      <w:r>
+        <w:t>–</w:t>
+      </w:r>
+      <w:r>
+        <w:t xml:space="preserve"> Any approvals pending there should be an SLA, WITHIN 5 MINS FOR DISCOUNTS , AND COMMISIONS FOR A DAY OR 2.</w:t>
       </w:r>
     </w:p>
     <w:p>
@@ -30632,20 +32046,20 @@
 </file>
 
 <file path=customXml/item2.xml><?xml version="1.0" encoding="utf-8"?>
-<p:properties xmlns:p="http://schemas.microsoft.com/office/2006/metadata/properties" xmlns:xsi="http://www.w3.org/2001/XMLSchema-instance" xmlns:pc="http://schemas.microsoft.com/office/infopath/2007/PartnerControls">
-  <documentManagement>
-    <_activity xmlns="5940787a-db08-47bd-9dae-aa8c034eec0d" xsi:nil="true"/>
-  </documentManagement>
-</p:properties>
-</file>
-
-<file path=customXml/item3.xml><?xml version="1.0" encoding="utf-8"?>
 <?mso-contentType ?>
 <FormTemplates xmlns="http://schemas.microsoft.com/sharepoint/v3/contenttype/forms">
   <Display>DocumentLibraryForm</Display>
   <Edit>DocumentLibraryForm</Edit>
   <New>DocumentLibraryForm</New>
 </FormTemplates>
+</file>
+
+<file path=customXml/item3.xml><?xml version="1.0" encoding="utf-8"?>
+<p:properties xmlns:p="http://schemas.microsoft.com/office/2006/metadata/properties" xmlns:xsi="http://www.w3.org/2001/XMLSchema-instance" xmlns:pc="http://schemas.microsoft.com/office/infopath/2007/PartnerControls">
+  <documentManagement>
+    <_activity xmlns="5940787a-db08-47bd-9dae-aa8c034eec0d" xsi:nil="true"/>
+  </documentManagement>
+</p:properties>
 </file>
 
 <file path=customXml/itemProps1.xml><?xml version="1.0" encoding="utf-8"?>
@@ -30668,6 +32082,14 @@
 </file>
 
 <file path=customXml/itemProps2.xml><?xml version="1.0" encoding="utf-8"?>
+<ds:datastoreItem xmlns:ds="http://schemas.openxmlformats.org/officeDocument/2006/customXml" ds:itemID="{2F94277C-E61F-4D44-99A6-CD552670CC74}">
+  <ds:schemaRefs>
+    <ds:schemaRef ds:uri="http://schemas.microsoft.com/sharepoint/v3/contenttype/forms"/>
+  </ds:schemaRefs>
+</ds:datastoreItem>
+</file>
+
+<file path=customXml/itemProps3.xml><?xml version="1.0" encoding="utf-8"?>
 <ds:datastoreItem xmlns:ds="http://schemas.openxmlformats.org/officeDocument/2006/customXml" ds:itemID="{3A1781F3-706B-460B-8B96-7063CA757B02}">
   <ds:schemaRefs>
     <ds:schemaRef ds:uri="http://schemas.microsoft.com/office/2006/metadata/properties"/>
@@ -30675,12 +32097,4 @@
     <ds:schemaRef ds:uri="5940787a-db08-47bd-9dae-aa8c034eec0d"/>
   </ds:schemaRefs>
 </ds:datastoreItem>
-</file>
-
-<file path=customXml/itemProps3.xml><?xml version="1.0" encoding="utf-8"?>
-<ds:datastoreItem xmlns:ds="http://schemas.openxmlformats.org/officeDocument/2006/customXml" ds:itemID="{2F94277C-E61F-4D44-99A6-CD552670CC74}">
-  <ds:schemaRefs>
-    <ds:schemaRef ds:uri="http://schemas.microsoft.com/sharepoint/v3/contenttype/forms"/>
-  </ds:schemaRefs>
-</ds:datastoreItem>
 </file>
</xml_diff>